<commit_message>
Improvements to wave spectrum modelling and plotting
> ctWaveData - remove spectrum data as an accepted data type
> ctWaveSpectrumData - class added to handle wave spectrum data
> wave_cco_spectra - added additional checks and methods to handle non-standard data (eg duplicated frequencies
> extract_synoptic_from_zip and clean_synoptic_file_names added to help subsample the spectrum data before loading in order to reduce file size
> ctWaveSpectrumPlots - tidying up and added button for meta data display to cf model v measured skill plot
> estimate_jonswap_gamma - extended to use just Hs, Tp and Tz for use with standard wave buoy data
> extract_wave_data - standard wave buoy data now returns Hs,Tp,Tz for estimation of gamma
>  wave_spectrum - tidy up documentation
> wave_spectrum_gamma - clarify help documentation
> waveModels - modify to handle new class of ctWaveSpectrumData
> update template to include delete variable menu option
</commit_message>
<xml_diff>
--- a/muiAppDocs/Section templates/Sec3.0_App_Menus.docx
+++ b/muiAppDocs/Section templates/Sec3.0_App_Menus.docx
@@ -25,12 +25,21 @@
       <w:r>
         <w:t xml:space="preserve">s, model setup, running and plotting of the results. In addition, Tabs are used to display set-up information of the Cases that have been run. In this manual text in </w:t>
       </w:r>
+      <w:proofErr w:type="gramStart"/>
       <w:r>
         <w:rPr>
           <w:i/>
           <w:color w:val="7B2520" w:themeColor="accent3" w:themeShade="BF"/>
         </w:rPr>
-        <w:t>Red italic</w:t>
+        <w:t>Red</w:t>
+      </w:r>
+      <w:proofErr w:type="gramEnd"/>
+      <w:r>
+        <w:rPr>
+          <w:i/>
+          <w:color w:val="7B2520" w:themeColor="accent3" w:themeShade="BF"/>
+        </w:rPr>
+        <w:t xml:space="preserve"> italic</w:t>
       </w:r>
       <w:r>
         <w:rPr>
@@ -475,6 +484,7 @@
       <w:r>
         <w:t xml:space="preserve">save the Case as a </w:t>
       </w:r>
+      <w:proofErr w:type="spellStart"/>
       <w:r>
         <w:rPr>
           <w:i/>
@@ -482,6 +492,7 @@
         </w:rPr>
         <w:t>dstable</w:t>
       </w:r>
+      <w:proofErr w:type="spellEnd"/>
       <w:r>
         <w:t xml:space="preserve"> or a </w:t>
       </w:r>
@@ -495,6 +506,7 @@
       <w:r>
         <w:t xml:space="preserve"> and name the file. The dataset </w:t>
       </w:r>
+      <w:proofErr w:type="spellStart"/>
       <w:r>
         <w:rPr>
           <w:i/>
@@ -502,6 +514,7 @@
         </w:rPr>
         <w:t>dstable</w:t>
       </w:r>
+      <w:proofErr w:type="spellEnd"/>
       <w:r>
         <w:t xml:space="preserve"> or </w:t>
       </w:r>
@@ -558,53 +571,98 @@
       </w:r>
     </w:p>
     <w:p>
-      <w:r>
-        <w:rPr>
+      <w:pPr>
+        <w:rPr>
+          <w:rFonts w:ascii="Times New Roman" w:eastAsia="Microsoft YaHei" w:hAnsi="Times New Roman" w:cs="Times New Roman"/>
+        </w:rPr>
+      </w:pPr>
+      <w:bookmarkStart w:id="10" w:name="_Hlk227000027"/>
+      <w:r>
+        <w:rPr>
+          <w:rFonts w:ascii="Times New Roman" w:eastAsia="Microsoft YaHei" w:hAnsi="Times New Roman" w:cs="Times New Roman"/>
           <w:i/>
           <w:color w:val="7B2520" w:themeColor="accent3" w:themeShade="BF"/>
         </w:rPr>
-        <w:t>Project&gt;Cases&gt;Reload</w:t>
-      </w:r>
-      <w:r>
-        <w:t>: select a previous model run and reload the input values as the current input settings.</w:t>
-      </w:r>
-    </w:p>
-    <w:p>
-      <w:r>
-        <w:rPr>
+        <w:t>Project&gt; Case &gt;</w:t>
+      </w:r>
+      <w:r>
+        <w:rPr>
+          <w:rFonts w:ascii="Times New Roman" w:eastAsia="Microsoft YaHei" w:hAnsi="Times New Roman" w:cs="Times New Roman"/>
           <w:i/>
           <w:color w:val="7B2520" w:themeColor="accent3" w:themeShade="BF"/>
         </w:rPr>
-        <w:t>Project&gt;Cases&gt;View settings</w:t>
-      </w:r>
-      <w:r>
-        <w:t>: display a table of the model input parameters used for a selected</w:t>
-      </w:r>
-      <w:r>
-        <w:t xml:space="preserve"> Case</w:t>
-      </w:r>
-      <w:r>
-        <w:t>.</w:t>
-      </w:r>
-    </w:p>
-    <w:p>
-      <w:r>
-        <w:rPr>
+        <w:t xml:space="preserve">Delete </w:t>
+      </w:r>
+      <w:r>
+        <w:rPr>
+          <w:rFonts w:ascii="Times New Roman" w:eastAsia="Microsoft YaHei" w:hAnsi="Times New Roman" w:cs="Times New Roman"/>
           <w:i/>
           <w:color w:val="7B2520" w:themeColor="accent3" w:themeShade="BF"/>
         </w:rPr>
-        <w:t>Project&gt; Import/Export&gt;Import</w:t>
-      </w:r>
-      <w:r>
-        <w:t xml:space="preserve">: load a Case class instance from a Matlab binary ‘mat’ file. Only works for data sets saved using Export. </w:t>
-      </w:r>
-    </w:p>
+        <w:t>Variable</w:t>
+      </w:r>
+      <w:r>
+        <w:rPr>
+          <w:rFonts w:ascii="Times New Roman" w:eastAsia="Microsoft YaHei" w:hAnsi="Times New Roman" w:cs="Times New Roman"/>
+        </w:rPr>
+        <w:t xml:space="preserve">: user selects a Case from a list of </w:t>
+      </w:r>
+      <w:r>
+        <w:rPr>
+          <w:rFonts w:ascii="Times New Roman" w:eastAsia="Microsoft YaHei" w:hAnsi="Times New Roman" w:cs="Times New Roman"/>
+        </w:rPr>
+        <w:t>Cases, and Datasets if more than one and then the variable to be deleted can be selected.</w:t>
+      </w:r>
+    </w:p>
+    <w:bookmarkEnd w:id="10"/>
     <w:p>
       <w:r>
         <w:rPr>
           <w:i/>
           <w:color w:val="7B2520" w:themeColor="accent3" w:themeShade="BF"/>
         </w:rPr>
+        <w:t>Project&gt;Cases&gt;Reload</w:t>
+      </w:r>
+      <w:r>
+        <w:t>: select a previous model run and reload the input values as the current input settings.</w:t>
+      </w:r>
+    </w:p>
+    <w:p>
+      <w:r>
+        <w:rPr>
+          <w:i/>
+          <w:color w:val="7B2520" w:themeColor="accent3" w:themeShade="BF"/>
+        </w:rPr>
+        <w:t>Project&gt;Cases&gt;View settings</w:t>
+      </w:r>
+      <w:r>
+        <w:t>: display a table of the model input parameters used for a selected</w:t>
+      </w:r>
+      <w:r>
+        <w:t xml:space="preserve"> Case</w:t>
+      </w:r>
+      <w:r>
+        <w:t>.</w:t>
+      </w:r>
+    </w:p>
+    <w:p>
+      <w:r>
+        <w:rPr>
+          <w:i/>
+          <w:color w:val="7B2520" w:themeColor="accent3" w:themeShade="BF"/>
+        </w:rPr>
+        <w:t>Project&gt; Import/Export&gt;Import</w:t>
+      </w:r>
+      <w:r>
+        <w:t xml:space="preserve">: load a Case class instance from a Matlab binary ‘mat’ file. Only works for data sets saved using Export. </w:t>
+      </w:r>
+    </w:p>
+    <w:p>
+      <w:r>
+        <w:rPr>
+          <w:i/>
+          <w:color w:val="7B2520" w:themeColor="accent3" w:themeShade="BF"/>
+        </w:rPr>
         <w:t>Project&gt;Import/Export&gt;Export</w:t>
       </w:r>
       <w:r>
@@ -635,7 +693,15 @@
         <w:t>Project&gt;Cases&gt;Edit Data Set</w:t>
       </w:r>
       <w:r>
-        <w:t xml:space="preserve"> option to make a selection and then use the ‘Copy to Clipboard’ button to paste the selection to the clipboard.</w:t>
+        <w:t xml:space="preserve"> option to </w:t>
+      </w:r>
+      <w:proofErr w:type="gramStart"/>
+      <w:r>
+        <w:t>make a selection</w:t>
+      </w:r>
+      <w:proofErr w:type="gramEnd"/>
+      <w:r>
+        <w:t xml:space="preserve"> and then use the ‘Copy to Clipboard’ button to paste the selection to the clipboard.</w:t>
       </w:r>
     </w:p>
     <w:p/>
@@ -643,15 +709,15 @@
       <w:pPr>
         <w:pStyle w:val="Heading2"/>
       </w:pPr>
-      <w:bookmarkStart w:id="10" w:name="_Ref459627191"/>
-      <w:bookmarkStart w:id="11" w:name="_Toc462590133"/>
-      <w:bookmarkStart w:id="12" w:name="_Toc58851117"/>
+      <w:bookmarkStart w:id="11" w:name="_Ref459627191"/>
+      <w:bookmarkStart w:id="12" w:name="_Toc462590133"/>
+      <w:bookmarkStart w:id="13" w:name="_Toc58851117"/>
       <w:r>
         <w:t>Setup</w:t>
       </w:r>
-      <w:bookmarkEnd w:id="10"/>
       <w:bookmarkEnd w:id="11"/>
       <w:bookmarkEnd w:id="12"/>
+      <w:bookmarkEnd w:id="13"/>
     </w:p>
     <w:p>
       <w:r>
@@ -659,9 +725,9 @@
       </w:r>
     </w:p>
     <w:p>
-      <w:bookmarkStart w:id="13" w:name="_Hlk498199981"/>
-      <w:bookmarkStart w:id="14" w:name="_Hlk498199488"/>
-      <w:bookmarkStart w:id="15" w:name="_Hlk503693290"/>
+      <w:bookmarkStart w:id="14" w:name="_Hlk498199981"/>
+      <w:bookmarkStart w:id="15" w:name="_Hlk498199488"/>
+      <w:bookmarkStart w:id="16" w:name="_Hlk503693290"/>
       <w:r>
         <w:rPr>
           <w:i/>
@@ -669,7 +735,7 @@
         </w:rPr>
         <w:t>Setup&gt;</w:t>
       </w:r>
-      <w:bookmarkEnd w:id="13"/>
+      <w:bookmarkEnd w:id="14"/>
       <w:r>
         <w:rPr>
           <w:i/>
@@ -680,14 +746,14 @@
       <w:r>
         <w:t xml:space="preserve">: dialog with sub-menu options to Load,  </w:t>
       </w:r>
-      <w:bookmarkEnd w:id="14"/>
+      <w:bookmarkEnd w:id="15"/>
       <w:r>
         <w:t>Add, Delete, Quality Control. The availability of these options may vary depending on what is defined in the data specific format file.</w:t>
       </w:r>
     </w:p>
     <w:p>
-      <w:bookmarkStart w:id="16" w:name="_Hlk503699883"/>
-      <w:bookmarkEnd w:id="15"/>
+      <w:bookmarkStart w:id="17" w:name="_Hlk503699883"/>
+      <w:bookmarkEnd w:id="16"/>
       <w:r>
         <w:t>Select one or more files to load. When the data has been loaded, the user is prompted to provide a description of the data set (</w:t>
       </w:r>
@@ -719,7 +785,7 @@
       <w:r>
         <w:t>: prompts for file format to be loaded. The options available vary with Data type</w:t>
       </w:r>
-      <w:bookmarkStart w:id="17" w:name="_Hlk71994047"/>
+      <w:bookmarkStart w:id="18" w:name="_Hlk71994047"/>
       <w:r>
         <w:t xml:space="preserve">. The data is then </w:t>
       </w:r>
@@ -756,7 +822,7 @@
       <w:r>
         <w:t xml:space="preserve">: prompts </w:t>
       </w:r>
-      <w:bookmarkEnd w:id="17"/>
+      <w:bookmarkEnd w:id="18"/>
       <w:r>
         <w:t>for file to be added (only one file at a time can be added) and the Case to use (if more than one Case). Only files with the format used to create the data set can be used to Add data to a data record and this is selected when the first file is loaded using the Load menu option.</w:t>
       </w:r>
@@ -827,8 +893,8 @@
       </w:r>
     </w:p>
     <w:p>
-      <w:bookmarkStart w:id="18" w:name="_Hlk506745047"/>
-      <w:bookmarkEnd w:id="16"/>
+      <w:bookmarkStart w:id="19" w:name="_Hlk506745047"/>
+      <w:bookmarkEnd w:id="17"/>
       <w:r>
         <w:rPr>
           <w:i/>
@@ -836,7 +902,7 @@
         </w:rPr>
         <w:t>Setup&gt;Input Data</w:t>
       </w:r>
-      <w:bookmarkEnd w:id="18"/>
+      <w:bookmarkEnd w:id="19"/>
       <w:r>
         <w:rPr>
           <w:i/>
@@ -845,7 +911,11 @@
         <w:t>&gt;Model Constants</w:t>
       </w:r>
       <w:r>
-        <w:t>: various constants are defined for use in models, such as the acceleration due to gravity, viscosity and density of sea water, and density of sediment. Generally, the default values are appropriate (9.81, 1.36e-6, 1025 , 2650 respectively) but these can be adjusted and saved with the project if required.</w:t>
+        <w:t xml:space="preserve">: various constants are defined for use in models, such as the acceleration due to gravity, viscosity and density of sea water, and density of sediment. Generally, the </w:t>
+      </w:r>
+      <w:r>
+        <w:lastRenderedPageBreak/>
+        <w:t>default values are appropriate (9.81, 1.36e-6, 1025 , 2650 respectively) but these can be adjusted and saved with the project if required.</w:t>
       </w:r>
     </w:p>
     <w:p/>
@@ -853,23 +923,23 @@
       <w:pPr>
         <w:pStyle w:val="Heading2"/>
       </w:pPr>
-      <w:bookmarkStart w:id="19" w:name="_Toc462590134"/>
-      <w:bookmarkStart w:id="20" w:name="_Ref505163265"/>
-      <w:bookmarkStart w:id="21" w:name="_Ref505163434"/>
-      <w:bookmarkStart w:id="22" w:name="_Ref505187940"/>
-      <w:bookmarkStart w:id="23" w:name="_Ref506962523"/>
-      <w:bookmarkStart w:id="24" w:name="_Toc58851118"/>
-      <w:bookmarkStart w:id="25" w:name="_Ref76228406"/>
+      <w:bookmarkStart w:id="20" w:name="_Toc462590134"/>
+      <w:bookmarkStart w:id="21" w:name="_Ref505163265"/>
+      <w:bookmarkStart w:id="22" w:name="_Ref505163434"/>
+      <w:bookmarkStart w:id="23" w:name="_Ref505187940"/>
+      <w:bookmarkStart w:id="24" w:name="_Ref506962523"/>
+      <w:bookmarkStart w:id="25" w:name="_Toc58851118"/>
+      <w:bookmarkStart w:id="26" w:name="_Ref76228406"/>
       <w:r>
         <w:t>Run</w:t>
       </w:r>
-      <w:bookmarkEnd w:id="19"/>
       <w:bookmarkEnd w:id="20"/>
       <w:bookmarkEnd w:id="21"/>
       <w:bookmarkEnd w:id="22"/>
       <w:bookmarkEnd w:id="23"/>
       <w:bookmarkEnd w:id="24"/>
       <w:bookmarkEnd w:id="25"/>
+      <w:bookmarkEnd w:id="26"/>
     </w:p>
     <w:p>
       <w:r>
@@ -900,14 +970,14 @@
       </w:r>
     </w:p>
     <w:p>
-      <w:bookmarkStart w:id="26" w:name="_Hlk505163518"/>
-      <w:bookmarkStart w:id="27" w:name="_Hlk505342330"/>
+      <w:bookmarkStart w:id="27" w:name="_Hlk505163518"/>
+      <w:bookmarkStart w:id="28" w:name="_Hlk505342330"/>
       <w:r>
         <w:rPr>
           <w:noProof/>
         </w:rPr>
         <w:drawing>
-          <wp:anchor distT="0" distB="0" distL="114300" distR="114300" simplePos="0" relativeHeight="251666432" behindDoc="0" locked="0" layoutInCell="1" allowOverlap="1" wp14:anchorId="703D27DE" wp14:editId="01448B04">
+          <wp:anchor distT="0" distB="0" distL="114300" distR="114300" simplePos="0" relativeHeight="251666432" behindDoc="0" locked="0" layoutInCell="1" allowOverlap="1" wp14:anchorId="703D27DE" wp14:editId="26206AE5">
             <wp:simplePos x="0" y="0"/>
             <wp:positionH relativeFrom="margin">
               <wp:align>right</wp:align>
@@ -966,13 +1036,31 @@
       <w:r>
         <w:t xml:space="preserve">: </w:t>
       </w:r>
-      <w:bookmarkEnd w:id="26"/>
+      <w:bookmarkEnd w:id="27"/>
       <w:r>
         <w:t xml:space="preserve">data that has been added (either as data or modelled values) can be used to derive new variables. </w:t>
       </w:r>
-      <w:bookmarkEnd w:id="27"/>
-      <w:r>
-        <w:t xml:space="preserve">The UI allows the user to select data and use a chosen selection of data/variable/range to define either a Variable, XYZ dimension, or Time. Each data set is sampled for the defined data range. If the data set being sampled includes NaNs the default is for these to be included (button to right of Var-limits is set to ‘+N’). To exclude NaNs press the button so that it displays ‘-N’. </w:t>
+      <w:bookmarkEnd w:id="28"/>
+      <w:r>
+        <w:t xml:space="preserve">The UI allows the user to select data and use a chosen selection of data/variable/range to define either a Variable, XYZ dimension, or Time. Each data set is sampled for the defined data range. If the data set being sampled includes </w:t>
+      </w:r>
+      <w:proofErr w:type="spellStart"/>
+      <w:r>
+        <w:t>NaNs</w:t>
+      </w:r>
+      <w:proofErr w:type="spellEnd"/>
+      <w:r>
+        <w:t xml:space="preserve"> the default is for these to be included (button to right of Var-limits is set to ‘+N’). To exclude </w:t>
+      </w:r>
+      <w:proofErr w:type="spellStart"/>
+      <w:proofErr w:type="gramStart"/>
+      <w:r>
+        <w:t>NaNs</w:t>
+      </w:r>
+      <w:proofErr w:type="spellEnd"/>
+      <w:proofErr w:type="gramEnd"/>
+      <w:r>
+        <w:t xml:space="preserve"> press the button so that it displays ‘-N’. </w:t>
       </w:r>
     </w:p>
     <w:p>
@@ -1252,13 +1340,23 @@
         </w:rPr>
         <w:t xml:space="preserve"> </w:t>
       </w:r>
+      <w:proofErr w:type="spellStart"/>
       <w:r>
         <w:rPr>
           <w:rFonts w:ascii="Consolas" w:eastAsia="Times New Roman" w:hAnsi="Consolas" w:cs="Times New Roman"/>
           <w:sz w:val="20"/>
           <w:szCs w:val="20"/>
         </w:rPr>
-        <w:t xml:space="preserve">varout = </w:t>
+        <w:t>varout</w:t>
+      </w:r>
+      <w:proofErr w:type="spellEnd"/>
+      <w:r>
+        <w:rPr>
+          <w:rFonts w:ascii="Consolas" w:eastAsia="Times New Roman" w:hAnsi="Consolas" w:cs="Times New Roman"/>
+          <w:sz w:val="20"/>
+          <w:szCs w:val="20"/>
+        </w:rPr>
+        <w:t xml:space="preserve"> = </w:t>
       </w:r>
       <w:r>
         <w:rPr>
@@ -1420,14 +1518,7 @@
         <w:rPr>
           <w:noProof/>
         </w:rPr>
-        <w:t xml:space="preserve">An alternative when calling external functions is to pass the selected variables as dstables, thereby also passing all the associated metadata and RowNames for each dataset selected. For this option up to 3 </w:t>
-      </w:r>
-      <w:r>
-        <w:rPr>
-          <w:noProof/>
-        </w:rPr>
-        <w:lastRenderedPageBreak/>
-        <w:t xml:space="preserve">variables </w:t>
+        <w:t xml:space="preserve">An alternative when calling external functions is to pass the selected variables as dstables, thereby also passing all the associated metadata and RowNames for each dataset selected. For this option up to 3 variables </w:t>
       </w:r>
       <w:r>
         <w:rPr>
@@ -1457,15 +1548,16 @@
           <w:sz w:val="20"/>
           <w:szCs w:val="20"/>
         </w:rPr>
-        <w:t>[time,</w:t>
-      </w:r>
+        <w:t>[</w:t>
+      </w:r>
+      <w:proofErr w:type="spellStart"/>
       <w:r>
         <w:rPr>
           <w:rFonts w:ascii="Consolas" w:eastAsia="Times New Roman" w:hAnsi="Consolas" w:cs="Times New Roman"/>
           <w:sz w:val="20"/>
           <w:szCs w:val="20"/>
         </w:rPr>
-        <w:t>varout</w:t>
+        <w:t>time,</w:t>
       </w:r>
       <w:r>
         <w:rPr>
@@ -1473,15 +1565,16 @@
           <w:sz w:val="20"/>
           <w:szCs w:val="20"/>
         </w:rPr>
-        <w:t>]</w:t>
-      </w:r>
+        <w:t>varout</w:t>
+      </w:r>
+      <w:proofErr w:type="spellEnd"/>
       <w:r>
         <w:rPr>
           <w:rFonts w:ascii="Consolas" w:eastAsia="Times New Roman" w:hAnsi="Consolas" w:cs="Times New Roman"/>
           <w:sz w:val="20"/>
           <w:szCs w:val="20"/>
         </w:rPr>
-        <w:t xml:space="preserve"> = </w:t>
+        <w:t>]</w:t>
       </w:r>
       <w:r>
         <w:rPr>
@@ -1489,7 +1582,43 @@
           <w:sz w:val="20"/>
           <w:szCs w:val="20"/>
         </w:rPr>
-        <w:t>myfunction(dst,</w:t>
+        <w:t xml:space="preserve"> = </w:t>
+      </w:r>
+      <w:proofErr w:type="spellStart"/>
+      <w:r>
+        <w:rPr>
+          <w:rFonts w:ascii="Consolas" w:eastAsia="Times New Roman" w:hAnsi="Consolas" w:cs="Times New Roman"/>
+          <w:sz w:val="20"/>
+          <w:szCs w:val="20"/>
+        </w:rPr>
+        <w:t>myfunction</w:t>
+      </w:r>
+      <w:proofErr w:type="spellEnd"/>
+      <w:r>
+        <w:rPr>
+          <w:rFonts w:ascii="Consolas" w:eastAsia="Times New Roman" w:hAnsi="Consolas" w:cs="Times New Roman"/>
+          <w:sz w:val="20"/>
+          <w:szCs w:val="20"/>
+        </w:rPr>
+        <w:t>(</w:t>
+      </w:r>
+      <w:proofErr w:type="spellStart"/>
+      <w:r>
+        <w:rPr>
+          <w:rFonts w:ascii="Consolas" w:eastAsia="Times New Roman" w:hAnsi="Consolas" w:cs="Times New Roman"/>
+          <w:sz w:val="20"/>
+          <w:szCs w:val="20"/>
+        </w:rPr>
+        <w:t>dst</w:t>
+      </w:r>
+      <w:proofErr w:type="spellEnd"/>
+      <w:r>
+        <w:rPr>
+          <w:rFonts w:ascii="Consolas" w:eastAsia="Times New Roman" w:hAnsi="Consolas" w:cs="Times New Roman"/>
+          <w:sz w:val="20"/>
+          <w:szCs w:val="20"/>
+        </w:rPr>
+        <w:t>,</w:t>
       </w:r>
       <w:r>
         <w:rPr>
@@ -1506,84 +1635,9 @@
           <w:sz w:val="20"/>
           <w:szCs w:val="20"/>
         </w:rPr>
-        <w:t>'usertext'</w:t>
-      </w:r>
-      <w:r>
-        <w:rPr>
-          <w:rFonts w:ascii="Consolas" w:eastAsia="Times New Roman" w:hAnsi="Consolas" w:cs="Times New Roman"/>
-          <w:sz w:val="20"/>
-          <w:szCs w:val="20"/>
-        </w:rPr>
-        <w:t>,</w:t>
-      </w:r>
-      <w:r>
-        <w:rPr>
-          <w:rFonts w:ascii="Consolas" w:eastAsia="Times New Roman" w:hAnsi="Consolas" w:cs="Times New Roman"/>
-          <w:sz w:val="20"/>
-          <w:szCs w:val="20"/>
-        </w:rPr>
-        <w:t xml:space="preserve"> </w:t>
-      </w:r>
-      <w:r>
-        <w:rPr>
-          <w:rFonts w:ascii="Consolas" w:eastAsia="Times New Roman" w:hAnsi="Consolas" w:cs="Times New Roman"/>
-          <w:sz w:val="20"/>
-          <w:szCs w:val="20"/>
-        </w:rPr>
-        <w:t>mobj)</w:t>
-      </w:r>
-      <w:r>
-        <w:rPr>
-          <w:rFonts w:ascii="Consolas" w:eastAsia="Times New Roman" w:hAnsi="Consolas" w:cs="Times New Roman"/>
-          <w:sz w:val="20"/>
-          <w:szCs w:val="20"/>
-        </w:rPr>
-        <w:t>;</w:t>
-      </w:r>
-    </w:p>
-    <w:p>
-      <w:pPr>
-        <w:spacing w:after="0" w:line="240" w:lineRule="auto"/>
-        <w:rPr>
-          <w:rFonts w:ascii="Consolas" w:eastAsia="Times New Roman" w:hAnsi="Consolas" w:cs="Times New Roman"/>
-          <w:sz w:val="20"/>
-          <w:szCs w:val="20"/>
-        </w:rPr>
-      </w:pPr>
-    </w:p>
-    <w:p>
-      <w:pPr>
-        <w:spacing w:after="0" w:line="240" w:lineRule="auto"/>
-        <w:rPr>
-          <w:rFonts w:ascii="Consolas" w:eastAsia="Times New Roman" w:hAnsi="Consolas" w:cs="Times New Roman"/>
-          <w:sz w:val="20"/>
-          <w:szCs w:val="20"/>
-        </w:rPr>
-      </w:pPr>
-      <w:r>
-        <w:rPr>
-          <w:rFonts w:ascii="Consolas" w:eastAsia="Times New Roman" w:hAnsi="Consolas" w:cs="Times New Roman"/>
-          <w:sz w:val="20"/>
-          <w:szCs w:val="20"/>
-        </w:rPr>
-        <w:t xml:space="preserve">dst = </w:t>
-      </w:r>
-      <w:r>
-        <w:rPr>
-          <w:rFonts w:ascii="Consolas" w:eastAsia="Times New Roman" w:hAnsi="Consolas" w:cs="Times New Roman"/>
-          <w:sz w:val="20"/>
-          <w:szCs w:val="20"/>
-        </w:rPr>
-        <w:t>myfunction(dst,</w:t>
-      </w:r>
-      <w:r>
-        <w:rPr>
-          <w:rFonts w:ascii="Consolas" w:eastAsia="Times New Roman" w:hAnsi="Consolas" w:cs="Times New Roman"/>
-          <w:sz w:val="20"/>
-          <w:szCs w:val="20"/>
-        </w:rPr>
-        <w:t xml:space="preserve"> </w:t>
-      </w:r>
+        <w:t>'</w:t>
+      </w:r>
+      <w:proofErr w:type="spellStart"/>
       <w:r>
         <w:rPr>
           <w:rFonts w:ascii="Consolas" w:eastAsia="Times New Roman" w:hAnsi="Consolas" w:cs="Times New Roman"/>
@@ -1591,8 +1645,9 @@
           <w:sz w:val="20"/>
           <w:szCs w:val="20"/>
         </w:rPr>
-        <w:t>'usertext</w:t>
-      </w:r>
+        <w:t>usertext</w:t>
+      </w:r>
+      <w:proofErr w:type="spellEnd"/>
       <w:r>
         <w:rPr>
           <w:rFonts w:ascii="Consolas" w:eastAsia="Times New Roman" w:hAnsi="Consolas" w:cs="Times New Roman"/>
@@ -1600,7 +1655,7 @@
           <w:sz w:val="20"/>
           <w:szCs w:val="20"/>
         </w:rPr>
-        <w:t>’</w:t>
+        <w:t>'</w:t>
       </w:r>
       <w:r>
         <w:rPr>
@@ -1618,31 +1673,194 @@
         </w:rPr>
         <w:t xml:space="preserve"> </w:t>
       </w:r>
+      <w:proofErr w:type="spellStart"/>
       <w:r>
         <w:rPr>
           <w:rFonts w:ascii="Consolas" w:eastAsia="Times New Roman" w:hAnsi="Consolas" w:cs="Times New Roman"/>
           <w:sz w:val="20"/>
           <w:szCs w:val="20"/>
         </w:rPr>
-        <w:t>mobj)</w:t>
-      </w:r>
+        <w:t>mobj</w:t>
+      </w:r>
+      <w:proofErr w:type="spellEnd"/>
       <w:r>
         <w:rPr>
           <w:rFonts w:ascii="Consolas" w:eastAsia="Times New Roman" w:hAnsi="Consolas" w:cs="Times New Roman"/>
           <w:sz w:val="20"/>
           <w:szCs w:val="20"/>
         </w:rPr>
-        <w:t>;</w:t>
-      </w:r>
-    </w:p>
-    <w:p>
-      <w:pPr>
-        <w:spacing w:after="0" w:line="240" w:lineRule="auto"/>
+        <w:t>)</w:t>
+      </w:r>
+      <w:r>
         <w:rPr>
           <w:rFonts w:ascii="Consolas" w:eastAsia="Times New Roman" w:hAnsi="Consolas" w:cs="Times New Roman"/>
           <w:sz w:val="20"/>
           <w:szCs w:val="20"/>
         </w:rPr>
+        <w:t>;</w:t>
+      </w:r>
+    </w:p>
+    <w:p>
+      <w:pPr>
+        <w:spacing w:after="0" w:line="240" w:lineRule="auto"/>
+        <w:rPr>
+          <w:rFonts w:ascii="Consolas" w:eastAsia="Times New Roman" w:hAnsi="Consolas" w:cs="Times New Roman"/>
+          <w:sz w:val="20"/>
+          <w:szCs w:val="20"/>
+        </w:rPr>
+      </w:pPr>
+    </w:p>
+    <w:p>
+      <w:pPr>
+        <w:spacing w:after="0" w:line="240" w:lineRule="auto"/>
+        <w:rPr>
+          <w:rFonts w:ascii="Consolas" w:eastAsia="Times New Roman" w:hAnsi="Consolas" w:cs="Times New Roman"/>
+          <w:sz w:val="20"/>
+          <w:szCs w:val="20"/>
+        </w:rPr>
+      </w:pPr>
+      <w:proofErr w:type="spellStart"/>
+      <w:r>
+        <w:rPr>
+          <w:rFonts w:ascii="Consolas" w:eastAsia="Times New Roman" w:hAnsi="Consolas" w:cs="Times New Roman"/>
+          <w:sz w:val="20"/>
+          <w:szCs w:val="20"/>
+        </w:rPr>
+        <w:t>dst</w:t>
+      </w:r>
+      <w:proofErr w:type="spellEnd"/>
+      <w:r>
+        <w:rPr>
+          <w:rFonts w:ascii="Consolas" w:eastAsia="Times New Roman" w:hAnsi="Consolas" w:cs="Times New Roman"/>
+          <w:sz w:val="20"/>
+          <w:szCs w:val="20"/>
+        </w:rPr>
+        <w:t xml:space="preserve"> = </w:t>
+      </w:r>
+      <w:proofErr w:type="spellStart"/>
+      <w:r>
+        <w:rPr>
+          <w:rFonts w:ascii="Consolas" w:eastAsia="Times New Roman" w:hAnsi="Consolas" w:cs="Times New Roman"/>
+          <w:sz w:val="20"/>
+          <w:szCs w:val="20"/>
+        </w:rPr>
+        <w:t>myfunction</w:t>
+      </w:r>
+      <w:proofErr w:type="spellEnd"/>
+      <w:r>
+        <w:rPr>
+          <w:rFonts w:ascii="Consolas" w:eastAsia="Times New Roman" w:hAnsi="Consolas" w:cs="Times New Roman"/>
+          <w:sz w:val="20"/>
+          <w:szCs w:val="20"/>
+        </w:rPr>
+        <w:t>(</w:t>
+      </w:r>
+      <w:proofErr w:type="spellStart"/>
+      <w:r>
+        <w:rPr>
+          <w:rFonts w:ascii="Consolas" w:eastAsia="Times New Roman" w:hAnsi="Consolas" w:cs="Times New Roman"/>
+          <w:sz w:val="20"/>
+          <w:szCs w:val="20"/>
+        </w:rPr>
+        <w:t>dst</w:t>
+      </w:r>
+      <w:proofErr w:type="spellEnd"/>
+      <w:r>
+        <w:rPr>
+          <w:rFonts w:ascii="Consolas" w:eastAsia="Times New Roman" w:hAnsi="Consolas" w:cs="Times New Roman"/>
+          <w:sz w:val="20"/>
+          <w:szCs w:val="20"/>
+        </w:rPr>
+        <w:t>,</w:t>
+      </w:r>
+      <w:r>
+        <w:rPr>
+          <w:rFonts w:ascii="Consolas" w:eastAsia="Times New Roman" w:hAnsi="Consolas" w:cs="Times New Roman"/>
+          <w:sz w:val="20"/>
+          <w:szCs w:val="20"/>
+        </w:rPr>
+        <w:t xml:space="preserve"> </w:t>
+      </w:r>
+      <w:r>
+        <w:rPr>
+          <w:rFonts w:ascii="Consolas" w:eastAsia="Times New Roman" w:hAnsi="Consolas" w:cs="Times New Roman"/>
+          <w:color w:val="A709F5"/>
+          <w:sz w:val="20"/>
+          <w:szCs w:val="20"/>
+        </w:rPr>
+        <w:t>'</w:t>
+      </w:r>
+      <w:proofErr w:type="spellStart"/>
+      <w:r>
+        <w:rPr>
+          <w:rFonts w:ascii="Consolas" w:eastAsia="Times New Roman" w:hAnsi="Consolas" w:cs="Times New Roman"/>
+          <w:color w:val="A709F5"/>
+          <w:sz w:val="20"/>
+          <w:szCs w:val="20"/>
+        </w:rPr>
+        <w:t>usertext</w:t>
+      </w:r>
+      <w:proofErr w:type="spellEnd"/>
+      <w:r>
+        <w:rPr>
+          <w:rFonts w:ascii="Consolas" w:eastAsia="Times New Roman" w:hAnsi="Consolas" w:cs="Times New Roman"/>
+          <w:color w:val="A709F5"/>
+          <w:sz w:val="20"/>
+          <w:szCs w:val="20"/>
+        </w:rPr>
+        <w:t>’</w:t>
+      </w:r>
+      <w:r>
+        <w:rPr>
+          <w:rFonts w:ascii="Consolas" w:eastAsia="Times New Roman" w:hAnsi="Consolas" w:cs="Times New Roman"/>
+          <w:sz w:val="20"/>
+          <w:szCs w:val="20"/>
+        </w:rPr>
+        <w:t>,</w:t>
+      </w:r>
+      <w:r>
+        <w:rPr>
+          <w:rFonts w:ascii="Consolas" w:eastAsia="Times New Roman" w:hAnsi="Consolas" w:cs="Times New Roman"/>
+          <w:sz w:val="20"/>
+          <w:szCs w:val="20"/>
+        </w:rPr>
+        <w:t xml:space="preserve"> </w:t>
+      </w:r>
+      <w:proofErr w:type="spellStart"/>
+      <w:r>
+        <w:rPr>
+          <w:rFonts w:ascii="Consolas" w:eastAsia="Times New Roman" w:hAnsi="Consolas" w:cs="Times New Roman"/>
+          <w:sz w:val="20"/>
+          <w:szCs w:val="20"/>
+        </w:rPr>
+        <w:t>mobj</w:t>
+      </w:r>
+      <w:proofErr w:type="spellEnd"/>
+      <w:r>
+        <w:rPr>
+          <w:rFonts w:ascii="Consolas" w:eastAsia="Times New Roman" w:hAnsi="Consolas" w:cs="Times New Roman"/>
+          <w:sz w:val="20"/>
+          <w:szCs w:val="20"/>
+        </w:rPr>
+        <w:t>)</w:t>
+      </w:r>
+      <w:r>
+        <w:rPr>
+          <w:rFonts w:ascii="Consolas" w:eastAsia="Times New Roman" w:hAnsi="Consolas" w:cs="Times New Roman"/>
+          <w:sz w:val="20"/>
+          <w:szCs w:val="20"/>
+        </w:rPr>
+        <w:t>;</w:t>
+      </w:r>
+    </w:p>
+    <w:p>
+      <w:pPr>
+        <w:spacing w:after="0" w:line="240" w:lineRule="auto"/>
+        <w:rPr>
+          <w:rFonts w:ascii="Consolas" w:eastAsia="Times New Roman" w:hAnsi="Consolas" w:cs="Times New Roman"/>
+          <w:sz w:val="20"/>
+          <w:szCs w:val="20"/>
+        </w:rPr>
       </w:pPr>
     </w:p>
     <w:p>
@@ -1718,7 +1936,7 @@
           <w:noProof/>
         </w:rPr>
       </w:pPr>
-      <w:bookmarkStart w:id="28" w:name="_Hlk89076579"/>
+      <w:bookmarkStart w:id="29" w:name="_Hlk89076579"/>
       <w:r>
         <w:rPr>
           <w:noProof/>
@@ -1747,7 +1965,7 @@
         <w:t>XX</w:t>
       </w:r>
     </w:p>
-    <w:bookmarkEnd w:id="28"/>
+    <w:bookmarkEnd w:id="29"/>
     <w:p/>
     <w:p>
       <w:pPr>
@@ -1784,14 +2002,14 @@
       <w:pPr>
         <w:pStyle w:val="Heading3"/>
       </w:pPr>
-      <w:bookmarkStart w:id="29" w:name="_Ref76228416"/>
+      <w:bookmarkStart w:id="30" w:name="_Ref76228416"/>
       <w:r>
         <w:t>Plotting</w:t>
       </w:r>
-      <w:bookmarkEnd w:id="29"/>
-    </w:p>
-    <w:p>
-      <w:bookmarkStart w:id="30" w:name="_Hlk503199090"/>
+      <w:bookmarkEnd w:id="30"/>
+    </w:p>
+    <w:p>
+      <w:bookmarkStart w:id="31" w:name="_Hlk503199090"/>
       <w:r>
         <w:rPr>
           <w:i/>
@@ -1809,7 +2027,7 @@
       <w:r>
         <w:t xml:space="preserve">: initialises </w:t>
       </w:r>
-      <w:bookmarkEnd w:id="30"/>
+      <w:bookmarkEnd w:id="31"/>
       <w:r>
         <w:t xml:space="preserve">the Plot </w:t>
       </w:r>
@@ -1817,7 +2035,15 @@
         <w:t>UI</w:t>
       </w:r>
       <w:r>
-        <w:t xml:space="preserve"> to select variables and produce several types of plot. The user selects the </w:t>
+        <w:t xml:space="preserve"> to select variables and produce several types of </w:t>
+      </w:r>
+      <w:proofErr w:type="gramStart"/>
+      <w:r>
+        <w:t>plot</w:t>
+      </w:r>
+      <w:proofErr w:type="gramEnd"/>
+      <w:r>
+        <w:t xml:space="preserve">. The user selects the </w:t>
       </w:r>
       <w:r>
         <w:t>Case, Dataset</w:t>
@@ -1847,7 +2073,15 @@
         <w:t>-</w:t>
       </w:r>
       <w:r>
-        <w:t>down lists. There are then buttons to create a New figure</w:t>
+        <w:t xml:space="preserve">down lists. There are then buttons to create a </w:t>
+      </w:r>
+      <w:proofErr w:type="gramStart"/>
+      <w:r>
+        <w:t>New</w:t>
+      </w:r>
+      <w:proofErr w:type="gramEnd"/>
+      <w:r>
+        <w:t xml:space="preserve"> figure</w:t>
       </w:r>
       <w:r>
         <w:t>,</w:t>
@@ -1894,7 +2128,7 @@
                 <w:noProof/>
               </w:rPr>
             </w:pPr>
-            <w:bookmarkStart w:id="31" w:name="_Hlk42161777"/>
+            <w:bookmarkStart w:id="32" w:name="_Hlk42161777"/>
             <w:r>
               <w:rPr>
                 <w:noProof/>
@@ -2151,7 +2385,7 @@
                 <w:szCs w:val="20"/>
               </w:rPr>
             </w:pPr>
-            <w:bookmarkStart w:id="32" w:name="_Hlk41129620"/>
+            <w:bookmarkStart w:id="33" w:name="_Hlk41129620"/>
             <w:r>
               <w:rPr>
                 <w:sz w:val="20"/>
@@ -2205,7 +2439,7 @@
               </w:rPr>
               <w:t>+ : switches between cartesian and polar plot type</w:t>
             </w:r>
-            <w:bookmarkEnd w:id="32"/>
+            <w:bookmarkEnd w:id="33"/>
           </w:p>
           <w:p>
             <w:pPr>
@@ -2756,7 +2990,7 @@
           </w:p>
         </w:tc>
       </w:tr>
-      <w:bookmarkEnd w:id="31"/>
+      <w:bookmarkEnd w:id="32"/>
     </w:tbl>
     <w:p>
       <w:pPr>
@@ -3912,22 +4146,35 @@
         <w:t xml:space="preserve"> the</w:t>
       </w:r>
       <w:r>
-        <w:t xml:space="preserve"> user_</w:t>
+        <w:t xml:space="preserve"> </w:t>
+      </w:r>
+      <w:proofErr w:type="spellStart"/>
+      <w:r>
+        <w:t>user_</w:t>
       </w:r>
       <w:r>
         <w:t>plot</w:t>
       </w:r>
       <w:r>
-        <w:t xml:space="preserve">.m function, where the user can define a workflow, accessing data and functions already provided by the particular App or the muitoolbox. The sample code can be found in the </w:t>
-      </w:r>
-      <w:bookmarkStart w:id="33" w:name="_Hlk183337190"/>
+        <w:t>.m</w:t>
+      </w:r>
+      <w:proofErr w:type="spellEnd"/>
+      <w:r>
+        <w:t xml:space="preserve"> function, where the user can define a workflow, accessing data and functions already provided by the particular App or the muitoolbox. The sample code can be found in the </w:t>
+      </w:r>
+      <w:bookmarkStart w:id="34" w:name="_Hlk183337190"/>
       <w:r>
         <w:t>muitoolbox/</w:t>
       </w:r>
-      <w:r>
-        <w:t xml:space="preserve">psfunctions </w:t>
-      </w:r>
-      <w:bookmarkEnd w:id="33"/>
+      <w:proofErr w:type="spellStart"/>
+      <w:r>
+        <w:t>psfunctions</w:t>
+      </w:r>
+      <w:proofErr w:type="spellEnd"/>
+      <w:r>
+        <w:t xml:space="preserve"> </w:t>
+      </w:r>
+      <w:bookmarkEnd w:id="34"/>
       <w:r>
         <w:t>folder and illustrates the workflow to</w:t>
       </w:r>
@@ -3940,14 +4187,14 @@
       <w:pPr>
         <w:pStyle w:val="Heading3"/>
       </w:pPr>
-      <w:bookmarkStart w:id="34" w:name="_Ref76228422"/>
-      <w:bookmarkStart w:id="35" w:name="_Hlk41129307"/>
-      <w:bookmarkStart w:id="36" w:name="_Hlk503203212"/>
+      <w:bookmarkStart w:id="35" w:name="_Ref76228422"/>
+      <w:bookmarkStart w:id="36" w:name="_Hlk41129307"/>
+      <w:bookmarkStart w:id="37" w:name="_Hlk503203212"/>
       <w:r>
         <w:lastRenderedPageBreak/>
         <w:t>Statistics</w:t>
       </w:r>
-      <w:bookmarkEnd w:id="34"/>
+      <w:bookmarkEnd w:id="35"/>
     </w:p>
     <w:p>
       <w:r>
@@ -3967,11 +4214,11 @@
       <w:r>
         <w:t xml:space="preserve">: </w:t>
       </w:r>
-      <w:bookmarkStart w:id="37" w:name="_Hlk15127543"/>
+      <w:bookmarkStart w:id="38" w:name="_Hlk15127543"/>
       <w:r>
         <w:t xml:space="preserve">several statistical analysis options have been included within the Statistical Analysis GUI. </w:t>
       </w:r>
-      <w:bookmarkEnd w:id="37"/>
+      <w:bookmarkEnd w:id="38"/>
       <w:r>
         <w:t xml:space="preserve">The tabs are for </w:t>
       </w:r>
@@ -4054,7 +4301,7 @@
           <w:szCs w:val="24"/>
         </w:rPr>
       </w:pPr>
-      <w:bookmarkStart w:id="38" w:name="_Hlk77155475"/>
+      <w:bookmarkStart w:id="39" w:name="_Hlk77155475"/>
       <w:r>
         <w:rPr>
           <w:rFonts w:asciiTheme="majorHAnsi" w:eastAsiaTheme="majorEastAsia" w:hAnsiTheme="majorHAnsi" w:cstheme="majorBidi"/>
@@ -4212,7 +4459,7 @@
         <w:ind w:left="360"/>
         <w:contextualSpacing/>
       </w:pPr>
-      <w:bookmarkStart w:id="39" w:name="_Hlk77155372"/>
+      <w:bookmarkStart w:id="40" w:name="_Hlk77155372"/>
       <w:r>
         <w:t xml:space="preserve">The results are tabulated </w:t>
       </w:r>
@@ -4235,7 +4482,7 @@
         <w:t xml:space="preserve"> and can be copied to the clipboard for use in other applications.</w:t>
       </w:r>
     </w:p>
-    <w:bookmarkEnd w:id="39"/>
+    <w:bookmarkEnd w:id="40"/>
     <w:p>
       <w:pPr>
         <w:ind w:left="360"/>
@@ -4255,7 +4502,7 @@
           <w:noProof/>
         </w:rPr>
         <w:drawing>
-          <wp:anchor distT="0" distB="0" distL="114300" distR="114300" simplePos="0" relativeHeight="251673600" behindDoc="0" locked="0" layoutInCell="1" allowOverlap="1" wp14:anchorId="76014E06" wp14:editId="6B5399EA">
+          <wp:anchor distT="0" distB="0" distL="114300" distR="114300" simplePos="0" relativeHeight="251673600" behindDoc="0" locked="0" layoutInCell="1" allowOverlap="1" wp14:anchorId="76014E06" wp14:editId="4CEFC9E0">
             <wp:simplePos x="0" y="0"/>
             <wp:positionH relativeFrom="column">
               <wp:posOffset>31750</wp:posOffset>
@@ -4481,7 +4728,15 @@
         <w:t>:</w:t>
       </w:r>
       <w:r>
-        <w:t xml:space="preserve"> calls the function user_stats.m, in which the user can implement their own analysis methods and display results in the UI or add output to the </w:t>
+        <w:t xml:space="preserve"> calls the function </w:t>
+      </w:r>
+      <w:proofErr w:type="spellStart"/>
+      <w:r>
+        <w:t>user_stats.m</w:t>
+      </w:r>
+      <w:proofErr w:type="spellEnd"/>
+      <w:r>
+        <w:t xml:space="preserve">, in which the user can implement their own analysis methods and display results in the UI or add output to the </w:t>
       </w:r>
       <w:r>
         <w:t>project Catalogue.</w:t>
@@ -4581,11 +4836,11 @@
       <w:r>
         <w:t xml:space="preserve">: </w:t>
       </w:r>
-      <w:bookmarkStart w:id="40" w:name="_Hlk13570235"/>
+      <w:bookmarkStart w:id="41" w:name="_Hlk13570235"/>
       <w:r>
         <w:t>general statistics of a variable (mean, standard deviation, minimum, maximum, sum and linear regression fit parameters). The results are tabulated in a new window and can be copied to the clipboard for use in other applications.</w:t>
       </w:r>
-      <w:bookmarkEnd w:id="40"/>
+      <w:bookmarkEnd w:id="41"/>
     </w:p>
     <w:p>
       <w:pPr>
@@ -4917,7 +5172,15 @@
         <w:t>tint</w:t>
       </w:r>
       <w:r>
-        <w:t>’) is also be defined in the pop-up gui. This can be used to try and ensure that peaks are independent. The peaks are marked on a plot with the defined threshold. If rejected, new values can be defined. If accepted a new timeseries is added. This has the class of the Data Type that was used as the source timeseries but is not appended to that timeseries because the date/times are a subset of the source.</w:t>
+        <w:t xml:space="preserve">’) is also be defined in the pop-up </w:t>
+      </w:r>
+      <w:proofErr w:type="spellStart"/>
+      <w:r>
+        <w:t>gui</w:t>
+      </w:r>
+      <w:proofErr w:type="spellEnd"/>
+      <w:r>
+        <w:t>. This can be used to try and ensure that peaks are independent. The peaks are marked on a plot with the defined threshold. If rejected, new values can be defined. If accepted a new timeseries is added. This has the class of the Data Type that was used as the source timeseries but is not appended to that timeseries because the date/times are a subset of the source.</w:t>
       </w:r>
     </w:p>
     <w:p>
@@ -5248,14 +5511,70 @@
         </w:rPr>
         <w:t xml:space="preserve">This is experimental code </w:t>
       </w:r>
-      <w:bookmarkStart w:id="41" w:name="_Hlk110430202"/>
+      <w:bookmarkStart w:id="42" w:name="_Hlk110430202"/>
       <w:r>
         <w:rPr>
           <w:bCs/>
         </w:rPr>
-        <w:t xml:space="preserve">(for code see .../muitoolbox/psfunctions/hurst_exponent.m, hurst_aalok_ihlen.m and genhurstw.m) </w:t>
-      </w:r>
-      <w:bookmarkEnd w:id="41"/>
+        <w:t>(for code see .../muitoolbox/</w:t>
+      </w:r>
+      <w:proofErr w:type="spellStart"/>
+      <w:r>
+        <w:rPr>
+          <w:bCs/>
+        </w:rPr>
+        <w:t>psfunctions</w:t>
+      </w:r>
+      <w:proofErr w:type="spellEnd"/>
+      <w:r>
+        <w:rPr>
+          <w:bCs/>
+        </w:rPr>
+        <w:t>/</w:t>
+      </w:r>
+      <w:proofErr w:type="spellStart"/>
+      <w:r>
+        <w:rPr>
+          <w:bCs/>
+        </w:rPr>
+        <w:t>hurst_exponent.m</w:t>
+      </w:r>
+      <w:proofErr w:type="spellEnd"/>
+      <w:r>
+        <w:rPr>
+          <w:bCs/>
+        </w:rPr>
+        <w:t xml:space="preserve">, </w:t>
+      </w:r>
+      <w:proofErr w:type="spellStart"/>
+      <w:r>
+        <w:rPr>
+          <w:bCs/>
+        </w:rPr>
+        <w:t>hurst_aalok_ihlen.m</w:t>
+      </w:r>
+      <w:proofErr w:type="spellEnd"/>
+      <w:r>
+        <w:rPr>
+          <w:bCs/>
+        </w:rPr>
+        <w:t xml:space="preserve"> and </w:t>
+      </w:r>
+      <w:proofErr w:type="spellStart"/>
+      <w:r>
+        <w:rPr>
+          <w:bCs/>
+        </w:rPr>
+        <w:t>genhurstw.m</w:t>
+      </w:r>
+      <w:proofErr w:type="spellEnd"/>
+      <w:r>
+        <w:rPr>
+          <w:bCs/>
+        </w:rPr>
+        <w:t xml:space="preserve">) </w:t>
+      </w:r>
+      <w:bookmarkEnd w:id="42"/>
       <w:r>
         <w:rPr>
           <w:bCs/>
@@ -5720,11 +6039,16 @@
       <w:r>
         <w:t xml:space="preserve">: calls </w:t>
       </w:r>
+      <w:proofErr w:type="spellStart"/>
       <w:r>
         <w:t>user_stats</w:t>
       </w:r>
       <w:r>
-        <w:t>.m function, where the user can define a workflow, accessing data and functions already provided by</w:t>
+        <w:t>.m</w:t>
+      </w:r>
+      <w:proofErr w:type="spellEnd"/>
+      <w:r>
+        <w:t xml:space="preserve"> function, where the user can define a workflow, accessing data and functions already provided by</w:t>
       </w:r>
       <w:r>
         <w:t xml:space="preserve"> the particular App</w:t>
@@ -5739,10 +6063,34 @@
         <w:t xml:space="preserve">. The sample code </w:t>
       </w:r>
       <w:r>
-        <w:t xml:space="preserve">can be found in the psfunctions folder  and </w:t>
-      </w:r>
-      <w:r>
-        <w:t>illustrates the workflow to produce a clusters plot. Some code in the header (commented out) shows how to get a time series using the handles passed to the function (obj and mobj)</w:t>
+        <w:t xml:space="preserve">can be found in the </w:t>
+      </w:r>
+      <w:proofErr w:type="spellStart"/>
+      <w:r>
+        <w:t>psfunctions</w:t>
+      </w:r>
+      <w:proofErr w:type="spellEnd"/>
+      <w:r>
+        <w:t xml:space="preserve"> folder  and </w:t>
+      </w:r>
+      <w:r>
+        <w:t>illustrates the workflow to produce a clusters plot. Some code in the header (commented out) shows how to get a time series using the handles passed to the function (</w:t>
+      </w:r>
+      <w:proofErr w:type="spellStart"/>
+      <w:r>
+        <w:t>obj</w:t>
+      </w:r>
+      <w:proofErr w:type="spellEnd"/>
+      <w:r>
+        <w:t xml:space="preserve"> and </w:t>
+      </w:r>
+      <w:proofErr w:type="spellStart"/>
+      <w:r>
+        <w:t>mobj</w:t>
+      </w:r>
+      <w:proofErr w:type="spellEnd"/>
+      <w:r>
+        <w:t>)</w:t>
       </w:r>
       <w:r>
         <w:t xml:space="preserve">. </w:t>
@@ -5768,7 +6116,7 @@
           <w:szCs w:val="24"/>
         </w:rPr>
       </w:pPr>
-      <w:bookmarkStart w:id="42" w:name="_Hlk76231208"/>
+      <w:bookmarkStart w:id="43" w:name="_Hlk76231208"/>
       <w:r>
         <w:rPr>
           <w:rFonts w:asciiTheme="majorHAnsi" w:eastAsiaTheme="majorEastAsia" w:hAnsiTheme="majorHAnsi" w:cstheme="majorBidi"/>
@@ -5795,7 +6143,7 @@
       <w:r>
         <w:t xml:space="preserve">The Taylor tab allows the user to </w:t>
       </w:r>
-      <w:bookmarkEnd w:id="42"/>
+      <w:bookmarkEnd w:id="43"/>
       <w:r>
         <w:t xml:space="preserve">create a Taylor Plot using </w:t>
       </w:r>
@@ -5884,35 +6232,67 @@
           <w:i/>
           <w:iCs/>
         </w:rPr>
-        <w:t xml:space="preserve">The ModelSkill App provides </w:t>
-      </w:r>
+        <w:t xml:space="preserve">The </w:t>
+      </w:r>
+      <w:proofErr w:type="spellStart"/>
       <w:r>
         <w:rPr>
           <w:i/>
           <w:iCs/>
         </w:rPr>
-        <w:t xml:space="preserve">additional </w:t>
-      </w:r>
+        <w:t>ModelSkill</w:t>
+      </w:r>
+      <w:proofErr w:type="spellEnd"/>
       <w:r>
         <w:rPr>
           <w:i/>
           <w:iCs/>
         </w:rPr>
-        <w:t xml:space="preserve">tools to test </w:t>
+        <w:t xml:space="preserve"> App provides </w:t>
       </w:r>
       <w:r>
         <w:rPr>
           <w:i/>
           <w:iCs/>
         </w:rPr>
-        <w:t>data and</w:t>
+        <w:t xml:space="preserve">additional </w:t>
       </w:r>
       <w:r>
         <w:rPr>
           <w:i/>
           <w:iCs/>
         </w:rPr>
-        <w:t xml:space="preserve"> the ModelSkill App manual </w:t>
+        <w:t xml:space="preserve">tools to test </w:t>
+      </w:r>
+      <w:r>
+        <w:rPr>
+          <w:i/>
+          <w:iCs/>
+        </w:rPr>
+        <w:t>data and</w:t>
+      </w:r>
+      <w:r>
+        <w:rPr>
+          <w:i/>
+          <w:iCs/>
+        </w:rPr>
+        <w:t xml:space="preserve"> the </w:t>
+      </w:r>
+      <w:proofErr w:type="spellStart"/>
+      <w:r>
+        <w:rPr>
+          <w:i/>
+          <w:iCs/>
+        </w:rPr>
+        <w:t>ModelSkill</w:t>
+      </w:r>
+      <w:proofErr w:type="spellEnd"/>
+      <w:r>
+        <w:rPr>
+          <w:i/>
+          <w:iCs/>
+        </w:rPr>
+        <w:t xml:space="preserve"> App manual </w:t>
       </w:r>
       <w:r>
         <w:rPr>
@@ -6018,7 +6398,15 @@
         <w:t>Once New or Add are selected, the user is asked whether they want to plot the skill score</w:t>
       </w:r>
       <w:r>
-        <w:t xml:space="preserve"> (Yes/No). If Yes, then the user is prompted to set the skill score parameters.</w:t>
+        <w:t xml:space="preserve"> (Yes/No). If </w:t>
+      </w:r>
+      <w:proofErr w:type="gramStart"/>
+      <w:r>
+        <w:t>Yes</w:t>
+      </w:r>
+      <w:proofErr w:type="gramEnd"/>
+      <w:r>
+        <w:t>, then the user is prompted to set the skill score parameters.</w:t>
       </w:r>
       <w:r>
         <w:t xml:space="preserve"> </w:t>
@@ -6027,7 +6415,15 @@
         <w:t xml:space="preserve"> </w:t>
       </w:r>
       <w:r>
-        <w:t>As further points are added to the plot, this selection remains unchanged (i.e. the skill score is or is not included). To reset the option it is necessary to close and reopen the Statistics UI.</w:t>
+        <w:t xml:space="preserve">As further points are added to the plot, this selection remains unchanged (i.e. the skill score is or is not included). To reset the </w:t>
+      </w:r>
+      <w:proofErr w:type="gramStart"/>
+      <w:r>
+        <w:t>option</w:t>
+      </w:r>
+      <w:proofErr w:type="gramEnd"/>
+      <w:r>
+        <w:t xml:space="preserve"> it is necessary to close and reopen the Statistics UI.</w:t>
       </w:r>
       <w:r>
         <w:t xml:space="preserve"> </w:t>
@@ -6055,7 +6451,7 @@
           <w:noProof/>
         </w:rPr>
         <w:drawing>
-          <wp:anchor distT="0" distB="0" distL="114300" distR="114300" simplePos="0" relativeHeight="251683840" behindDoc="0" locked="0" layoutInCell="1" allowOverlap="1" wp14:anchorId="31A940D7" wp14:editId="517E0A07">
+          <wp:anchor distT="0" distB="0" distL="114300" distR="114300" simplePos="0" relativeHeight="251683840" behindDoc="0" locked="0" layoutInCell="1" allowOverlap="1" wp14:anchorId="31A940D7" wp14:editId="428A4116">
             <wp:simplePos x="0" y="0"/>
             <wp:positionH relativeFrom="margin">
               <wp:align>left</wp:align>
@@ -6120,8 +6516,13 @@
       <w:r>
         <w:t xml:space="preserve">Exponent used in computing the skill score (see </w:t>
       </w:r>
-      <w:r>
-        <w:t>ModelSkill manual for details</w:t>
+      <w:proofErr w:type="spellStart"/>
+      <w:r>
+        <w:t>ModelSkill</w:t>
+      </w:r>
+      <w:proofErr w:type="spellEnd"/>
+      <w:r>
+        <w:t xml:space="preserve"> manual for details</w:t>
       </w:r>
       <w:r>
         <w:t>).</w:t>
@@ -6138,7 +6539,15 @@
         <w:t>points</w:t>
       </w:r>
       <w:r>
-        <w:t xml:space="preserve"> (+/-W) used to define a local window around the ith point. If W=0 (default) the local skill score is not computed.</w:t>
+        <w:t xml:space="preserve"> (+/-W) used to define a local window around the </w:t>
+      </w:r>
+      <w:proofErr w:type="spellStart"/>
+      <w:r>
+        <w:t>ith</w:t>
+      </w:r>
+      <w:proofErr w:type="spellEnd"/>
+      <w:r>
+        <w:t xml:space="preserve"> point. If W=0 (default) the local skill score is not computed.</w:t>
       </w:r>
     </w:p>
     <w:p>
@@ -6161,7 +6570,39 @@
         <w:t>local</w:t>
       </w:r>
       <w:r>
-        <w:t xml:space="preserve"> skill score. Format is [xMin, xMax, yMin, yMax].</w:t>
+        <w:t xml:space="preserve"> skill score. Format is [</w:t>
+      </w:r>
+      <w:proofErr w:type="spellStart"/>
+      <w:r>
+        <w:t>xMin</w:t>
+      </w:r>
+      <w:proofErr w:type="spellEnd"/>
+      <w:r>
+        <w:t xml:space="preserve">, </w:t>
+      </w:r>
+      <w:proofErr w:type="spellStart"/>
+      <w:r>
+        <w:t>xMax</w:t>
+      </w:r>
+      <w:proofErr w:type="spellEnd"/>
+      <w:r>
+        <w:t xml:space="preserve">, </w:t>
+      </w:r>
+      <w:proofErr w:type="spellStart"/>
+      <w:r>
+        <w:t>yMin</w:t>
+      </w:r>
+      <w:proofErr w:type="spellEnd"/>
+      <w:r>
+        <w:t xml:space="preserve">, </w:t>
+      </w:r>
+      <w:proofErr w:type="spellStart"/>
+      <w:r>
+        <w:t>yMax</w:t>
+      </w:r>
+      <w:proofErr w:type="spellEnd"/>
+      <w:r>
+        <w:t>].</w:t>
       </w:r>
     </w:p>
     <w:p/>
@@ -6578,7 +7019,15 @@
         <w:t>tab allows the user to</w:t>
       </w:r>
       <w:r>
-        <w:t xml:space="preserve"> compute selected simple statistics of a timeseries variable for the intervals between the times recorded in another timeseries. For example the mean wave energy between beach profile surveys.</w:t>
+        <w:t xml:space="preserve"> compute selected simple statistics of a timeseries variable for the intervals between the times recorded in another timeseries. For </w:t>
+      </w:r>
+      <w:proofErr w:type="gramStart"/>
+      <w:r>
+        <w:t>example</w:t>
+      </w:r>
+      <w:proofErr w:type="gramEnd"/>
+      <w:r>
+        <w:t xml:space="preserve"> the mean wave energy between beach profile surveys.</w:t>
       </w:r>
     </w:p>
     <w:p>
@@ -6677,6 +7126,7 @@
         </w:rPr>
         <w:t>‘</w:t>
       </w:r>
+      <w:proofErr w:type="spellStart"/>
       <w:r>
         <w:rPr>
           <w:i/>
@@ -6684,6 +7134,7 @@
         </w:rPr>
         <w:t>statoptions</w:t>
       </w:r>
+      <w:proofErr w:type="spellEnd"/>
       <w:r>
         <w:rPr>
           <w:i/>
@@ -6696,8 +7147,17 @@
           <w:i/>
           <w:iCs/>
         </w:rPr>
-        <w:t xml:space="preserve"> in muiStats.getIntervalStats</w:t>
-      </w:r>
+        <w:t xml:space="preserve"> in </w:t>
+      </w:r>
+      <w:proofErr w:type="spellStart"/>
+      <w:r>
+        <w:rPr>
+          <w:i/>
+          <w:iCs/>
+        </w:rPr>
+        <w:t>muiStats.getIntervalStats</w:t>
+      </w:r>
+      <w:proofErr w:type="spellEnd"/>
       <w:r>
         <w:t>.]</w:t>
       </w:r>
@@ -6756,7 +7216,7 @@
         <w:t>Help</w:t>
       </w:r>
     </w:p>
-    <w:bookmarkEnd w:id="35"/>
+    <w:bookmarkEnd w:id="36"/>
     <w:p>
       <w:r>
         <w:t>The help menu provides options to access the App documentation in the MatlabTM Supplemental Software documentation, or the App manual</w:t>
@@ -6769,12 +7229,12 @@
       <w:pPr>
         <w:pStyle w:val="Heading2"/>
       </w:pPr>
-      <w:bookmarkStart w:id="43" w:name="_Toc58851120"/>
-      <w:bookmarkEnd w:id="36"/>
+      <w:bookmarkStart w:id="44" w:name="_Toc58851120"/>
+      <w:bookmarkEnd w:id="37"/>
       <w:r>
         <w:t>Tabs</w:t>
       </w:r>
-      <w:bookmarkEnd w:id="43"/>
+      <w:bookmarkEnd w:id="44"/>
     </w:p>
     <w:p>
       <w:r>
@@ -6901,11 +7361,11 @@
       <w:pPr>
         <w:pStyle w:val="Heading2"/>
       </w:pPr>
-      <w:bookmarkStart w:id="44" w:name="_Ref76228532"/>
+      <w:bookmarkStart w:id="45" w:name="_Ref76228532"/>
       <w:r>
         <w:t>UI Data Selection</w:t>
       </w:r>
-      <w:bookmarkEnd w:id="44"/>
+      <w:bookmarkEnd w:id="45"/>
     </w:p>
     <w:p>
       <w:r>
@@ -7008,7 +7468,7 @@
           <w:noProof/>
         </w:rPr>
         <w:drawing>
-          <wp:anchor distT="0" distB="0" distL="114300" distR="114300" simplePos="0" relativeHeight="251676672" behindDoc="0" locked="0" layoutInCell="1" allowOverlap="1" wp14:anchorId="2587ECEA" wp14:editId="584E5E21">
+          <wp:anchor distT="0" distB="0" distL="114300" distR="114300" simplePos="0" relativeHeight="251676672" behindDoc="0" locked="0" layoutInCell="1" allowOverlap="1" wp14:anchorId="2587ECEA" wp14:editId="779C4EDC">
             <wp:simplePos x="0" y="0"/>
             <wp:positionH relativeFrom="column">
               <wp:posOffset>-52387</wp:posOffset>
@@ -7116,7 +7576,23 @@
           <w:sz w:val="18"/>
           <w:szCs w:val="18"/>
         </w:rPr>
-        <w:t>Linear; Log; Relative (V-V(x=0)); Scaled (V/V(x=0)); Normalised; Normalised (=ve); Differences; Rolling mean.</w:t>
+        <w:t>Linear; Log; Relative (V-V(x=0)); Scaled (V/V(x=0)); Normalised; Normalised (=</w:t>
+      </w:r>
+      <w:proofErr w:type="spellStart"/>
+      <w:r>
+        <w:rPr>
+          <w:sz w:val="18"/>
+          <w:szCs w:val="18"/>
+        </w:rPr>
+        <w:t>ve</w:t>
+      </w:r>
+      <w:proofErr w:type="spellEnd"/>
+      <w:r>
+        <w:rPr>
+          <w:sz w:val="18"/>
+          <w:szCs w:val="18"/>
+        </w:rPr>
+        <w:t>); Differences; Rolling mean.</w:t>
       </w:r>
     </w:p>
     <w:p>
@@ -7133,7 +7609,7 @@
         </w:rPr>
         <w:lastRenderedPageBreak/>
         <w:drawing>
-          <wp:anchor distT="0" distB="0" distL="114300" distR="114300" simplePos="0" relativeHeight="251677696" behindDoc="0" locked="0" layoutInCell="1" allowOverlap="1" wp14:anchorId="583032D6" wp14:editId="48B81019">
+          <wp:anchor distT="0" distB="0" distL="114300" distR="114300" simplePos="0" relativeHeight="251677696" behindDoc="0" locked="0" layoutInCell="1" allowOverlap="1" wp14:anchorId="583032D6" wp14:editId="4BF10010">
             <wp:simplePos x="0" y="0"/>
             <wp:positionH relativeFrom="column">
               <wp:posOffset>-71755</wp:posOffset>
@@ -7223,10 +7699,10 @@
     </w:p>
     <w:p/>
     <w:p/>
-    <w:bookmarkEnd w:id="38"/>
+    <w:bookmarkEnd w:id="39"/>
     <w:p/>
     <w:p>
-      <w:bookmarkStart w:id="45" w:name="_Hlk77155695"/>
+      <w:bookmarkStart w:id="46" w:name="_Hlk77155695"/>
       <w:r>
         <w:rPr>
           <w:b/>
@@ -7234,7 +7710,7 @@
           <w:noProof/>
         </w:rPr>
         <w:drawing>
-          <wp:anchor distT="0" distB="0" distL="114300" distR="114300" simplePos="0" relativeHeight="251678720" behindDoc="0" locked="0" layoutInCell="1" allowOverlap="1" wp14:anchorId="4BDD91EE" wp14:editId="49F7F67E">
+          <wp:anchor distT="0" distB="0" distL="114300" distR="114300" simplePos="0" relativeHeight="251678720" behindDoc="0" locked="0" layoutInCell="1" allowOverlap="1" wp14:anchorId="4BDD91EE" wp14:editId="2D8E6CCF">
             <wp:simplePos x="0" y="0"/>
             <wp:positionH relativeFrom="margin">
               <wp:posOffset>-635</wp:posOffset>
@@ -7428,12 +7904,20 @@
         <w:t xml:space="preserve">Note where a variable is being selected as one property and a dimension as a second property, any sub-selection of range must be consistent in the two selections. This is done to allow variables and dimensions to be used as flexibly as possible. </w:t>
       </w:r>
       <w:bookmarkEnd w:id="1"/>
-      <w:bookmarkEnd w:id="45"/>
-    </w:p>
-    <w:p>
-      <w:bookmarkStart w:id="46" w:name="_Hlk158306680"/>
-      <w:r>
-        <w:t>The UI treats any form of text data (char, string, cellstr, categorical, etc) as a list. To do this any variable of these data types uses categories derived by making the list categorical. The range is then based on the order of the categories, selecting all values between the selected end members. To change the order, modify the data type to categorical and order the categories (see</w:t>
+      <w:bookmarkEnd w:id="46"/>
+    </w:p>
+    <w:p>
+      <w:bookmarkStart w:id="47" w:name="_Hlk158306680"/>
+      <w:r>
+        <w:t xml:space="preserve">The UI treats any form of text data (char, string, </w:t>
+      </w:r>
+      <w:proofErr w:type="spellStart"/>
+      <w:r>
+        <w:t>cellstr</w:t>
+      </w:r>
+      <w:proofErr w:type="spellEnd"/>
+      <w:r>
+        <w:t>, categorical, etc) as a list. To do this any variable of these data types uses categories derived by making the list categorical. The range is then based on the order of the categories, selecting all values between the selected end members. To change the order, modify the data type to categorical and order the categories (see</w:t>
       </w:r>
       <w:r>
         <w:rPr>
@@ -7547,22 +8031,58 @@
           <w:sz w:val="20"/>
           <w:szCs w:val="20"/>
         </w:rPr>
-        <w:t xml:space="preserve">&gt;&gt; myapp = &lt;AppName&gt;; </w:t>
-      </w:r>
+        <w:t xml:space="preserve">&gt;&gt; </w:t>
+      </w:r>
+      <w:proofErr w:type="spellStart"/>
       <w:r>
         <w:rPr>
           <w:rFonts w:ascii="Arial" w:hAnsi="Arial" w:cs="Arial"/>
           <w:sz w:val="20"/>
           <w:szCs w:val="20"/>
         </w:rPr>
-        <w:tab/>
-      </w:r>
+        <w:t>myapp</w:t>
+      </w:r>
+      <w:proofErr w:type="spellEnd"/>
       <w:r>
         <w:rPr>
           <w:rFonts w:ascii="Arial" w:hAnsi="Arial" w:cs="Arial"/>
           <w:sz w:val="20"/>
           <w:szCs w:val="20"/>
         </w:rPr>
+        <w:t xml:space="preserve"> = &lt;</w:t>
+      </w:r>
+      <w:proofErr w:type="spellStart"/>
+      <w:r>
+        <w:rPr>
+          <w:rFonts w:ascii="Arial" w:hAnsi="Arial" w:cs="Arial"/>
+          <w:sz w:val="20"/>
+          <w:szCs w:val="20"/>
+        </w:rPr>
+        <w:t>AppName</w:t>
+      </w:r>
+      <w:proofErr w:type="spellEnd"/>
+      <w:r>
+        <w:rPr>
+          <w:rFonts w:ascii="Arial" w:hAnsi="Arial" w:cs="Arial"/>
+          <w:sz w:val="20"/>
+          <w:szCs w:val="20"/>
+        </w:rPr>
+        <w:t xml:space="preserve">&gt;; </w:t>
+      </w:r>
+      <w:r>
+        <w:rPr>
+          <w:rFonts w:ascii="Arial" w:hAnsi="Arial" w:cs="Arial"/>
+          <w:sz w:val="20"/>
+          <w:szCs w:val="20"/>
+        </w:rPr>
+        <w:tab/>
+      </w:r>
+      <w:r>
+        <w:rPr>
+          <w:rFonts w:ascii="Arial" w:hAnsi="Arial" w:cs="Arial"/>
+          <w:sz w:val="20"/>
+          <w:szCs w:val="20"/>
+        </w:rPr>
         <w:tab/>
       </w:r>
       <w:r>
@@ -7601,8 +8121,18 @@
           <w:sz w:val="20"/>
           <w:szCs w:val="20"/>
         </w:rPr>
-        <w:t>&gt;&gt; myapp</w:t>
-      </w:r>
+        <w:t xml:space="preserve">&gt;&gt; </w:t>
+      </w:r>
+      <w:proofErr w:type="spellStart"/>
+      <w:r>
+        <w:rPr>
+          <w:rFonts w:ascii="Arial" w:hAnsi="Arial" w:cs="Arial"/>
+          <w:sz w:val="20"/>
+          <w:szCs w:val="20"/>
+        </w:rPr>
+        <w:t>myapp</w:t>
+      </w:r>
+      <w:proofErr w:type="spellEnd"/>
     </w:p>
     <w:p>
       <w:r>
@@ -7635,12 +8165,21 @@
                 <w:szCs w:val="18"/>
               </w:rPr>
             </w:pPr>
+            <w:proofErr w:type="spellStart"/>
             <w:r>
               <w:rPr>
                 <w:sz w:val="18"/>
                 <w:szCs w:val="18"/>
               </w:rPr>
-              <w:t xml:space="preserve">myapp = </w:t>
+              <w:t>myapp</w:t>
+            </w:r>
+            <w:proofErr w:type="spellEnd"/>
+            <w:r>
+              <w:rPr>
+                <w:sz w:val="18"/>
+                <w:szCs w:val="18"/>
+              </w:rPr>
+              <w:t xml:space="preserve"> = </w:t>
             </w:r>
           </w:p>
           <w:p>
@@ -7656,7 +8195,23 @@
                 <w:sz w:val="18"/>
                 <w:szCs w:val="18"/>
               </w:rPr>
-              <w:t xml:space="preserve">  &lt;AppName&gt; with properties:</w:t>
+              <w:t xml:space="preserve">  &lt;</w:t>
+            </w:r>
+            <w:proofErr w:type="spellStart"/>
+            <w:r>
+              <w:rPr>
+                <w:sz w:val="18"/>
+                <w:szCs w:val="18"/>
+              </w:rPr>
+              <w:t>AppName</w:t>
+            </w:r>
+            <w:proofErr w:type="spellEnd"/>
+            <w:r>
+              <w:rPr>
+                <w:sz w:val="18"/>
+                <w:szCs w:val="18"/>
+              </w:rPr>
+              <w:t>&gt; with properties:</w:t>
             </w:r>
           </w:p>
         </w:tc>
@@ -7765,7 +8320,23 @@
                 <w:sz w:val="18"/>
                 <w:szCs w:val="18"/>
               </w:rPr>
-              <w:t>[1×1 muiCatalogue]</w:t>
+              <w:t xml:space="preserve">[1×1 </w:t>
+            </w:r>
+            <w:proofErr w:type="spellStart"/>
+            <w:r>
+              <w:rPr>
+                <w:sz w:val="18"/>
+                <w:szCs w:val="18"/>
+              </w:rPr>
+              <w:t>muiCatalogue</w:t>
+            </w:r>
+            <w:proofErr w:type="spellEnd"/>
+            <w:r>
+              <w:rPr>
+                <w:sz w:val="18"/>
+                <w:szCs w:val="18"/>
+              </w:rPr>
+              <w:t>]</w:t>
             </w:r>
           </w:p>
         </w:tc>
@@ -7774,8 +8345,21 @@
             <w:tcW w:w="6230" w:type="dxa"/>
           </w:tcPr>
           <w:p>
-            <w:r>
-              <w:t>muiCatalogue class with properties DataSets and Catalogue. The former holds the data</w:t>
+            <w:proofErr w:type="spellStart"/>
+            <w:r>
+              <w:t>muiCatalogue</w:t>
+            </w:r>
+            <w:proofErr w:type="spellEnd"/>
+            <w:r>
+              <w:t xml:space="preserve"> class with properties </w:t>
+            </w:r>
+            <w:proofErr w:type="spellStart"/>
+            <w:r>
+              <w:t>DataSets</w:t>
+            </w:r>
+            <w:proofErr w:type="spellEnd"/>
+            <w:r>
+              <w:t xml:space="preserve"> and Catalogue. The former holds the data</w:t>
             </w:r>
             <w:r>
               <w:t>,</w:t>
@@ -7818,7 +8402,23 @@
                 <w:sz w:val="18"/>
                 <w:szCs w:val="18"/>
               </w:rPr>
-              <w:t xml:space="preserve"> [1×1 muiProject]</w:t>
+              <w:t xml:space="preserve"> [1×1 </w:t>
+            </w:r>
+            <w:proofErr w:type="spellStart"/>
+            <w:r>
+              <w:rPr>
+                <w:sz w:val="18"/>
+                <w:szCs w:val="18"/>
+              </w:rPr>
+              <w:t>muiProject</w:t>
+            </w:r>
+            <w:proofErr w:type="spellEnd"/>
+            <w:r>
+              <w:rPr>
+                <w:sz w:val="18"/>
+                <w:szCs w:val="18"/>
+              </w:rPr>
+              <w:t>]</w:t>
             </w:r>
           </w:p>
         </w:tc>
@@ -7827,8 +8427,13 @@
             <w:tcW w:w="6230" w:type="dxa"/>
           </w:tcPr>
           <w:p>
-            <w:r>
-              <w:t>muiProject class with current project information such as file and path name.</w:t>
+            <w:proofErr w:type="spellStart"/>
+            <w:r>
+              <w:t>muiProject</w:t>
+            </w:r>
+            <w:proofErr w:type="spellEnd"/>
+            <w:r>
+              <w:t xml:space="preserve"> class with current project information such as file and path name.</w:t>
             </w:r>
           </w:p>
         </w:tc>
@@ -7851,7 +8456,23 @@
                 <w:sz w:val="18"/>
                 <w:szCs w:val="18"/>
               </w:rPr>
-              <w:t>Constants: [1×1 muiConstants]</w:t>
+              <w:t xml:space="preserve">Constants: [1×1 </w:t>
+            </w:r>
+            <w:proofErr w:type="spellStart"/>
+            <w:r>
+              <w:rPr>
+                <w:sz w:val="18"/>
+                <w:szCs w:val="18"/>
+              </w:rPr>
+              <w:t>muiConstants</w:t>
+            </w:r>
+            <w:proofErr w:type="spellEnd"/>
+            <w:r>
+              <w:rPr>
+                <w:sz w:val="18"/>
+                <w:szCs w:val="18"/>
+              </w:rPr>
+              <w:t>]</w:t>
             </w:r>
           </w:p>
         </w:tc>
@@ -7860,8 +8481,13 @@
             <w:tcW w:w="6230" w:type="dxa"/>
           </w:tcPr>
           <w:p>
-            <w:r>
-              <w:t>muiConstants class with generic model properties (e.g. gravity, etc).</w:t>
+            <w:proofErr w:type="spellStart"/>
+            <w:r>
+              <w:t>muiConstants</w:t>
+            </w:r>
+            <w:proofErr w:type="spellEnd"/>
+            <w:r>
+              <w:t xml:space="preserve"> class with generic model properties (e.g. gravity, etc).</w:t>
             </w:r>
           </w:p>
         </w:tc>
@@ -7887,7 +8513,43 @@
           <w:sz w:val="20"/>
           <w:szCs w:val="20"/>
         </w:rPr>
-        <w:t>&gt;&gt; myapp.Inputs.&lt;InputClassName&gt;</w:t>
+        <w:t xml:space="preserve">&gt;&gt; </w:t>
+      </w:r>
+      <w:proofErr w:type="spellStart"/>
+      <w:r>
+        <w:rPr>
+          <w:rFonts w:ascii="Arial" w:hAnsi="Arial" w:cs="Arial"/>
+          <w:sz w:val="20"/>
+          <w:szCs w:val="20"/>
+        </w:rPr>
+        <w:t>myapp.Inputs</w:t>
+      </w:r>
+      <w:proofErr w:type="spellEnd"/>
+      <w:r>
+        <w:rPr>
+          <w:rFonts w:ascii="Arial" w:hAnsi="Arial" w:cs="Arial"/>
+          <w:sz w:val="20"/>
+          <w:szCs w:val="20"/>
+        </w:rPr>
+        <w:t>.&lt;</w:t>
+      </w:r>
+      <w:proofErr w:type="spellStart"/>
+      <w:r>
+        <w:rPr>
+          <w:rFonts w:ascii="Arial" w:hAnsi="Arial" w:cs="Arial"/>
+          <w:sz w:val="20"/>
+          <w:szCs w:val="20"/>
+        </w:rPr>
+        <w:t>InputClassName</w:t>
+      </w:r>
+      <w:proofErr w:type="spellEnd"/>
+      <w:r>
+        <w:rPr>
+          <w:rFonts w:ascii="Arial" w:hAnsi="Arial" w:cs="Arial"/>
+          <w:sz w:val="20"/>
+          <w:szCs w:val="20"/>
+        </w:rPr>
+        <w:t>&gt;</w:t>
       </w:r>
     </w:p>
     <w:p>
@@ -7911,53 +8573,99 @@
           <w:szCs w:val="20"/>
         </w:rPr>
       </w:pPr>
-      <w:bookmarkStart w:id="47" w:name="_Hlk158305656"/>
+      <w:bookmarkStart w:id="48" w:name="_Hlk158305656"/>
       <w:r>
         <w:rPr>
           <w:rFonts w:ascii="Arial" w:eastAsia="Microsoft YaHei" w:hAnsi="Arial" w:cs="Arial"/>
           <w:sz w:val="20"/>
           <w:szCs w:val="20"/>
         </w:rPr>
-        <w:t>&gt;&gt; myapp.Cases.</w:t>
-      </w:r>
-      <w:bookmarkEnd w:id="47"/>
+        <w:t xml:space="preserve">&gt;&gt; </w:t>
+      </w:r>
+      <w:proofErr w:type="spellStart"/>
       <w:r>
         <w:rPr>
           <w:rFonts w:ascii="Arial" w:eastAsia="Microsoft YaHei" w:hAnsi="Arial" w:cs="Arial"/>
           <w:sz w:val="20"/>
           <w:szCs w:val="20"/>
         </w:rPr>
-        <w:t>Catalogue</w:t>
-      </w:r>
-    </w:p>
-    <w:p>
-      <w:pPr>
-        <w:rPr>
-          <w:rFonts w:ascii="Times New Roman" w:eastAsia="Microsoft YaHei" w:hAnsi="Times New Roman" w:cs="Times New Roman"/>
-        </w:rPr>
-      </w:pPr>
-      <w:r>
-        <w:rPr>
-          <w:rFonts w:ascii="Times New Roman" w:eastAsia="Microsoft YaHei" w:hAnsi="Times New Roman" w:cs="Times New Roman"/>
-        </w:rPr>
-        <w:t>To access imported or model data sets, use:</w:t>
-      </w:r>
-    </w:p>
-    <w:p>
-      <w:pPr>
+        <w:t>myapp.Cases.</w:t>
+      </w:r>
+      <w:bookmarkEnd w:id="48"/>
+      <w:r>
         <w:rPr>
           <w:rFonts w:ascii="Arial" w:eastAsia="Microsoft YaHei" w:hAnsi="Arial" w:cs="Arial"/>
           <w:sz w:val="20"/>
           <w:szCs w:val="20"/>
         </w:rPr>
-      </w:pPr>
-      <w:r>
+        <w:t>Catalogue</w:t>
+      </w:r>
+      <w:proofErr w:type="spellEnd"/>
+    </w:p>
+    <w:p>
+      <w:pPr>
+        <w:rPr>
+          <w:rFonts w:ascii="Times New Roman" w:eastAsia="Microsoft YaHei" w:hAnsi="Times New Roman" w:cs="Times New Roman"/>
+        </w:rPr>
+      </w:pPr>
+      <w:r>
+        <w:rPr>
+          <w:rFonts w:ascii="Times New Roman" w:eastAsia="Microsoft YaHei" w:hAnsi="Times New Roman" w:cs="Times New Roman"/>
+        </w:rPr>
+        <w:t>To access imported or model data sets, use:</w:t>
+      </w:r>
+    </w:p>
+    <w:p>
+      <w:pPr>
         <w:rPr>
           <w:rFonts w:ascii="Arial" w:eastAsia="Microsoft YaHei" w:hAnsi="Arial" w:cs="Arial"/>
           <w:sz w:val="20"/>
           <w:szCs w:val="20"/>
         </w:rPr>
-        <w:t>&gt;&gt; myapp.Cases.DataSets.&lt;DataClassName&gt;</w:t>
+      </w:pPr>
+      <w:r>
+        <w:rPr>
+          <w:rFonts w:ascii="Arial" w:eastAsia="Microsoft YaHei" w:hAnsi="Arial" w:cs="Arial"/>
+          <w:sz w:val="20"/>
+          <w:szCs w:val="20"/>
+        </w:rPr>
+        <w:t xml:space="preserve">&gt;&gt; </w:t>
+      </w:r>
+      <w:proofErr w:type="spellStart"/>
+      <w:r>
+        <w:rPr>
+          <w:rFonts w:ascii="Arial" w:eastAsia="Microsoft YaHei" w:hAnsi="Arial" w:cs="Arial"/>
+          <w:sz w:val="20"/>
+          <w:szCs w:val="20"/>
+        </w:rPr>
+        <w:t>myapp.Cases.DataSets</w:t>
+      </w:r>
+      <w:proofErr w:type="spellEnd"/>
+      <w:r>
+        <w:rPr>
+          <w:rFonts w:ascii="Arial" w:eastAsia="Microsoft YaHei" w:hAnsi="Arial" w:cs="Arial"/>
+          <w:sz w:val="20"/>
+          <w:szCs w:val="20"/>
+        </w:rPr>
+        <w:t>.&lt;</w:t>
+      </w:r>
+      <w:proofErr w:type="spellStart"/>
+      <w:r>
+        <w:rPr>
+          <w:rFonts w:ascii="Arial" w:eastAsia="Microsoft YaHei" w:hAnsi="Arial" w:cs="Arial"/>
+          <w:sz w:val="20"/>
+          <w:szCs w:val="20"/>
+        </w:rPr>
+        <w:t>DataClassName</w:t>
+      </w:r>
+      <w:proofErr w:type="spellEnd"/>
+      <w:r>
+        <w:rPr>
+          <w:rFonts w:ascii="Arial" w:eastAsia="Microsoft YaHei" w:hAnsi="Arial" w:cs="Arial"/>
+          <w:sz w:val="20"/>
+          <w:szCs w:val="20"/>
+        </w:rPr>
+        <w:t>&gt;</w:t>
       </w:r>
     </w:p>
     <w:p>
@@ -7970,7 +8678,35 @@
         <w:rPr>
           <w:rFonts w:ascii="Times New Roman" w:eastAsia="Microsoft YaHei" w:hAnsi="Times New Roman" w:cs="Times New Roman"/>
         </w:rPr>
-        <w:t>If there are more than one instance of the model output, it is necessary to specify an index. This then provides access to all the properties held by that data set. Two of these may be of particular interest, RunParam and Data. The former holds the input parameters used for that specific model run. RunParam is a struct with fields that are the class names required to run the model (similar to Inputs above). The Data property is a model specific st</w:t>
+        <w:t xml:space="preserve">If there are more than one instance of the model output, it is necessary to specify an index. This then provides access to all the properties held by that data set. Two of these may be of particular interest, </w:t>
+      </w:r>
+      <w:proofErr w:type="spellStart"/>
+      <w:r>
+        <w:rPr>
+          <w:rFonts w:ascii="Times New Roman" w:eastAsia="Microsoft YaHei" w:hAnsi="Times New Roman" w:cs="Times New Roman"/>
+        </w:rPr>
+        <w:t>RunParam</w:t>
+      </w:r>
+      <w:proofErr w:type="spellEnd"/>
+      <w:r>
+        <w:rPr>
+          <w:rFonts w:ascii="Times New Roman" w:eastAsia="Microsoft YaHei" w:hAnsi="Times New Roman" w:cs="Times New Roman"/>
+        </w:rPr>
+        <w:t xml:space="preserve"> and Data. The former holds the input parameters used for that specific model run. </w:t>
+      </w:r>
+      <w:proofErr w:type="spellStart"/>
+      <w:r>
+        <w:rPr>
+          <w:rFonts w:ascii="Times New Roman" w:eastAsia="Microsoft YaHei" w:hAnsi="Times New Roman" w:cs="Times New Roman"/>
+        </w:rPr>
+        <w:t>RunParam</w:t>
+      </w:r>
+      <w:proofErr w:type="spellEnd"/>
+      <w:r>
+        <w:rPr>
+          <w:rFonts w:ascii="Times New Roman" w:eastAsia="Microsoft YaHei" w:hAnsi="Times New Roman" w:cs="Times New Roman"/>
+        </w:rPr>
+        <w:t xml:space="preserve"> is a struct with fields that are the class names required to run the model (similar to Inputs above). The Data property is a model specific st</w:t>
       </w:r>
       <w:r>
         <w:rPr>
@@ -7990,8 +8726,18 @@
           <w:i/>
           <w:iCs/>
         </w:rPr>
-        <w:t xml:space="preserve"> dstable</w:t>
-      </w:r>
+        <w:t xml:space="preserve"> </w:t>
+      </w:r>
+      <w:proofErr w:type="spellStart"/>
+      <w:r>
+        <w:rPr>
+          <w:rFonts w:ascii="Times New Roman" w:eastAsia="Microsoft YaHei" w:hAnsi="Times New Roman" w:cs="Times New Roman"/>
+          <w:i/>
+          <w:iCs/>
+        </w:rPr>
+        <w:t>dstable</w:t>
+      </w:r>
+      <w:proofErr w:type="spellEnd"/>
       <w:r>
         <w:rPr>
           <w:rFonts w:ascii="Times New Roman" w:eastAsia="Microsoft YaHei" w:hAnsi="Times New Roman" w:cs="Times New Roman"/>
@@ -8007,39 +8753,120 @@
           <w:szCs w:val="20"/>
         </w:rPr>
       </w:pPr>
-      <w:bookmarkStart w:id="48" w:name="_Hlk158306562"/>
+      <w:bookmarkStart w:id="49" w:name="_Hlk158306562"/>
       <w:r>
         <w:rPr>
           <w:rFonts w:ascii="Arial" w:eastAsia="Microsoft YaHei" w:hAnsi="Arial" w:cs="Arial"/>
           <w:sz w:val="20"/>
           <w:szCs w:val="20"/>
         </w:rPr>
-        <w:t>&gt;&gt; myapp.Cases.DataSets.&lt;DataClassName&gt;(idx).Data.Dataset</w:t>
-      </w:r>
-    </w:p>
-    <w:bookmarkEnd w:id="48"/>
-    <w:p>
-      <w:pPr>
+        <w:t xml:space="preserve">&gt;&gt; </w:t>
+      </w:r>
+      <w:proofErr w:type="spellStart"/>
+      <w:r>
         <w:rPr>
           <w:rFonts w:ascii="Arial" w:eastAsia="Microsoft YaHei" w:hAnsi="Arial" w:cs="Arial"/>
           <w:sz w:val="20"/>
           <w:szCs w:val="20"/>
         </w:rPr>
-      </w:pPr>
+        <w:t>myapp.Cases.DataSets</w:t>
+      </w:r>
+      <w:proofErr w:type="spellEnd"/>
       <w:r>
         <w:rPr>
           <w:rFonts w:ascii="Arial" w:eastAsia="Microsoft YaHei" w:hAnsi="Arial" w:cs="Arial"/>
           <w:sz w:val="20"/>
           <w:szCs w:val="20"/>
         </w:rPr>
+        <w:t>.&lt;</w:t>
+      </w:r>
+      <w:proofErr w:type="spellStart"/>
+      <w:r>
+        <w:rPr>
+          <w:rFonts w:ascii="Arial" w:eastAsia="Microsoft YaHei" w:hAnsi="Arial" w:cs="Arial"/>
+          <w:sz w:val="20"/>
+          <w:szCs w:val="20"/>
+        </w:rPr>
+        <w:t>DataClassName</w:t>
+      </w:r>
+      <w:proofErr w:type="spellEnd"/>
+      <w:r>
+        <w:rPr>
+          <w:rFonts w:ascii="Arial" w:eastAsia="Microsoft YaHei" w:hAnsi="Arial" w:cs="Arial"/>
+          <w:sz w:val="20"/>
+          <w:szCs w:val="20"/>
+        </w:rPr>
+        <w:t>&gt;(</w:t>
+      </w:r>
+      <w:proofErr w:type="spellStart"/>
+      <w:r>
+        <w:rPr>
+          <w:rFonts w:ascii="Arial" w:eastAsia="Microsoft YaHei" w:hAnsi="Arial" w:cs="Arial"/>
+          <w:sz w:val="20"/>
+          <w:szCs w:val="20"/>
+        </w:rPr>
+        <w:t>idx</w:t>
+      </w:r>
+      <w:proofErr w:type="spellEnd"/>
+      <w:r>
+        <w:rPr>
+          <w:rFonts w:ascii="Arial" w:eastAsia="Microsoft YaHei" w:hAnsi="Arial" w:cs="Arial"/>
+          <w:sz w:val="20"/>
+          <w:szCs w:val="20"/>
+        </w:rPr>
+        <w:t>).</w:t>
+      </w:r>
+      <w:proofErr w:type="spellStart"/>
+      <w:r>
+        <w:rPr>
+          <w:rFonts w:ascii="Arial" w:eastAsia="Microsoft YaHei" w:hAnsi="Arial" w:cs="Arial"/>
+          <w:sz w:val="20"/>
+          <w:szCs w:val="20"/>
+        </w:rPr>
+        <w:t>Data.Dataset</w:t>
+      </w:r>
+      <w:proofErr w:type="spellEnd"/>
+    </w:p>
+    <w:bookmarkEnd w:id="49"/>
+    <w:p>
+      <w:pPr>
+        <w:rPr>
+          <w:rFonts w:ascii="Arial" w:eastAsia="Microsoft YaHei" w:hAnsi="Arial" w:cs="Arial"/>
+          <w:sz w:val="20"/>
+          <w:szCs w:val="20"/>
+        </w:rPr>
+      </w:pPr>
+      <w:r>
+        <w:rPr>
+          <w:rFonts w:ascii="Arial" w:eastAsia="Microsoft YaHei" w:hAnsi="Arial" w:cs="Arial"/>
+          <w:sz w:val="20"/>
+          <w:szCs w:val="20"/>
+        </w:rPr>
         <w:t>&gt;&gt; myapp.Cases.DataSets.&lt;DataClassName&gt;(idx).Data.&lt;ModelSpecificName&gt;</w:t>
       </w:r>
     </w:p>
     <w:p>
-      <w:bookmarkStart w:id="49" w:name="_Hlk183338851"/>
-      <w:r>
-        <w:t>where idx is the index of the class instance (e.g. if there are multiple model runs need to select which one. The Catalogue defines the case record (</w:t>
-      </w:r>
+      <w:bookmarkStart w:id="50" w:name="_Hlk183338851"/>
+      <w:r>
+        <w:t xml:space="preserve">where </w:t>
+      </w:r>
+      <w:proofErr w:type="spellStart"/>
+      <w:r>
+        <w:t>idx</w:t>
+      </w:r>
+      <w:proofErr w:type="spellEnd"/>
+      <w:r>
+        <w:t xml:space="preserve"> is the index of the class instance (e.g. if there are multiple </w:t>
+      </w:r>
+      <w:proofErr w:type="gramStart"/>
+      <w:r>
+        <w:t>model</w:t>
+      </w:r>
+      <w:proofErr w:type="gramEnd"/>
+      <w:r>
+        <w:t xml:space="preserve"> runs need to select which one. The Catalogue defines the case record (</w:t>
+      </w:r>
+      <w:proofErr w:type="spellStart"/>
       <w:r>
         <w:rPr>
           <w:i/>
@@ -8047,6 +8874,7 @@
         </w:rPr>
         <w:t>caserec</w:t>
       </w:r>
+      <w:proofErr w:type="spellEnd"/>
       <w:r>
         <w:rPr>
           <w:i/>
@@ -8063,6 +8891,7 @@
       <w:r>
         <w:t>case index (</w:t>
       </w:r>
+      <w:proofErr w:type="spellStart"/>
       <w:r>
         <w:rPr>
           <w:i/>
@@ -8070,6 +8899,7 @@
         </w:rPr>
         <w:t>caseid</w:t>
       </w:r>
+      <w:proofErr w:type="spellEnd"/>
       <w:r>
         <w:t xml:space="preserve"> – a unique case index). [Note</w:t>
       </w:r>
@@ -8077,8 +8907,33 @@
         <w:t>:</w:t>
       </w:r>
       <w:r>
-        <w:t xml:space="preserve"> the muiCatalogue class functions caseRec and caseID allow one to be obtained from the other. The </w:t>
-      </w:r>
+        <w:t xml:space="preserve"> the </w:t>
+      </w:r>
+      <w:proofErr w:type="spellStart"/>
+      <w:r>
+        <w:t>muiCatalogue</w:t>
+      </w:r>
+      <w:proofErr w:type="spellEnd"/>
+      <w:r>
+        <w:t xml:space="preserve"> class functions </w:t>
+      </w:r>
+      <w:proofErr w:type="spellStart"/>
+      <w:r>
+        <w:t>caseRec</w:t>
+      </w:r>
+      <w:proofErr w:type="spellEnd"/>
+      <w:r>
+        <w:t xml:space="preserve"> and </w:t>
+      </w:r>
+      <w:proofErr w:type="spellStart"/>
+      <w:r>
+        <w:t>caseID</w:t>
+      </w:r>
+      <w:proofErr w:type="spellEnd"/>
+      <w:r>
+        <w:t xml:space="preserve"> allow one to be obtained from the other. The </w:t>
+      </w:r>
+      <w:proofErr w:type="spellStart"/>
       <w:r>
         <w:rPr>
           <w:i/>
@@ -8086,9 +8941,11 @@
         </w:rPr>
         <w:t>caseid</w:t>
       </w:r>
+      <w:proofErr w:type="spellEnd"/>
       <w:r>
         <w:t xml:space="preserve"> is saved in the Property </w:t>
       </w:r>
+      <w:proofErr w:type="spellStart"/>
       <w:r>
         <w:rPr>
           <w:i/>
@@ -8096,12 +8953,27 @@
         </w:rPr>
         <w:t>CaseIndex</w:t>
       </w:r>
-      <w:r>
-        <w:t xml:space="preserve"> for classes that use the abstract class muiDataSet</w:t>
-      </w:r>
-      <w:r>
-        <w:t xml:space="preserve">. The muiCatalogue method </w:t>
-      </w:r>
+      <w:proofErr w:type="spellEnd"/>
+      <w:r>
+        <w:t xml:space="preserve"> for classes that use the abstract class </w:t>
+      </w:r>
+      <w:proofErr w:type="spellStart"/>
+      <w:r>
+        <w:t>muiDataSet</w:t>
+      </w:r>
+      <w:proofErr w:type="spellEnd"/>
+      <w:r>
+        <w:t xml:space="preserve">. The </w:t>
+      </w:r>
+      <w:proofErr w:type="spellStart"/>
+      <w:r>
+        <w:t>muiCatalogue</w:t>
+      </w:r>
+      <w:proofErr w:type="spellEnd"/>
+      <w:r>
+        <w:t xml:space="preserve"> method </w:t>
+      </w:r>
+      <w:proofErr w:type="spellStart"/>
       <w:r>
         <w:t>class</w:t>
       </w:r>
@@ -8109,28 +8981,87 @@
         <w:t>R</w:t>
       </w:r>
       <w:r>
-        <w:t xml:space="preserve">ec </w:t>
-      </w:r>
-      <w:r>
-        <w:t xml:space="preserve">can be used to obtain the classrec index i.e., </w:t>
-      </w:r>
-      <w:r>
-        <w:t>classrec = classRec(muicat,</w:t>
-      </w:r>
+        <w:t>ec</w:t>
+      </w:r>
+      <w:proofErr w:type="spellEnd"/>
       <w:r>
         <w:t xml:space="preserve"> </w:t>
       </w:r>
       <w:r>
-        <w:t>caserec);</w:t>
-      </w:r>
-      <w:r>
-        <w:t xml:space="preserve"> where muicat is the myapp.Cases instance of the muiCatalogue</w:t>
-      </w:r>
+        <w:t xml:space="preserve">can be used to obtain the </w:t>
+      </w:r>
+      <w:proofErr w:type="spellStart"/>
+      <w:r>
+        <w:t>classrec</w:t>
+      </w:r>
+      <w:proofErr w:type="spellEnd"/>
+      <w:r>
+        <w:t xml:space="preserve"> index i.e., </w:t>
+      </w:r>
+      <w:proofErr w:type="spellStart"/>
+      <w:r>
+        <w:t>classrec</w:t>
+      </w:r>
+      <w:proofErr w:type="spellEnd"/>
+      <w:r>
+        <w:t xml:space="preserve"> = </w:t>
+      </w:r>
+      <w:proofErr w:type="spellStart"/>
+      <w:r>
+        <w:t>classRec</w:t>
+      </w:r>
+      <w:proofErr w:type="spellEnd"/>
+      <w:r>
+        <w:t>(</w:t>
+      </w:r>
+      <w:proofErr w:type="spellStart"/>
+      <w:r>
+        <w:t>muicat</w:t>
+      </w:r>
+      <w:proofErr w:type="spellEnd"/>
+      <w:r>
+        <w:t>,</w:t>
+      </w:r>
+      <w:r>
+        <w:t xml:space="preserve"> </w:t>
+      </w:r>
+      <w:proofErr w:type="spellStart"/>
+      <w:r>
+        <w:t>caserec</w:t>
+      </w:r>
+      <w:proofErr w:type="spellEnd"/>
+      <w:r>
+        <w:t>);</w:t>
+      </w:r>
+      <w:r>
+        <w:t xml:space="preserve"> where </w:t>
+      </w:r>
+      <w:proofErr w:type="spellStart"/>
+      <w:r>
+        <w:t>muicat</w:t>
+      </w:r>
+      <w:proofErr w:type="spellEnd"/>
+      <w:r>
+        <w:t xml:space="preserve"> is the </w:t>
+      </w:r>
+      <w:proofErr w:type="spellStart"/>
+      <w:r>
+        <w:t>myapp.Cases</w:t>
+      </w:r>
+      <w:proofErr w:type="spellEnd"/>
+      <w:r>
+        <w:t xml:space="preserve"> instance of the </w:t>
+      </w:r>
+      <w:proofErr w:type="spellStart"/>
+      <w:r>
+        <w:t>muiCatalogue</w:t>
+      </w:r>
+      <w:proofErr w:type="spellEnd"/>
       <w:r>
         <w:t>].</w:t>
       </w:r>
     </w:p>
-    <w:bookmarkEnd w:id="49"/>
+    <w:bookmarkEnd w:id="50"/>
     <w:p>
       <w:pPr>
         <w:rPr>
@@ -8170,13 +9101,78 @@
           <w:sz w:val="20"/>
           <w:szCs w:val="20"/>
         </w:rPr>
-        <w:t>&gt;&gt; myapp.Cases.DataSets.&lt;DataClassName&gt;(idx).Data.Dataset.DataTable</w:t>
-      </w:r>
+        <w:t xml:space="preserve">&gt;&gt; </w:t>
+      </w:r>
+      <w:proofErr w:type="spellStart"/>
+      <w:r>
+        <w:rPr>
+          <w:rFonts w:ascii="Arial" w:eastAsia="Microsoft YaHei" w:hAnsi="Arial" w:cs="Arial"/>
+          <w:sz w:val="20"/>
+          <w:szCs w:val="20"/>
+        </w:rPr>
+        <w:t>myapp.Cases.DataSets</w:t>
+      </w:r>
+      <w:proofErr w:type="spellEnd"/>
+      <w:r>
+        <w:rPr>
+          <w:rFonts w:ascii="Arial" w:eastAsia="Microsoft YaHei" w:hAnsi="Arial" w:cs="Arial"/>
+          <w:sz w:val="20"/>
+          <w:szCs w:val="20"/>
+        </w:rPr>
+        <w:t>.&lt;</w:t>
+      </w:r>
+      <w:proofErr w:type="spellStart"/>
+      <w:r>
+        <w:rPr>
+          <w:rFonts w:ascii="Arial" w:eastAsia="Microsoft YaHei" w:hAnsi="Arial" w:cs="Arial"/>
+          <w:sz w:val="20"/>
+          <w:szCs w:val="20"/>
+        </w:rPr>
+        <w:t>DataClassName</w:t>
+      </w:r>
+      <w:proofErr w:type="spellEnd"/>
+      <w:r>
+        <w:rPr>
+          <w:rFonts w:ascii="Arial" w:eastAsia="Microsoft YaHei" w:hAnsi="Arial" w:cs="Arial"/>
+          <w:sz w:val="20"/>
+          <w:szCs w:val="20"/>
+        </w:rPr>
+        <w:t>&gt;(</w:t>
+      </w:r>
+      <w:proofErr w:type="spellStart"/>
+      <w:r>
+        <w:rPr>
+          <w:rFonts w:ascii="Arial" w:eastAsia="Microsoft YaHei" w:hAnsi="Arial" w:cs="Arial"/>
+          <w:sz w:val="20"/>
+          <w:szCs w:val="20"/>
+        </w:rPr>
+        <w:t>idx</w:t>
+      </w:r>
+      <w:proofErr w:type="spellEnd"/>
+      <w:r>
+        <w:rPr>
+          <w:rFonts w:ascii="Arial" w:eastAsia="Microsoft YaHei" w:hAnsi="Arial" w:cs="Arial"/>
+          <w:sz w:val="20"/>
+          <w:szCs w:val="20"/>
+        </w:rPr>
+        <w:t>).</w:t>
+      </w:r>
+      <w:proofErr w:type="spellStart"/>
+      <w:r>
+        <w:rPr>
+          <w:rFonts w:ascii="Arial" w:eastAsia="Microsoft YaHei" w:hAnsi="Arial" w:cs="Arial"/>
+          <w:sz w:val="20"/>
+          <w:szCs w:val="20"/>
+        </w:rPr>
+        <w:t>Data.Dataset.DataTable</w:t>
+      </w:r>
+      <w:proofErr w:type="spellEnd"/>
     </w:p>
     <w:p>
       <w:r>
         <w:t xml:space="preserve">The result can be assigned to new variables as required. Note that when assigning </w:t>
       </w:r>
+      <w:proofErr w:type="spellStart"/>
       <w:r>
         <w:rPr>
           <w:i/>
@@ -8184,11 +9180,12 @@
         </w:rPr>
         <w:t>dstables</w:t>
       </w:r>
+      <w:proofErr w:type="spellEnd"/>
       <w:r>
         <w:t xml:space="preserve"> it may be necessary to explicitly use the copy command to avoid creating a handle to the existing instance and potentially corrupting the existing data.</w:t>
       </w:r>
     </w:p>
-    <w:bookmarkEnd w:id="46"/>
+    <w:bookmarkEnd w:id="47"/>
     <w:p/>
     <w:p/>
     <w:p/>
@@ -9759,7 +10756,6 @@
   <w:style w:type="character" w:default="1" w:styleId="DefaultParagraphFont">
     <w:name w:val="Default Paragraph Font"/>
     <w:uiPriority w:val="1"/>
-    <w:semiHidden/>
     <w:unhideWhenUsed/>
   </w:style>
   <w:style w:type="table" w:default="1" w:styleId="TableNormal">

</xml_diff>

<commit_message>
Improve save method to be less memory intensive
Added SpecttalTransfer, WRM_WaveModel and get_transfer_coefficients. All moved from WaveRayModel to be accessible to other Apps.
> ctWaveSpectrum - rewrite option to save a spectrum and remove unpack functions as no longer needed.
Update template documentation
</commit_message>
<xml_diff>
--- a/muiAppDocs/Section templates/Sec3.0_App_Menus.docx
+++ b/muiAppDocs/Section templates/Sec3.0_App_Menus.docx
@@ -25,21 +25,12 @@
       <w:r>
         <w:t xml:space="preserve">s, model setup, running and plotting of the results. In addition, Tabs are used to display set-up information of the Cases that have been run. In this manual text in </w:t>
       </w:r>
-      <w:proofErr w:type="gramStart"/>
       <w:r>
         <w:rPr>
           <w:i/>
           <w:color w:val="7B2520" w:themeColor="accent3" w:themeShade="BF"/>
         </w:rPr>
-        <w:t>Red</w:t>
-      </w:r>
-      <w:proofErr w:type="gramEnd"/>
-      <w:r>
-        <w:rPr>
-          <w:i/>
-          <w:color w:val="7B2520" w:themeColor="accent3" w:themeShade="BF"/>
-        </w:rPr>
-        <w:t xml:space="preserve"> italic</w:t>
+        <w:t>Red italic</w:t>
       </w:r>
       <w:r>
         <w:rPr>
@@ -693,15 +684,7 @@
         <w:t>Project&gt;Cases&gt;Edit Data Set</w:t>
       </w:r>
       <w:r>
-        <w:t xml:space="preserve"> option to </w:t>
-      </w:r>
-      <w:proofErr w:type="gramStart"/>
-      <w:r>
-        <w:t>make a selection</w:t>
-      </w:r>
-      <w:proofErr w:type="gramEnd"/>
-      <w:r>
-        <w:t xml:space="preserve"> and then use the ‘Copy to Clipboard’ button to paste the selection to the clipboard.</w:t>
+        <w:t xml:space="preserve"> option to make a selection and then use the ‘Copy to Clipboard’ button to paste the selection to the clipboard.</w:t>
       </w:r>
     </w:p>
     <w:p/>
@@ -977,7 +960,7 @@
           <w:noProof/>
         </w:rPr>
         <w:drawing>
-          <wp:anchor distT="0" distB="0" distL="114300" distR="114300" simplePos="0" relativeHeight="251666432" behindDoc="0" locked="0" layoutInCell="1" allowOverlap="1" wp14:anchorId="703D27DE" wp14:editId="26206AE5">
+          <wp:anchor distT="0" distB="0" distL="114300" distR="114300" simplePos="0" relativeHeight="251666432" behindDoc="0" locked="0" layoutInCell="1" allowOverlap="1" wp14:anchorId="703D27DE" wp14:editId="3F4ABC36">
             <wp:simplePos x="0" y="0"/>
             <wp:positionH relativeFrom="margin">
               <wp:align>right</wp:align>
@@ -1053,12 +1036,10 @@
         <w:t xml:space="preserve"> the default is for these to be included (button to right of Var-limits is set to ‘+N’). To exclude </w:t>
       </w:r>
       <w:proofErr w:type="spellStart"/>
-      <w:proofErr w:type="gramStart"/>
       <w:r>
         <w:t>NaNs</w:t>
       </w:r>
       <w:proofErr w:type="spellEnd"/>
-      <w:proofErr w:type="gramEnd"/>
       <w:r>
         <w:t xml:space="preserve"> press the button so that it displays ‘-N’. </w:t>
       </w:r>
@@ -1253,6 +1234,1245 @@
           <w:szCs w:val="20"/>
         </w:rPr>
       </w:pPr>
+    </w:p>
+    <w:p>
+      <w:pPr>
+        <w:rPr>
+          <w:i/>
+          <w:iCs/>
+          <w:noProof/>
+        </w:rPr>
+      </w:pPr>
+      <w:r>
+        <w:rPr>
+          <w:i/>
+          <w:iCs/>
+          <w:noProof/>
+        </w:rPr>
+        <w:t>Using function calls</w:t>
+      </w:r>
+    </w:p>
+    <w:p>
+      <w:pPr>
+        <w:rPr>
+          <w:noProof/>
+        </w:rPr>
+      </w:pPr>
+      <w:r>
+        <w:rPr>
+          <w:noProof/>
+        </w:rPr>
+        <w:t>As well as using simple mathematical expressions (such as the example above), Matlab functions can be used. The restrictions are that it must be possible to define the input using t</w:t>
+      </w:r>
+      <w:r>
+        <w:t>he x, y, z or t variables</w:t>
+      </w:r>
+      <w:r>
+        <w:rPr>
+          <w:noProof/>
+        </w:rPr>
+        <w:t>,  and that only the first output is used (along with the row names if not returned by the function but instead specified using %time or %row). For example:</w:t>
+      </w:r>
+    </w:p>
+    <w:p>
+      <w:pPr>
+        <w:rPr>
+          <w:noProof/>
+        </w:rPr>
+      </w:pPr>
+      <w:r>
+        <w:rPr>
+          <w:rFonts w:ascii="Consolas" w:eastAsia="Times New Roman" w:hAnsi="Consolas" w:cs="Times New Roman"/>
+          <w:sz w:val="20"/>
+          <w:szCs w:val="20"/>
+        </w:rPr>
+        <w:t>mean(x,</w:t>
+      </w:r>
+      <w:r>
+        <w:rPr>
+          <w:rFonts w:ascii="Consolas" w:eastAsia="Times New Roman" w:hAnsi="Consolas" w:cs="Times New Roman"/>
+          <w:color w:val="A709F5"/>
+          <w:sz w:val="20"/>
+          <w:szCs w:val="20"/>
+        </w:rPr>
+        <w:t>’all’</w:t>
+      </w:r>
+      <w:r>
+        <w:rPr>
+          <w:rFonts w:ascii="Consolas" w:eastAsia="Times New Roman" w:hAnsi="Consolas" w:cs="Times New Roman"/>
+          <w:sz w:val="20"/>
+          <w:szCs w:val="20"/>
+        </w:rPr>
+        <w:t>,</w:t>
+      </w:r>
+      <w:r>
+        <w:rPr>
+          <w:rFonts w:ascii="Consolas" w:eastAsia="Times New Roman" w:hAnsi="Consolas" w:cs="Times New Roman"/>
+          <w:color w:val="A709F5"/>
+          <w:sz w:val="20"/>
+          <w:szCs w:val="20"/>
+        </w:rPr>
+        <w:t>’</w:t>
+      </w:r>
+      <w:proofErr w:type="spellStart"/>
+      <w:r>
+        <w:rPr>
+          <w:rFonts w:ascii="Consolas" w:eastAsia="Times New Roman" w:hAnsi="Consolas" w:cs="Times New Roman"/>
+          <w:color w:val="A709F5"/>
+          <w:sz w:val="20"/>
+          <w:szCs w:val="20"/>
+        </w:rPr>
+        <w:t>omitnan</w:t>
+      </w:r>
+      <w:proofErr w:type="spellEnd"/>
+      <w:r>
+        <w:rPr>
+          <w:rFonts w:ascii="Consolas" w:eastAsia="Times New Roman" w:hAnsi="Consolas" w:cs="Times New Roman"/>
+          <w:color w:val="A709F5"/>
+          <w:sz w:val="20"/>
+          <w:szCs w:val="20"/>
+        </w:rPr>
+        <w:t>’</w:t>
+      </w:r>
+      <w:r>
+        <w:rPr>
+          <w:rFonts w:ascii="Consolas" w:eastAsia="Times New Roman" w:hAnsi="Consolas" w:cs="Times New Roman"/>
+          <w:sz w:val="20"/>
+          <w:szCs w:val="20"/>
+        </w:rPr>
+        <w:t>)</w:t>
+      </w:r>
+      <w:r>
+        <w:rPr>
+          <w:noProof/>
+        </w:rPr>
+        <w:t xml:space="preserve">    </w:t>
+      </w:r>
+      <w:r>
+        <w:rPr>
+          <w:rFonts w:ascii="Consolas" w:eastAsia="Times New Roman" w:hAnsi="Consolas" w:cs="Times New Roman"/>
+          <w:color w:val="008013"/>
+          <w:sz w:val="20"/>
+          <w:szCs w:val="20"/>
+        </w:rPr>
+        <w:t>%returns a single value</w:t>
+      </w:r>
+    </w:p>
+    <w:p>
+      <w:pPr>
+        <w:rPr>
+          <w:noProof/>
+        </w:rPr>
+      </w:pPr>
+      <w:r>
+        <w:rPr>
+          <w:noProof/>
+        </w:rPr>
+        <w:t xml:space="preserve">In a similar way external functions cane be called. A selection of such functions are made easily accessible using the Function button (see Section </w:t>
+      </w:r>
+      <w:r>
+        <w:rPr>
+          <w:noProof/>
+          <w:highlight w:val="yellow"/>
+        </w:rPr>
+        <w:t>ZZ</w:t>
+      </w:r>
+      <w:r>
+        <w:rPr>
+          <w:noProof/>
+        </w:rPr>
+        <w:t xml:space="preserve"> for further details). This provides a short description of the function and inputs required and, if selected, the call template is written into the Equation window where it can be edited. For example:</w:t>
+      </w:r>
+    </w:p>
+    <w:p>
+      <w:pPr>
+        <w:rPr>
+          <w:rFonts w:ascii="Consolas" w:eastAsia="Times New Roman" w:hAnsi="Consolas" w:cs="Times New Roman"/>
+          <w:sz w:val="20"/>
+          <w:szCs w:val="20"/>
+        </w:rPr>
+      </w:pPr>
+      <w:r>
+        <w:rPr>
+          <w:u w:val="single"/>
+        </w:rPr>
+        <w:t>Template</w:t>
+      </w:r>
+      <w:r>
+        <w:t>:</w:t>
+      </w:r>
+      <w:r>
+        <w:rPr>
+          <w:rFonts w:ascii="Consolas" w:eastAsia="Times New Roman" w:hAnsi="Consolas" w:cs="Times New Roman"/>
+          <w:sz w:val="20"/>
+          <w:szCs w:val="20"/>
+        </w:rPr>
+        <w:t xml:space="preserve"> </w:t>
+      </w:r>
+      <w:proofErr w:type="spellStart"/>
+      <w:r>
+        <w:rPr>
+          <w:rFonts w:ascii="Consolas" w:eastAsia="Times New Roman" w:hAnsi="Consolas" w:cs="Times New Roman"/>
+          <w:sz w:val="20"/>
+          <w:szCs w:val="20"/>
+        </w:rPr>
+        <w:t>movingtime</w:t>
+      </w:r>
+      <w:proofErr w:type="spellEnd"/>
+      <w:r>
+        <w:rPr>
+          <w:rFonts w:ascii="Consolas" w:eastAsia="Times New Roman" w:hAnsi="Consolas" w:cs="Times New Roman"/>
+          <w:sz w:val="20"/>
+          <w:szCs w:val="20"/>
+        </w:rPr>
+        <w:t>(x, t, ‘</w:t>
+      </w:r>
+      <w:proofErr w:type="spellStart"/>
+      <w:r>
+        <w:rPr>
+          <w:rFonts w:ascii="Consolas" w:eastAsia="Times New Roman" w:hAnsi="Consolas" w:cs="Times New Roman"/>
+          <w:sz w:val="20"/>
+          <w:szCs w:val="20"/>
+        </w:rPr>
+        <w:t>tdur</w:t>
+      </w:r>
+      <w:proofErr w:type="spellEnd"/>
+      <w:r>
+        <w:rPr>
+          <w:rFonts w:ascii="Consolas" w:eastAsia="Times New Roman" w:hAnsi="Consolas" w:cs="Times New Roman"/>
+          <w:sz w:val="20"/>
+          <w:szCs w:val="20"/>
+        </w:rPr>
+        <w:t>’, ‘</w:t>
+      </w:r>
+      <w:proofErr w:type="spellStart"/>
+      <w:r>
+        <w:rPr>
+          <w:rFonts w:ascii="Consolas" w:eastAsia="Times New Roman" w:hAnsi="Consolas" w:cs="Times New Roman"/>
+          <w:sz w:val="20"/>
+          <w:szCs w:val="20"/>
+        </w:rPr>
+        <w:t>tstep</w:t>
+      </w:r>
+      <w:proofErr w:type="spellEnd"/>
+      <w:r>
+        <w:rPr>
+          <w:rFonts w:ascii="Consolas" w:eastAsia="Times New Roman" w:hAnsi="Consolas" w:cs="Times New Roman"/>
+          <w:sz w:val="20"/>
+          <w:szCs w:val="20"/>
+        </w:rPr>
+        <w:t>’, ‘</w:t>
+      </w:r>
+      <w:proofErr w:type="spellStart"/>
+      <w:r>
+        <w:rPr>
+          <w:rFonts w:ascii="Consolas" w:eastAsia="Times New Roman" w:hAnsi="Consolas" w:cs="Times New Roman"/>
+          <w:sz w:val="20"/>
+          <w:szCs w:val="20"/>
+        </w:rPr>
+        <w:t>func</w:t>
+      </w:r>
+      <w:proofErr w:type="spellEnd"/>
+      <w:r>
+        <w:rPr>
+          <w:rFonts w:ascii="Consolas" w:eastAsia="Times New Roman" w:hAnsi="Consolas" w:cs="Times New Roman"/>
+          <w:sz w:val="20"/>
+          <w:szCs w:val="20"/>
+        </w:rPr>
+        <w:t>’)</w:t>
+      </w:r>
+    </w:p>
+    <w:p>
+      <w:pPr>
+        <w:rPr>
+          <w:rFonts w:ascii="Consolas" w:eastAsia="Times New Roman" w:hAnsi="Consolas" w:cs="Times New Roman"/>
+          <w:sz w:val="20"/>
+          <w:szCs w:val="20"/>
+        </w:rPr>
+      </w:pPr>
+      <w:r>
+        <w:rPr>
+          <w:noProof/>
+          <w:u w:val="single"/>
+        </w:rPr>
+        <w:t>Edited for use</w:t>
+      </w:r>
+      <w:r>
+        <w:rPr>
+          <w:noProof/>
+        </w:rPr>
+        <w:t xml:space="preserve">: </w:t>
+      </w:r>
+      <w:proofErr w:type="spellStart"/>
+      <w:r>
+        <w:rPr>
+          <w:rFonts w:ascii="Consolas" w:eastAsia="Times New Roman" w:hAnsi="Consolas" w:cs="Times New Roman"/>
+          <w:sz w:val="20"/>
+          <w:szCs w:val="20"/>
+        </w:rPr>
+        <w:t>movingtime</w:t>
+      </w:r>
+      <w:proofErr w:type="spellEnd"/>
+      <w:r>
+        <w:rPr>
+          <w:rFonts w:ascii="Consolas" w:eastAsia="Times New Roman" w:hAnsi="Consolas" w:cs="Times New Roman"/>
+          <w:sz w:val="20"/>
+          <w:szCs w:val="20"/>
+        </w:rPr>
+        <w:t>(x, t, ‘</w:t>
+      </w:r>
+      <w:r>
+        <w:rPr>
+          <w:rFonts w:ascii="Consolas" w:eastAsia="Times New Roman" w:hAnsi="Consolas" w:cs="Times New Roman"/>
+          <w:sz w:val="20"/>
+          <w:szCs w:val="20"/>
+        </w:rPr>
+        <w:t>0.5 yr</w:t>
+      </w:r>
+      <w:r>
+        <w:rPr>
+          <w:rFonts w:ascii="Consolas" w:eastAsia="Times New Roman" w:hAnsi="Consolas" w:cs="Times New Roman"/>
+          <w:sz w:val="20"/>
+          <w:szCs w:val="20"/>
+        </w:rPr>
+        <w:t>’, ‘</w:t>
+      </w:r>
+      <w:r>
+        <w:rPr>
+          <w:rFonts w:ascii="Consolas" w:eastAsia="Times New Roman" w:hAnsi="Consolas" w:cs="Times New Roman"/>
+          <w:sz w:val="20"/>
+          <w:szCs w:val="20"/>
+        </w:rPr>
+        <w:t>1 yr</w:t>
+      </w:r>
+      <w:r>
+        <w:rPr>
+          <w:rFonts w:ascii="Consolas" w:eastAsia="Times New Roman" w:hAnsi="Consolas" w:cs="Times New Roman"/>
+          <w:sz w:val="20"/>
+          <w:szCs w:val="20"/>
+        </w:rPr>
+        <w:t>’, ‘</w:t>
+      </w:r>
+      <w:r>
+        <w:rPr>
+          <w:rFonts w:ascii="Consolas" w:eastAsia="Times New Roman" w:hAnsi="Consolas" w:cs="Times New Roman"/>
+          <w:sz w:val="20"/>
+          <w:szCs w:val="20"/>
+        </w:rPr>
+        <w:t>std</w:t>
+      </w:r>
+      <w:r>
+        <w:rPr>
+          <w:rFonts w:ascii="Consolas" w:eastAsia="Times New Roman" w:hAnsi="Consolas" w:cs="Times New Roman"/>
+          <w:sz w:val="20"/>
+          <w:szCs w:val="20"/>
+        </w:rPr>
+        <w:t>’)</w:t>
+      </w:r>
+    </w:p>
+    <w:p>
+      <w:r>
+        <w:t>Examples using additional syntax options:</w:t>
+      </w:r>
+    </w:p>
+    <w:p>
+      <w:pPr>
+        <w:pStyle w:val="ListParagraph"/>
+        <w:numPr>
+          <w:ilvl w:val="0"/>
+          <w:numId w:val="6"/>
+        </w:numPr>
+      </w:pPr>
+      <w:r>
+        <w:lastRenderedPageBreak/>
+        <w:t>compute the energy flux bins for the wave height-direction scatter</w:t>
+      </w:r>
+    </w:p>
+    <w:p>
+      <w:pPr>
+        <w:rPr>
+          <w:rFonts w:ascii="Consolas" w:eastAsia="Times New Roman" w:hAnsi="Consolas" w:cs="Times New Roman"/>
+          <w:sz w:val="20"/>
+          <w:szCs w:val="20"/>
+        </w:rPr>
+      </w:pPr>
+      <w:r>
+        <w:rPr>
+          <w:u w:val="single"/>
+        </w:rPr>
+        <w:t>Template</w:t>
+      </w:r>
+      <w:r>
+        <w:t>:</w:t>
+      </w:r>
+      <w:r>
+        <w:rPr>
+          <w:rFonts w:ascii="Consolas" w:eastAsia="Times New Roman" w:hAnsi="Consolas" w:cs="Times New Roman"/>
+          <w:sz w:val="20"/>
+          <w:szCs w:val="20"/>
+        </w:rPr>
+        <w:t xml:space="preserve"> </w:t>
+      </w:r>
+      <w:bookmarkStart w:id="29" w:name="_Hlk227649411"/>
+      <w:proofErr w:type="spellStart"/>
+      <w:r>
+        <w:rPr>
+          <w:rFonts w:ascii="Consolas" w:eastAsia="Times New Roman" w:hAnsi="Consolas" w:cs="Times New Roman"/>
+          <w:sz w:val="20"/>
+          <w:szCs w:val="20"/>
+        </w:rPr>
+        <w:t>binned_wave_climate</w:t>
+      </w:r>
+      <w:proofErr w:type="spellEnd"/>
+      <w:r>
+        <w:rPr>
+          <w:rFonts w:ascii="Consolas" w:eastAsia="Times New Roman" w:hAnsi="Consolas" w:cs="Times New Roman"/>
+          <w:sz w:val="20"/>
+          <w:szCs w:val="20"/>
+        </w:rPr>
+        <w:t>(</w:t>
+      </w:r>
+      <w:proofErr w:type="spellStart"/>
+      <w:r>
+        <w:rPr>
+          <w:rFonts w:ascii="Consolas" w:eastAsia="Times New Roman" w:hAnsi="Consolas" w:cs="Times New Roman"/>
+          <w:sz w:val="20"/>
+          <w:szCs w:val="20"/>
+        </w:rPr>
+        <w:t>x,y,z</w:t>
+      </w:r>
+      <w:proofErr w:type="spellEnd"/>
+      <w:r>
+        <w:rPr>
+          <w:rFonts w:ascii="Consolas" w:eastAsia="Times New Roman" w:hAnsi="Consolas" w:cs="Times New Roman"/>
+          <w:sz w:val="20"/>
+          <w:szCs w:val="20"/>
+        </w:rPr>
+        <w:t xml:space="preserve">) </w:t>
+      </w:r>
+      <w:bookmarkEnd w:id="29"/>
+      <w:r>
+        <w:rPr>
+          <w:rFonts w:ascii="Consolas" w:eastAsia="Times New Roman" w:hAnsi="Consolas" w:cs="Times New Roman"/>
+          <w:sz w:val="20"/>
+          <w:szCs w:val="20"/>
+        </w:rPr>
+        <w:t>or (</w:t>
+      </w:r>
+      <w:proofErr w:type="spellStart"/>
+      <w:r>
+        <w:rPr>
+          <w:rFonts w:ascii="Consolas" w:eastAsia="Times New Roman" w:hAnsi="Consolas" w:cs="Times New Roman"/>
+          <w:sz w:val="20"/>
+          <w:szCs w:val="20"/>
+        </w:rPr>
+        <w:t>dst</w:t>
+      </w:r>
+      <w:proofErr w:type="spellEnd"/>
+      <w:r>
+        <w:rPr>
+          <w:rFonts w:ascii="Consolas" w:eastAsia="Times New Roman" w:hAnsi="Consolas" w:cs="Times New Roman"/>
+          <w:sz w:val="20"/>
+          <w:szCs w:val="20"/>
+        </w:rPr>
+        <w:t>)</w:t>
+      </w:r>
+    </w:p>
+    <w:p>
+      <w:r>
+        <w:rPr>
+          <w:noProof/>
+          <w:u w:val="single"/>
+        </w:rPr>
+        <w:t>Edited for use</w:t>
+      </w:r>
+      <w:r>
+        <w:rPr>
+          <w:noProof/>
+        </w:rPr>
+        <w:t xml:space="preserve">: </w:t>
+      </w:r>
+      <w:proofErr w:type="spellStart"/>
+      <w:r>
+        <w:rPr>
+          <w:rFonts w:ascii="Consolas" w:eastAsia="Times New Roman" w:hAnsi="Consolas" w:cs="Times New Roman"/>
+          <w:sz w:val="20"/>
+          <w:szCs w:val="20"/>
+        </w:rPr>
+        <w:t>binned_wave_climate</w:t>
+      </w:r>
+      <w:proofErr w:type="spellEnd"/>
+      <w:r>
+        <w:rPr>
+          <w:rFonts w:ascii="Consolas" w:eastAsia="Times New Roman" w:hAnsi="Consolas" w:cs="Times New Roman"/>
+          <w:sz w:val="20"/>
+          <w:szCs w:val="20"/>
+        </w:rPr>
+        <w:t>(</w:t>
+      </w:r>
+      <w:proofErr w:type="spellStart"/>
+      <w:r>
+        <w:rPr>
+          <w:rFonts w:ascii="Consolas" w:eastAsia="Times New Roman" w:hAnsi="Consolas" w:cs="Times New Roman"/>
+          <w:sz w:val="20"/>
+          <w:szCs w:val="20"/>
+        </w:rPr>
+        <w:t>x,y,z</w:t>
+      </w:r>
+      <w:proofErr w:type="spellEnd"/>
+      <w:r>
+        <w:rPr>
+          <w:rFonts w:ascii="Consolas" w:eastAsia="Times New Roman" w:hAnsi="Consolas" w:cs="Times New Roman"/>
+          <w:sz w:val="20"/>
+          <w:szCs w:val="20"/>
+        </w:rPr>
+        <w:t xml:space="preserve">) </w:t>
+      </w:r>
+      <w:r>
+        <w:t>– with</w:t>
+      </w:r>
+      <w:r>
+        <w:rPr>
+          <w:rFonts w:ascii="Consolas" w:eastAsia="Times New Roman" w:hAnsi="Consolas" w:cs="Times New Roman"/>
+          <w:sz w:val="20"/>
+          <w:szCs w:val="20"/>
+        </w:rPr>
+        <w:t xml:space="preserve"> </w:t>
+      </w:r>
+      <w:r>
+        <w:t>input variables selected on x, y, z buttons</w:t>
+      </w:r>
+    </w:p>
+    <w:p>
+      <w:pPr>
+        <w:pStyle w:val="ListParagraph"/>
+        <w:numPr>
+          <w:ilvl w:val="0"/>
+          <w:numId w:val="6"/>
+        </w:numPr>
+      </w:pPr>
+      <w:r>
+        <w:t>selection of frequency analysis plots for timeseries data</w:t>
+      </w:r>
+    </w:p>
+    <w:p>
+      <w:pPr>
+        <w:rPr>
+          <w:rFonts w:ascii="Consolas" w:eastAsia="Times New Roman" w:hAnsi="Consolas" w:cs="Times New Roman"/>
+          <w:sz w:val="20"/>
+          <w:szCs w:val="20"/>
+        </w:rPr>
+      </w:pPr>
+      <w:r>
+        <w:rPr>
+          <w:u w:val="single"/>
+        </w:rPr>
+        <w:t>Template</w:t>
+      </w:r>
+      <w:r>
+        <w:t>:</w:t>
+      </w:r>
+      <w:r>
+        <w:rPr>
+          <w:rFonts w:ascii="Consolas" w:eastAsia="Times New Roman" w:hAnsi="Consolas" w:cs="Times New Roman"/>
+          <w:sz w:val="20"/>
+          <w:szCs w:val="20"/>
+        </w:rPr>
+        <w:t xml:space="preserve"> </w:t>
+      </w:r>
+      <w:proofErr w:type="spellStart"/>
+      <w:r>
+        <w:rPr>
+          <w:rFonts w:ascii="Consolas" w:eastAsia="Times New Roman" w:hAnsi="Consolas" w:cs="Times New Roman"/>
+          <w:sz w:val="20"/>
+          <w:szCs w:val="20"/>
+        </w:rPr>
+        <w:t>frequencyanalysis</w:t>
+      </w:r>
+      <w:proofErr w:type="spellEnd"/>
+      <w:r>
+        <w:rPr>
+          <w:rFonts w:ascii="Consolas" w:eastAsia="Times New Roman" w:hAnsi="Consolas" w:cs="Times New Roman"/>
+          <w:sz w:val="20"/>
+          <w:szCs w:val="20"/>
+        </w:rPr>
+        <w:t>(x, t, ‘</w:t>
+      </w:r>
+      <w:proofErr w:type="spellStart"/>
+      <w:r>
+        <w:rPr>
+          <w:rFonts w:ascii="Consolas" w:eastAsia="Times New Roman" w:hAnsi="Consolas" w:cs="Times New Roman"/>
+          <w:sz w:val="20"/>
+          <w:szCs w:val="20"/>
+        </w:rPr>
+        <w:t>vartxt</w:t>
+      </w:r>
+      <w:proofErr w:type="spellEnd"/>
+      <w:r>
+        <w:rPr>
+          <w:rFonts w:ascii="Consolas" w:eastAsia="Times New Roman" w:hAnsi="Consolas" w:cs="Times New Roman"/>
+          <w:sz w:val="20"/>
+          <w:szCs w:val="20"/>
+        </w:rPr>
+        <w:t>’)</w:t>
+      </w:r>
+    </w:p>
+    <w:p>
+      <w:r>
+        <w:rPr>
+          <w:noProof/>
+          <w:u w:val="single"/>
+        </w:rPr>
+        <w:t>Edited for use</w:t>
+      </w:r>
+      <w:r>
+        <w:rPr>
+          <w:noProof/>
+        </w:rPr>
+        <w:t xml:space="preserve">: </w:t>
+      </w:r>
+      <w:proofErr w:type="spellStart"/>
+      <w:r>
+        <w:rPr>
+          <w:rFonts w:ascii="Consolas" w:eastAsia="Times New Roman" w:hAnsi="Consolas" w:cs="Times New Roman"/>
+          <w:sz w:val="20"/>
+          <w:szCs w:val="20"/>
+        </w:rPr>
+        <w:t>frequencyanalysis</w:t>
+      </w:r>
+      <w:proofErr w:type="spellEnd"/>
+      <w:r>
+        <w:rPr>
+          <w:rFonts w:ascii="Consolas" w:eastAsia="Times New Roman" w:hAnsi="Consolas" w:cs="Times New Roman"/>
+          <w:sz w:val="20"/>
+          <w:szCs w:val="20"/>
+        </w:rPr>
+        <w:t>(x, t, ‘</w:t>
+      </w:r>
+      <w:proofErr w:type="spellStart"/>
+      <w:r>
+        <w:rPr>
+          <w:rFonts w:ascii="Consolas" w:eastAsia="Times New Roman" w:hAnsi="Consolas" w:cs="Times New Roman"/>
+          <w:sz w:val="20"/>
+          <w:szCs w:val="20"/>
+        </w:rPr>
+        <w:t>casevar</w:t>
+      </w:r>
+      <w:proofErr w:type="spellEnd"/>
+      <w:r>
+        <w:rPr>
+          <w:rFonts w:ascii="Consolas" w:eastAsia="Times New Roman" w:hAnsi="Consolas" w:cs="Times New Roman"/>
+          <w:sz w:val="20"/>
+          <w:szCs w:val="20"/>
+        </w:rPr>
+        <w:t>’)</w:t>
+      </w:r>
+      <w:r>
+        <w:t xml:space="preserve"> – passes </w:t>
+      </w:r>
+      <w:r>
+        <w:t xml:space="preserve">the </w:t>
+      </w:r>
+      <w:r>
+        <w:t>case description</w:t>
+      </w:r>
+    </w:p>
+    <w:p/>
+    <w:p>
+      <w:pPr>
+        <w:rPr>
+          <w:noProof/>
+        </w:rPr>
+      </w:pPr>
+      <w:r>
+        <w:rPr>
+          <w:noProof/>
+        </w:rPr>
+        <w:t xml:space="preserve">An alternative when calling external functions is to pass the selected variables as dstables, thereby also passing all the associated metadata and RowNames for each dataset selected. For this option up to 3 variables </w:t>
+      </w:r>
+      <w:r>
+        <w:rPr>
+          <w:noProof/>
+        </w:rPr>
+        <w:t xml:space="preserve">(plus time if defined for a selected variable) </w:t>
+      </w:r>
+      <w:r>
+        <w:rPr>
+          <w:noProof/>
+        </w:rPr>
+        <w:t>can be selected but they are defined in the call using dst, for example:</w:t>
+      </w:r>
+    </w:p>
+    <w:p>
+      <w:pPr>
+        <w:spacing w:after="0" w:line="240" w:lineRule="auto"/>
+        <w:rPr>
+          <w:rFonts w:ascii="Consolas" w:eastAsia="Times New Roman" w:hAnsi="Consolas" w:cs="Times New Roman"/>
+          <w:sz w:val="20"/>
+          <w:szCs w:val="20"/>
+        </w:rPr>
+      </w:pPr>
+      <w:proofErr w:type="spellStart"/>
+      <w:r>
+        <w:rPr>
+          <w:rFonts w:ascii="Consolas" w:eastAsia="Times New Roman" w:hAnsi="Consolas" w:cs="Times New Roman"/>
+          <w:sz w:val="20"/>
+          <w:szCs w:val="20"/>
+        </w:rPr>
+        <w:t>myfunction</w:t>
+      </w:r>
+      <w:proofErr w:type="spellEnd"/>
+      <w:r>
+        <w:rPr>
+          <w:rFonts w:ascii="Consolas" w:eastAsia="Times New Roman" w:hAnsi="Consolas" w:cs="Times New Roman"/>
+          <w:sz w:val="20"/>
+          <w:szCs w:val="20"/>
+        </w:rPr>
+        <w:t>(</w:t>
+      </w:r>
+      <w:proofErr w:type="spellStart"/>
+      <w:r>
+        <w:rPr>
+          <w:rFonts w:ascii="Consolas" w:eastAsia="Times New Roman" w:hAnsi="Consolas" w:cs="Times New Roman"/>
+          <w:sz w:val="20"/>
+          <w:szCs w:val="20"/>
+        </w:rPr>
+        <w:t>dst</w:t>
+      </w:r>
+      <w:proofErr w:type="spellEnd"/>
+      <w:r>
+        <w:rPr>
+          <w:rFonts w:ascii="Consolas" w:eastAsia="Times New Roman" w:hAnsi="Consolas" w:cs="Times New Roman"/>
+          <w:sz w:val="20"/>
+          <w:szCs w:val="20"/>
+        </w:rPr>
+        <w:t>,</w:t>
+      </w:r>
+      <w:r>
+        <w:rPr>
+          <w:rFonts w:ascii="Consolas" w:eastAsia="Times New Roman" w:hAnsi="Consolas" w:cs="Times New Roman"/>
+          <w:sz w:val="20"/>
+          <w:szCs w:val="20"/>
+        </w:rPr>
+        <w:t xml:space="preserve"> </w:t>
+      </w:r>
+      <w:r>
+        <w:rPr>
+          <w:rFonts w:ascii="Consolas" w:eastAsia="Times New Roman" w:hAnsi="Consolas" w:cs="Times New Roman"/>
+          <w:color w:val="A709F5"/>
+          <w:sz w:val="20"/>
+          <w:szCs w:val="20"/>
+        </w:rPr>
+        <w:t>'</w:t>
+      </w:r>
+      <w:proofErr w:type="spellStart"/>
+      <w:r>
+        <w:rPr>
+          <w:rFonts w:ascii="Consolas" w:eastAsia="Times New Roman" w:hAnsi="Consolas" w:cs="Times New Roman"/>
+          <w:color w:val="A709F5"/>
+          <w:sz w:val="20"/>
+          <w:szCs w:val="20"/>
+        </w:rPr>
+        <w:t>usertext</w:t>
+      </w:r>
+      <w:proofErr w:type="spellEnd"/>
+      <w:r>
+        <w:rPr>
+          <w:rFonts w:ascii="Consolas" w:eastAsia="Times New Roman" w:hAnsi="Consolas" w:cs="Times New Roman"/>
+          <w:color w:val="A709F5"/>
+          <w:sz w:val="20"/>
+          <w:szCs w:val="20"/>
+        </w:rPr>
+        <w:t>'</w:t>
+      </w:r>
+      <w:r>
+        <w:rPr>
+          <w:rFonts w:ascii="Consolas" w:eastAsia="Times New Roman" w:hAnsi="Consolas" w:cs="Times New Roman"/>
+          <w:sz w:val="20"/>
+          <w:szCs w:val="20"/>
+        </w:rPr>
+        <w:t>,</w:t>
+      </w:r>
+      <w:r>
+        <w:rPr>
+          <w:rFonts w:ascii="Consolas" w:eastAsia="Times New Roman" w:hAnsi="Consolas" w:cs="Times New Roman"/>
+          <w:sz w:val="20"/>
+          <w:szCs w:val="20"/>
+        </w:rPr>
+        <w:t xml:space="preserve"> </w:t>
+      </w:r>
+      <w:proofErr w:type="spellStart"/>
+      <w:r>
+        <w:rPr>
+          <w:rFonts w:ascii="Consolas" w:eastAsia="Times New Roman" w:hAnsi="Consolas" w:cs="Times New Roman"/>
+          <w:sz w:val="20"/>
+          <w:szCs w:val="20"/>
+        </w:rPr>
+        <w:t>mobj</w:t>
+      </w:r>
+      <w:proofErr w:type="spellEnd"/>
+      <w:r>
+        <w:rPr>
+          <w:rFonts w:ascii="Consolas" w:eastAsia="Times New Roman" w:hAnsi="Consolas" w:cs="Times New Roman"/>
+          <w:sz w:val="20"/>
+          <w:szCs w:val="20"/>
+        </w:rPr>
+        <w:t>)</w:t>
+      </w:r>
+      <w:r>
+        <w:rPr>
+          <w:rFonts w:ascii="Consolas" w:eastAsia="Times New Roman" w:hAnsi="Consolas" w:cs="Times New Roman"/>
+          <w:sz w:val="20"/>
+          <w:szCs w:val="20"/>
+        </w:rPr>
+        <w:t xml:space="preserve">;  </w:t>
+      </w:r>
+      <w:r>
+        <w:rPr>
+          <w:rFonts w:ascii="Consolas" w:eastAsia="Times New Roman" w:hAnsi="Consolas" w:cs="Times New Roman"/>
+          <w:color w:val="008013"/>
+          <w:sz w:val="20"/>
+          <w:szCs w:val="20"/>
+        </w:rPr>
+        <w:t>%which might return [</w:t>
+      </w:r>
+      <w:proofErr w:type="spellStart"/>
+      <w:r>
+        <w:rPr>
+          <w:rFonts w:ascii="Consolas" w:eastAsia="Times New Roman" w:hAnsi="Consolas" w:cs="Times New Roman"/>
+          <w:color w:val="008013"/>
+          <w:sz w:val="20"/>
+          <w:szCs w:val="20"/>
+        </w:rPr>
+        <w:t>time,varout</w:t>
+      </w:r>
+      <w:proofErr w:type="spellEnd"/>
+      <w:r>
+        <w:rPr>
+          <w:rFonts w:ascii="Consolas" w:eastAsia="Times New Roman" w:hAnsi="Consolas" w:cs="Times New Roman"/>
+          <w:color w:val="008013"/>
+          <w:sz w:val="20"/>
+          <w:szCs w:val="20"/>
+        </w:rPr>
+        <w:t>]</w:t>
+      </w:r>
+      <w:r>
+        <w:rPr>
+          <w:rFonts w:ascii="Consolas" w:eastAsia="Times New Roman" w:hAnsi="Consolas" w:cs="Times New Roman"/>
+          <w:color w:val="008013"/>
+          <w:sz w:val="20"/>
+          <w:szCs w:val="20"/>
+        </w:rPr>
+        <w:t xml:space="preserve"> </w:t>
+      </w:r>
+      <w:r>
+        <w:rPr>
+          <w:rFonts w:ascii="Consolas" w:eastAsia="Times New Roman" w:hAnsi="Consolas" w:cs="Times New Roman"/>
+          <w:color w:val="008013"/>
+          <w:sz w:val="20"/>
+          <w:szCs w:val="20"/>
+        </w:rPr>
+        <w:t xml:space="preserve">or </w:t>
+      </w:r>
+      <w:r>
+        <w:rPr>
+          <w:rFonts w:ascii="Consolas" w:eastAsia="Times New Roman" w:hAnsi="Consolas" w:cs="Times New Roman"/>
+          <w:color w:val="008013"/>
+          <w:sz w:val="20"/>
+          <w:szCs w:val="20"/>
+        </w:rPr>
+        <w:t xml:space="preserve">a </w:t>
+      </w:r>
+      <w:proofErr w:type="spellStart"/>
+      <w:r>
+        <w:rPr>
+          <w:rFonts w:ascii="Consolas" w:eastAsia="Times New Roman" w:hAnsi="Consolas" w:cs="Times New Roman"/>
+          <w:color w:val="008013"/>
+          <w:sz w:val="20"/>
+          <w:szCs w:val="20"/>
+        </w:rPr>
+        <w:t>dstable</w:t>
+      </w:r>
+      <w:proofErr w:type="spellEnd"/>
+    </w:p>
+    <w:p>
+      <w:pPr>
+        <w:spacing w:after="0" w:line="240" w:lineRule="auto"/>
+        <w:rPr>
+          <w:rFonts w:ascii="Consolas" w:eastAsia="Times New Roman" w:hAnsi="Consolas" w:cs="Times New Roman"/>
+          <w:sz w:val="20"/>
+          <w:szCs w:val="20"/>
+        </w:rPr>
+      </w:pPr>
+    </w:p>
+    <w:p>
+      <w:pPr>
+        <w:rPr>
+          <w:noProof/>
+        </w:rPr>
+      </w:pPr>
+      <w:r>
+        <w:rPr>
+          <w:noProof/>
+        </w:rPr>
+        <w:t xml:space="preserve">This passes the selected variables as a struct array of dstables to the function. Using this syntax the function can return a dstable, or struct of dstables, or </w:t>
+      </w:r>
+      <w:r>
+        <w:rPr>
+          <w:noProof/>
+        </w:rPr>
+        <w:t>a number of variables</w:t>
+      </w:r>
+      <w:r>
+        <w:rPr>
+          <w:noProof/>
+        </w:rPr>
+        <w:t xml:space="preserve">. </w:t>
+      </w:r>
+      <w:r>
+        <w:rPr>
+          <w:noProof/>
+        </w:rPr>
+        <w:t>When</w:t>
+      </w:r>
+      <w:r>
+        <w:rPr>
+          <w:noProof/>
+        </w:rPr>
+        <w:t xml:space="preserve"> a dstable, or struct of dstables</w:t>
+      </w:r>
+      <w:r>
+        <w:rPr>
+          <w:noProof/>
+        </w:rPr>
+        <w:t xml:space="preserve"> </w:t>
+      </w:r>
+      <w:r>
+        <w:rPr>
+          <w:noProof/>
+        </w:rPr>
+        <w:t>is returned, it is assumed that the dsproperties have been defined in the function called</w:t>
+      </w:r>
+      <w:r>
+        <w:rPr>
+          <w:noProof/>
+        </w:rPr>
+        <w:t xml:space="preserve"> and dstables</w:t>
+      </w:r>
+      <w:r>
+        <w:rPr>
+          <w:noProof/>
+        </w:rPr>
+        <w:t xml:space="preserve"> are saved </w:t>
+      </w:r>
+      <w:r>
+        <w:rPr>
+          <w:noProof/>
+        </w:rPr>
+        <w:t>without the need to define the meta-data manually.</w:t>
+      </w:r>
+    </w:p>
+    <w:p>
+      <w:pPr>
+        <w:rPr>
+          <w:noProof/>
+        </w:rPr>
+      </w:pPr>
+    </w:p>
+    <w:p>
+      <w:pPr>
+        <w:keepNext/>
+        <w:rPr>
+          <w:i/>
+          <w:iCs/>
+          <w:noProof/>
+        </w:rPr>
+      </w:pPr>
+      <w:r>
+        <w:rPr>
+          <w:i/>
+          <w:iCs/>
+          <w:noProof/>
+        </w:rPr>
+        <w:t>Additional syntax that can be used when calling external functions.</w:t>
+      </w:r>
+    </w:p>
+    <w:p>
+      <w:pPr>
+        <w:rPr>
+          <w:noProof/>
+        </w:rPr>
+      </w:pPr>
+      <w:r>
+        <w:rPr>
+          <w:rFonts w:ascii="Consolas" w:eastAsia="Times New Roman" w:hAnsi="Consolas" w:cs="Times New Roman"/>
+          <w:color w:val="008013"/>
+          <w:sz w:val="20"/>
+          <w:szCs w:val="20"/>
+        </w:rPr>
+        <w:t>%time</w:t>
+      </w:r>
+      <w:r>
+        <w:rPr>
+          <w:noProof/>
+        </w:rPr>
+        <w:t xml:space="preserve"> or</w:t>
+      </w:r>
+      <w:r>
+        <w:t xml:space="preserve"> </w:t>
+      </w:r>
+      <w:r>
+        <w:rPr>
+          <w:rFonts w:ascii="Consolas" w:eastAsia="Times New Roman" w:hAnsi="Consolas" w:cs="Times New Roman"/>
+          <w:color w:val="008013"/>
+          <w:sz w:val="20"/>
+          <w:szCs w:val="20"/>
+        </w:rPr>
+        <w:t>%row</w:t>
+      </w:r>
+      <w:r>
+        <w:t xml:space="preserve"> – adds the row names to the output that is used</w:t>
+      </w:r>
+    </w:p>
+    <w:p>
+      <w:pPr>
+        <w:rPr>
+          <w:noProof/>
+        </w:rPr>
+      </w:pPr>
+      <w:r>
+        <w:rPr>
+          <w:rFonts w:ascii="Consolas" w:eastAsia="Times New Roman" w:hAnsi="Consolas" w:cs="Times New Roman"/>
+          <w:color w:val="A709F5"/>
+          <w:sz w:val="20"/>
+          <w:szCs w:val="20"/>
+        </w:rPr>
+        <w:t>'</w:t>
+      </w:r>
+      <w:proofErr w:type="spellStart"/>
+      <w:r>
+        <w:rPr>
+          <w:rFonts w:ascii="Consolas" w:eastAsia="Times New Roman" w:hAnsi="Consolas" w:cs="Times New Roman"/>
+          <w:color w:val="A709F5"/>
+          <w:sz w:val="20"/>
+          <w:szCs w:val="20"/>
+        </w:rPr>
+        <w:t>usertext</w:t>
+      </w:r>
+      <w:proofErr w:type="spellEnd"/>
+      <w:r>
+        <w:rPr>
+          <w:rFonts w:ascii="Consolas" w:eastAsia="Times New Roman" w:hAnsi="Consolas" w:cs="Times New Roman"/>
+          <w:color w:val="A709F5"/>
+          <w:sz w:val="20"/>
+          <w:szCs w:val="20"/>
+        </w:rPr>
+        <w:t>'</w:t>
+      </w:r>
+      <w:r>
+        <w:rPr>
+          <w:rFonts w:ascii="Consolas" w:eastAsia="Times New Roman" w:hAnsi="Consolas" w:cs="Times New Roman"/>
+          <w:color w:val="A709F5"/>
+          <w:sz w:val="20"/>
+          <w:szCs w:val="20"/>
+        </w:rPr>
+        <w:t xml:space="preserve"> </w:t>
+      </w:r>
+      <w:r>
+        <w:rPr>
+          <w:noProof/>
+        </w:rPr>
+        <w:t>– character vectors or strings required in the function call</w:t>
+      </w:r>
+      <w:r>
+        <w:rPr>
+          <w:noProof/>
+        </w:rPr>
+        <w:t>.</w:t>
+      </w:r>
+    </w:p>
+    <w:p>
+      <w:pPr>
+        <w:rPr>
+          <w:noProof/>
+        </w:rPr>
+      </w:pPr>
+      <w:r>
+        <w:rPr>
+          <w:rFonts w:ascii="Consolas" w:eastAsia="Times New Roman" w:hAnsi="Consolas" w:cs="Times New Roman"/>
+          <w:color w:val="A709F5"/>
+          <w:sz w:val="20"/>
+          <w:szCs w:val="20"/>
+        </w:rPr>
+        <w:t>‘</w:t>
+      </w:r>
+      <w:proofErr w:type="spellStart"/>
+      <w:r>
+        <w:rPr>
+          <w:rFonts w:ascii="Consolas" w:eastAsia="Times New Roman" w:hAnsi="Consolas" w:cs="Times New Roman"/>
+          <w:color w:val="A709F5"/>
+          <w:sz w:val="20"/>
+          <w:szCs w:val="20"/>
+        </w:rPr>
+        <w:t>casevar</w:t>
+      </w:r>
+      <w:proofErr w:type="spellEnd"/>
+      <w:r>
+        <w:rPr>
+          <w:rFonts w:ascii="Consolas" w:eastAsia="Times New Roman" w:hAnsi="Consolas" w:cs="Times New Roman"/>
+          <w:color w:val="A709F5"/>
+          <w:sz w:val="20"/>
+          <w:szCs w:val="20"/>
+        </w:rPr>
+        <w:t>’</w:t>
+      </w:r>
+      <w:r>
+        <w:rPr>
+          <w:noProof/>
+        </w:rPr>
+        <w:t xml:space="preserve"> – a special instance of </w:t>
+      </w:r>
+      <w:r>
+        <w:rPr>
+          <w:rFonts w:ascii="Consolas" w:eastAsia="Times New Roman" w:hAnsi="Consolas" w:cs="Times New Roman"/>
+          <w:color w:val="A709F5"/>
+          <w:sz w:val="20"/>
+          <w:szCs w:val="20"/>
+        </w:rPr>
+        <w:t>'</w:t>
+      </w:r>
+      <w:proofErr w:type="spellStart"/>
+      <w:r>
+        <w:rPr>
+          <w:rFonts w:ascii="Consolas" w:eastAsia="Times New Roman" w:hAnsi="Consolas" w:cs="Times New Roman"/>
+          <w:color w:val="A709F5"/>
+          <w:sz w:val="20"/>
+          <w:szCs w:val="20"/>
+        </w:rPr>
+        <w:t>usertext</w:t>
+      </w:r>
+      <w:proofErr w:type="spellEnd"/>
+      <w:r>
+        <w:rPr>
+          <w:rFonts w:ascii="Consolas" w:eastAsia="Times New Roman" w:hAnsi="Consolas" w:cs="Times New Roman"/>
+          <w:color w:val="A709F5"/>
+          <w:sz w:val="20"/>
+          <w:szCs w:val="20"/>
+        </w:rPr>
+        <w:t>'</w:t>
+      </w:r>
+      <w:r>
+        <w:rPr>
+          <w:noProof/>
+        </w:rPr>
+        <w:t xml:space="preserve"> that passess a character string of the metadata for the selected variables to the function. This is typically used when the input to a funtion includes </w:t>
+      </w:r>
+      <w:r>
+        <w:rPr>
+          <w:rFonts w:ascii="Consolas" w:eastAsia="Times New Roman" w:hAnsi="Consolas" w:cs="Times New Roman"/>
+          <w:color w:val="A709F5"/>
+          <w:sz w:val="20"/>
+          <w:szCs w:val="20"/>
+        </w:rPr>
+        <w:t>‘</w:t>
+      </w:r>
+      <w:proofErr w:type="spellStart"/>
+      <w:r>
+        <w:rPr>
+          <w:rFonts w:ascii="Consolas" w:eastAsia="Times New Roman" w:hAnsi="Consolas" w:cs="Times New Roman"/>
+          <w:color w:val="A709F5"/>
+          <w:sz w:val="20"/>
+          <w:szCs w:val="20"/>
+        </w:rPr>
+        <w:t>vartxt</w:t>
+      </w:r>
+      <w:proofErr w:type="spellEnd"/>
+      <w:r>
+        <w:rPr>
+          <w:rFonts w:ascii="Consolas" w:eastAsia="Times New Roman" w:hAnsi="Consolas" w:cs="Times New Roman"/>
+          <w:color w:val="A709F5"/>
+          <w:sz w:val="20"/>
+          <w:szCs w:val="20"/>
+        </w:rPr>
+        <w:t>’</w:t>
+      </w:r>
+      <w:r>
+        <w:rPr>
+          <w:noProof/>
+        </w:rPr>
+        <w:t xml:space="preserve"> to provide some desctriptive text (eg the case and variables selected).</w:t>
+      </w:r>
+    </w:p>
+    <w:p>
+      <w:pPr>
+        <w:rPr>
+          <w:rFonts w:ascii="Consolas" w:eastAsia="Times New Roman" w:hAnsi="Consolas" w:cs="Times New Roman"/>
+          <w:sz w:val="20"/>
+          <w:szCs w:val="20"/>
+        </w:rPr>
+      </w:pPr>
+      <w:proofErr w:type="spellStart"/>
+      <w:r>
+        <w:rPr>
+          <w:rFonts w:ascii="Consolas" w:eastAsia="Times New Roman" w:hAnsi="Consolas" w:cs="Times New Roman"/>
+          <w:sz w:val="20"/>
+          <w:szCs w:val="20"/>
+        </w:rPr>
+        <w:t>m</w:t>
+      </w:r>
+      <w:r>
+        <w:rPr>
+          <w:rFonts w:ascii="Consolas" w:eastAsia="Times New Roman" w:hAnsi="Consolas" w:cs="Times New Roman"/>
+          <w:sz w:val="20"/>
+          <w:szCs w:val="20"/>
+        </w:rPr>
+        <w:t>obj</w:t>
+      </w:r>
+      <w:proofErr w:type="spellEnd"/>
+      <w:r>
+        <w:rPr>
+          <w:rFonts w:ascii="Consolas" w:eastAsia="Times New Roman" w:hAnsi="Consolas" w:cs="Times New Roman"/>
+          <w:sz w:val="20"/>
+          <w:szCs w:val="20"/>
+        </w:rPr>
+        <w:t xml:space="preserve"> </w:t>
+      </w:r>
+      <w:r>
+        <w:rPr>
+          <w:noProof/>
+        </w:rPr>
+        <w:t xml:space="preserve">- </w:t>
+      </w:r>
+      <w:r>
+        <w:rPr>
+          <w:noProof/>
+        </w:rPr>
+        <w:t>handle to the application that allows access to Cases and other classes used by the main UI.</w:t>
+      </w:r>
+    </w:p>
+    <w:p>
+      <w:pPr>
+        <w:rPr>
+          <w:noProof/>
+        </w:rPr>
+      </w:pPr>
+    </w:p>
+    <w:p>
+      <w:pPr>
+        <w:rPr>
+          <w:i/>
+          <w:iCs/>
+          <w:noProof/>
+        </w:rPr>
+      </w:pPr>
+      <w:r>
+        <w:rPr>
+          <w:i/>
+          <w:iCs/>
+          <w:noProof/>
+        </w:rPr>
+        <w:t xml:space="preserve">Results </w:t>
+      </w:r>
     </w:p>
     <w:p>
       <w:pPr>
@@ -1485,458 +2705,16 @@
         <w:rPr>
           <w:noProof/>
         </w:rPr>
-        <w:t>For options 2 and 3</w:t>
-      </w:r>
-      <w:r>
-        <w:rPr>
-          <w:noProof/>
-        </w:rPr>
-        <w:t>,</w:t>
-      </w:r>
-      <w:r>
-        <w:rPr>
-          <w:noProof/>
-        </w:rPr>
-        <w:t xml:space="preserve"> the length of the new variables must be the same length (numbere of rows) as the existing dataset.</w:t>
-      </w:r>
-    </w:p>
-    <w:p>
-      <w:pPr>
-        <w:contextualSpacing/>
-        <w:rPr>
-          <w:noProof/>
-        </w:rPr>
-      </w:pPr>
-    </w:p>
-    <w:p>
-      <w:pPr>
-        <w:rPr>
-          <w:noProof/>
-        </w:rPr>
-      </w:pPr>
-      <w:r>
-        <w:rPr>
-          <w:noProof/>
-        </w:rPr>
-        <w:t xml:space="preserve">An alternative when calling external functions is to pass the selected variables as dstables, thereby also passing all the associated metadata and RowNames for each dataset selected. For this option up to 3 variables </w:t>
-      </w:r>
-      <w:r>
-        <w:rPr>
-          <w:noProof/>
-        </w:rPr>
-        <w:t xml:space="preserve">(plus time if defined for a selected variable) </w:t>
-      </w:r>
-      <w:r>
-        <w:rPr>
-          <w:noProof/>
-        </w:rPr>
-        <w:t>can be selected but they are defined in the call using dst, for example:</w:t>
-      </w:r>
-    </w:p>
-    <w:p>
-      <w:pPr>
-        <w:spacing w:after="0" w:line="240" w:lineRule="auto"/>
-        <w:rPr>
-          <w:rFonts w:ascii="Consolas" w:eastAsia="Times New Roman" w:hAnsi="Consolas" w:cs="Times New Roman"/>
-          <w:sz w:val="20"/>
-          <w:szCs w:val="20"/>
-        </w:rPr>
-      </w:pPr>
-      <w:r>
-        <w:rPr>
-          <w:rFonts w:ascii="Consolas" w:eastAsia="Times New Roman" w:hAnsi="Consolas" w:cs="Times New Roman"/>
-          <w:sz w:val="20"/>
-          <w:szCs w:val="20"/>
-        </w:rPr>
-        <w:t>[</w:t>
-      </w:r>
-      <w:proofErr w:type="spellStart"/>
-      <w:r>
-        <w:rPr>
-          <w:rFonts w:ascii="Consolas" w:eastAsia="Times New Roman" w:hAnsi="Consolas" w:cs="Times New Roman"/>
-          <w:sz w:val="20"/>
-          <w:szCs w:val="20"/>
-        </w:rPr>
-        <w:t>time,</w:t>
-      </w:r>
-      <w:r>
-        <w:rPr>
-          <w:rFonts w:ascii="Consolas" w:eastAsia="Times New Roman" w:hAnsi="Consolas" w:cs="Times New Roman"/>
-          <w:sz w:val="20"/>
-          <w:szCs w:val="20"/>
-        </w:rPr>
-        <w:t>varout</w:t>
-      </w:r>
-      <w:proofErr w:type="spellEnd"/>
-      <w:r>
-        <w:rPr>
-          <w:rFonts w:ascii="Consolas" w:eastAsia="Times New Roman" w:hAnsi="Consolas" w:cs="Times New Roman"/>
-          <w:sz w:val="20"/>
-          <w:szCs w:val="20"/>
-        </w:rPr>
-        <w:t>]</w:t>
-      </w:r>
-      <w:r>
-        <w:rPr>
-          <w:rFonts w:ascii="Consolas" w:eastAsia="Times New Roman" w:hAnsi="Consolas" w:cs="Times New Roman"/>
-          <w:sz w:val="20"/>
-          <w:szCs w:val="20"/>
-        </w:rPr>
-        <w:t xml:space="preserve"> = </w:t>
-      </w:r>
-      <w:proofErr w:type="spellStart"/>
-      <w:r>
-        <w:rPr>
-          <w:rFonts w:ascii="Consolas" w:eastAsia="Times New Roman" w:hAnsi="Consolas" w:cs="Times New Roman"/>
-          <w:sz w:val="20"/>
-          <w:szCs w:val="20"/>
-        </w:rPr>
-        <w:t>myfunction</w:t>
-      </w:r>
-      <w:proofErr w:type="spellEnd"/>
-      <w:r>
-        <w:rPr>
-          <w:rFonts w:ascii="Consolas" w:eastAsia="Times New Roman" w:hAnsi="Consolas" w:cs="Times New Roman"/>
-          <w:sz w:val="20"/>
-          <w:szCs w:val="20"/>
-        </w:rPr>
-        <w:t>(</w:t>
-      </w:r>
-      <w:proofErr w:type="spellStart"/>
-      <w:r>
-        <w:rPr>
-          <w:rFonts w:ascii="Consolas" w:eastAsia="Times New Roman" w:hAnsi="Consolas" w:cs="Times New Roman"/>
-          <w:sz w:val="20"/>
-          <w:szCs w:val="20"/>
-        </w:rPr>
-        <w:t>dst</w:t>
-      </w:r>
-      <w:proofErr w:type="spellEnd"/>
-      <w:r>
-        <w:rPr>
-          <w:rFonts w:ascii="Consolas" w:eastAsia="Times New Roman" w:hAnsi="Consolas" w:cs="Times New Roman"/>
-          <w:sz w:val="20"/>
-          <w:szCs w:val="20"/>
-        </w:rPr>
-        <w:t>,</w:t>
-      </w:r>
-      <w:r>
-        <w:rPr>
-          <w:rFonts w:ascii="Consolas" w:eastAsia="Times New Roman" w:hAnsi="Consolas" w:cs="Times New Roman"/>
-          <w:sz w:val="20"/>
-          <w:szCs w:val="20"/>
-        </w:rPr>
-        <w:t xml:space="preserve"> </w:t>
-      </w:r>
-      <w:r>
-        <w:rPr>
-          <w:rFonts w:ascii="Consolas" w:eastAsia="Times New Roman" w:hAnsi="Consolas" w:cs="Times New Roman"/>
-          <w:color w:val="A709F5"/>
-          <w:sz w:val="20"/>
-          <w:szCs w:val="20"/>
-        </w:rPr>
-        <w:t>'</w:t>
-      </w:r>
-      <w:proofErr w:type="spellStart"/>
-      <w:r>
-        <w:rPr>
-          <w:rFonts w:ascii="Consolas" w:eastAsia="Times New Roman" w:hAnsi="Consolas" w:cs="Times New Roman"/>
-          <w:color w:val="A709F5"/>
-          <w:sz w:val="20"/>
-          <w:szCs w:val="20"/>
-        </w:rPr>
-        <w:t>usertext</w:t>
-      </w:r>
-      <w:proofErr w:type="spellEnd"/>
-      <w:r>
-        <w:rPr>
-          <w:rFonts w:ascii="Consolas" w:eastAsia="Times New Roman" w:hAnsi="Consolas" w:cs="Times New Roman"/>
-          <w:color w:val="A709F5"/>
-          <w:sz w:val="20"/>
-          <w:szCs w:val="20"/>
-        </w:rPr>
-        <w:t>'</w:t>
-      </w:r>
-      <w:r>
-        <w:rPr>
-          <w:rFonts w:ascii="Consolas" w:eastAsia="Times New Roman" w:hAnsi="Consolas" w:cs="Times New Roman"/>
-          <w:sz w:val="20"/>
-          <w:szCs w:val="20"/>
-        </w:rPr>
-        <w:t>,</w:t>
-      </w:r>
-      <w:r>
-        <w:rPr>
-          <w:rFonts w:ascii="Consolas" w:eastAsia="Times New Roman" w:hAnsi="Consolas" w:cs="Times New Roman"/>
-          <w:sz w:val="20"/>
-          <w:szCs w:val="20"/>
-        </w:rPr>
-        <w:t xml:space="preserve"> </w:t>
-      </w:r>
-      <w:proofErr w:type="spellStart"/>
-      <w:r>
-        <w:rPr>
-          <w:rFonts w:ascii="Consolas" w:eastAsia="Times New Roman" w:hAnsi="Consolas" w:cs="Times New Roman"/>
-          <w:sz w:val="20"/>
-          <w:szCs w:val="20"/>
-        </w:rPr>
-        <w:t>mobj</w:t>
-      </w:r>
-      <w:proofErr w:type="spellEnd"/>
-      <w:r>
-        <w:rPr>
-          <w:rFonts w:ascii="Consolas" w:eastAsia="Times New Roman" w:hAnsi="Consolas" w:cs="Times New Roman"/>
-          <w:sz w:val="20"/>
-          <w:szCs w:val="20"/>
-        </w:rPr>
-        <w:t>)</w:t>
-      </w:r>
-      <w:r>
-        <w:rPr>
-          <w:rFonts w:ascii="Consolas" w:eastAsia="Times New Roman" w:hAnsi="Consolas" w:cs="Times New Roman"/>
-          <w:sz w:val="20"/>
-          <w:szCs w:val="20"/>
-        </w:rPr>
-        <w:t>;</w:t>
-      </w:r>
-    </w:p>
-    <w:p>
-      <w:pPr>
-        <w:spacing w:after="0" w:line="240" w:lineRule="auto"/>
-        <w:rPr>
-          <w:rFonts w:ascii="Consolas" w:eastAsia="Times New Roman" w:hAnsi="Consolas" w:cs="Times New Roman"/>
-          <w:sz w:val="20"/>
-          <w:szCs w:val="20"/>
-        </w:rPr>
-      </w:pPr>
-    </w:p>
-    <w:p>
-      <w:pPr>
-        <w:spacing w:after="0" w:line="240" w:lineRule="auto"/>
-        <w:rPr>
-          <w:rFonts w:ascii="Consolas" w:eastAsia="Times New Roman" w:hAnsi="Consolas" w:cs="Times New Roman"/>
-          <w:sz w:val="20"/>
-          <w:szCs w:val="20"/>
-        </w:rPr>
-      </w:pPr>
-      <w:proofErr w:type="spellStart"/>
-      <w:r>
-        <w:rPr>
-          <w:rFonts w:ascii="Consolas" w:eastAsia="Times New Roman" w:hAnsi="Consolas" w:cs="Times New Roman"/>
-          <w:sz w:val="20"/>
-          <w:szCs w:val="20"/>
-        </w:rPr>
-        <w:t>dst</w:t>
-      </w:r>
-      <w:proofErr w:type="spellEnd"/>
-      <w:r>
-        <w:rPr>
-          <w:rFonts w:ascii="Consolas" w:eastAsia="Times New Roman" w:hAnsi="Consolas" w:cs="Times New Roman"/>
-          <w:sz w:val="20"/>
-          <w:szCs w:val="20"/>
-        </w:rPr>
-        <w:t xml:space="preserve"> = </w:t>
-      </w:r>
-      <w:proofErr w:type="spellStart"/>
-      <w:r>
-        <w:rPr>
-          <w:rFonts w:ascii="Consolas" w:eastAsia="Times New Roman" w:hAnsi="Consolas" w:cs="Times New Roman"/>
-          <w:sz w:val="20"/>
-          <w:szCs w:val="20"/>
-        </w:rPr>
-        <w:t>myfunction</w:t>
-      </w:r>
-      <w:proofErr w:type="spellEnd"/>
-      <w:r>
-        <w:rPr>
-          <w:rFonts w:ascii="Consolas" w:eastAsia="Times New Roman" w:hAnsi="Consolas" w:cs="Times New Roman"/>
-          <w:sz w:val="20"/>
-          <w:szCs w:val="20"/>
-        </w:rPr>
-        <w:t>(</w:t>
-      </w:r>
-      <w:proofErr w:type="spellStart"/>
-      <w:r>
-        <w:rPr>
-          <w:rFonts w:ascii="Consolas" w:eastAsia="Times New Roman" w:hAnsi="Consolas" w:cs="Times New Roman"/>
-          <w:sz w:val="20"/>
-          <w:szCs w:val="20"/>
-        </w:rPr>
-        <w:t>dst</w:t>
-      </w:r>
-      <w:proofErr w:type="spellEnd"/>
-      <w:r>
-        <w:rPr>
-          <w:rFonts w:ascii="Consolas" w:eastAsia="Times New Roman" w:hAnsi="Consolas" w:cs="Times New Roman"/>
-          <w:sz w:val="20"/>
-          <w:szCs w:val="20"/>
-        </w:rPr>
-        <w:t>,</w:t>
-      </w:r>
-      <w:r>
-        <w:rPr>
-          <w:rFonts w:ascii="Consolas" w:eastAsia="Times New Roman" w:hAnsi="Consolas" w:cs="Times New Roman"/>
-          <w:sz w:val="20"/>
-          <w:szCs w:val="20"/>
-        </w:rPr>
-        <w:t xml:space="preserve"> </w:t>
-      </w:r>
-      <w:r>
-        <w:rPr>
-          <w:rFonts w:ascii="Consolas" w:eastAsia="Times New Roman" w:hAnsi="Consolas" w:cs="Times New Roman"/>
-          <w:color w:val="A709F5"/>
-          <w:sz w:val="20"/>
-          <w:szCs w:val="20"/>
-        </w:rPr>
-        <w:t>'</w:t>
-      </w:r>
-      <w:proofErr w:type="spellStart"/>
-      <w:r>
-        <w:rPr>
-          <w:rFonts w:ascii="Consolas" w:eastAsia="Times New Roman" w:hAnsi="Consolas" w:cs="Times New Roman"/>
-          <w:color w:val="A709F5"/>
-          <w:sz w:val="20"/>
-          <w:szCs w:val="20"/>
-        </w:rPr>
-        <w:t>usertext</w:t>
-      </w:r>
-      <w:proofErr w:type="spellEnd"/>
-      <w:r>
-        <w:rPr>
-          <w:rFonts w:ascii="Consolas" w:eastAsia="Times New Roman" w:hAnsi="Consolas" w:cs="Times New Roman"/>
-          <w:color w:val="A709F5"/>
-          <w:sz w:val="20"/>
-          <w:szCs w:val="20"/>
-        </w:rPr>
-        <w:t>’</w:t>
-      </w:r>
-      <w:r>
-        <w:rPr>
-          <w:rFonts w:ascii="Consolas" w:eastAsia="Times New Roman" w:hAnsi="Consolas" w:cs="Times New Roman"/>
-          <w:sz w:val="20"/>
-          <w:szCs w:val="20"/>
-        </w:rPr>
-        <w:t>,</w:t>
-      </w:r>
-      <w:r>
-        <w:rPr>
-          <w:rFonts w:ascii="Consolas" w:eastAsia="Times New Roman" w:hAnsi="Consolas" w:cs="Times New Roman"/>
-          <w:sz w:val="20"/>
-          <w:szCs w:val="20"/>
-        </w:rPr>
-        <w:t xml:space="preserve"> </w:t>
-      </w:r>
-      <w:proofErr w:type="spellStart"/>
-      <w:r>
-        <w:rPr>
-          <w:rFonts w:ascii="Consolas" w:eastAsia="Times New Roman" w:hAnsi="Consolas" w:cs="Times New Roman"/>
-          <w:sz w:val="20"/>
-          <w:szCs w:val="20"/>
-        </w:rPr>
-        <w:t>mobj</w:t>
-      </w:r>
-      <w:proofErr w:type="spellEnd"/>
-      <w:r>
-        <w:rPr>
-          <w:rFonts w:ascii="Consolas" w:eastAsia="Times New Roman" w:hAnsi="Consolas" w:cs="Times New Roman"/>
-          <w:sz w:val="20"/>
-          <w:szCs w:val="20"/>
-        </w:rPr>
-        <w:t>)</w:t>
-      </w:r>
-      <w:r>
-        <w:rPr>
-          <w:rFonts w:ascii="Consolas" w:eastAsia="Times New Roman" w:hAnsi="Consolas" w:cs="Times New Roman"/>
-          <w:sz w:val="20"/>
-          <w:szCs w:val="20"/>
-        </w:rPr>
-        <w:t>;</w:t>
-      </w:r>
-    </w:p>
-    <w:p>
-      <w:pPr>
-        <w:spacing w:after="0" w:line="240" w:lineRule="auto"/>
-        <w:rPr>
-          <w:rFonts w:ascii="Consolas" w:eastAsia="Times New Roman" w:hAnsi="Consolas" w:cs="Times New Roman"/>
-          <w:sz w:val="20"/>
-          <w:szCs w:val="20"/>
-        </w:rPr>
-      </w:pPr>
-    </w:p>
-    <w:p>
-      <w:pPr>
-        <w:rPr>
-          <w:noProof/>
-        </w:rPr>
-      </w:pPr>
-      <w:r>
-        <w:rPr>
-          <w:noProof/>
-        </w:rPr>
-        <w:t xml:space="preserve">This passes the selected variables as a struct array of dstables to the function. Using this syntax the function can return a dstable, or struct of dstables, or </w:t>
-      </w:r>
-      <w:r>
-        <w:rPr>
-          <w:noProof/>
-        </w:rPr>
-        <w:t>a number of variables</w:t>
-      </w:r>
-      <w:r>
-        <w:rPr>
-          <w:noProof/>
-        </w:rPr>
-        <w:t xml:space="preserve">. </w:t>
-      </w:r>
-      <w:r>
-        <w:rPr>
-          <w:noProof/>
-        </w:rPr>
-        <w:t>When</w:t>
-      </w:r>
-      <w:r>
-        <w:rPr>
-          <w:noProof/>
-        </w:rPr>
-        <w:t xml:space="preserve"> a dstable, or struct of dstables</w:t>
-      </w:r>
-      <w:r>
-        <w:rPr>
-          <w:noProof/>
-        </w:rPr>
-        <w:t xml:space="preserve"> </w:t>
-      </w:r>
-      <w:r>
-        <w:rPr>
-          <w:noProof/>
-        </w:rPr>
-        <w:t>is returned, it is assumed that the dsproperties have been defined in the function called</w:t>
-      </w:r>
-      <w:r>
-        <w:rPr>
-          <w:noProof/>
-        </w:rPr>
-        <w:t xml:space="preserve"> and dstables</w:t>
-      </w:r>
-      <w:r>
-        <w:rPr>
-          <w:noProof/>
-        </w:rPr>
-        <w:t xml:space="preserve"> are saved </w:t>
-      </w:r>
-      <w:r>
-        <w:rPr>
-          <w:noProof/>
-        </w:rPr>
-        <w:t>without the need to define the meta-data manually.</w:t>
-      </w:r>
-    </w:p>
-    <w:p>
-      <w:pPr>
-        <w:rPr>
-          <w:noProof/>
-        </w:rPr>
-      </w:pPr>
-      <w:bookmarkStart w:id="29" w:name="_Hlk89076579"/>
+        <w:t>For options 2 and 3, the length of the new variables must be the same length (numbere of rows) as the existing dataset.</w:t>
+      </w:r>
+    </w:p>
+    <w:p>
+      <w:pPr>
+        <w:rPr>
+          <w:noProof/>
+        </w:rPr>
+      </w:pPr>
+      <w:bookmarkStart w:id="30" w:name="_Hlk89076579"/>
       <w:r>
         <w:rPr>
           <w:noProof/>
@@ -1965,13 +2743,14 @@
         <w:t>XX</w:t>
       </w:r>
     </w:p>
-    <w:bookmarkEnd w:id="29"/>
+    <w:bookmarkEnd w:id="30"/>
     <w:p/>
     <w:p>
       <w:pPr>
         <w:pStyle w:val="Heading2"/>
       </w:pPr>
       <w:r>
+        <w:lastRenderedPageBreak/>
         <w:t>Analysis</w:t>
       </w:r>
     </w:p>
@@ -2002,14 +2781,14 @@
       <w:pPr>
         <w:pStyle w:val="Heading3"/>
       </w:pPr>
-      <w:bookmarkStart w:id="30" w:name="_Ref76228416"/>
+      <w:bookmarkStart w:id="31" w:name="_Ref76228416"/>
       <w:r>
         <w:t>Plotting</w:t>
       </w:r>
-      <w:bookmarkEnd w:id="30"/>
-    </w:p>
-    <w:p>
-      <w:bookmarkStart w:id="31" w:name="_Hlk503199090"/>
+      <w:bookmarkEnd w:id="31"/>
+    </w:p>
+    <w:p>
+      <w:bookmarkStart w:id="32" w:name="_Hlk503199090"/>
       <w:r>
         <w:rPr>
           <w:i/>
@@ -2027,7 +2806,7 @@
       <w:r>
         <w:t xml:space="preserve">: initialises </w:t>
       </w:r>
-      <w:bookmarkEnd w:id="31"/>
+      <w:bookmarkEnd w:id="32"/>
       <w:r>
         <w:t xml:space="preserve">the Plot </w:t>
       </w:r>
@@ -2035,15 +2814,7 @@
         <w:t>UI</w:t>
       </w:r>
       <w:r>
-        <w:t xml:space="preserve"> to select variables and produce several types of </w:t>
-      </w:r>
-      <w:proofErr w:type="gramStart"/>
-      <w:r>
-        <w:t>plot</w:t>
-      </w:r>
-      <w:proofErr w:type="gramEnd"/>
-      <w:r>
-        <w:t xml:space="preserve">. The user selects the </w:t>
+        <w:t xml:space="preserve"> to select variables and produce several types of plot. The user selects the </w:t>
       </w:r>
       <w:r>
         <w:t>Case, Dataset</w:t>
@@ -2073,15 +2844,7 @@
         <w:t>-</w:t>
       </w:r>
       <w:r>
-        <w:t xml:space="preserve">down lists. There are then buttons to create a </w:t>
-      </w:r>
-      <w:proofErr w:type="gramStart"/>
-      <w:r>
-        <w:t>New</w:t>
-      </w:r>
-      <w:proofErr w:type="gramEnd"/>
-      <w:r>
-        <w:t xml:space="preserve"> figure</w:t>
+        <w:t>down lists. There are then buttons to create a New figure</w:t>
       </w:r>
       <w:r>
         <w:t>,</w:t>
@@ -2128,7 +2891,7 @@
                 <w:noProof/>
               </w:rPr>
             </w:pPr>
-            <w:bookmarkStart w:id="32" w:name="_Hlk42161777"/>
+            <w:bookmarkStart w:id="33" w:name="_Hlk42161777"/>
             <w:r>
               <w:rPr>
                 <w:noProof/>
@@ -2385,7 +3148,7 @@
                 <w:szCs w:val="20"/>
               </w:rPr>
             </w:pPr>
-            <w:bookmarkStart w:id="33" w:name="_Hlk41129620"/>
+            <w:bookmarkStart w:id="34" w:name="_Hlk41129620"/>
             <w:r>
               <w:rPr>
                 <w:sz w:val="20"/>
@@ -2439,7 +3202,7 @@
               </w:rPr>
               <w:t>+ : switches between cartesian and polar plot type</w:t>
             </w:r>
-            <w:bookmarkEnd w:id="33"/>
+            <w:bookmarkEnd w:id="34"/>
           </w:p>
           <w:p>
             <w:pPr>
@@ -2475,7 +3238,6 @@
               <w:rPr>
                 <w:noProof/>
               </w:rPr>
-              <w:lastRenderedPageBreak/>
               <w:drawing>
                 <wp:inline distT="0" distB="0" distL="0" distR="0" wp14:anchorId="691E3EB7" wp14:editId="2B9F0B35">
                   <wp:extent cx="2682641" cy="2147887"/>
@@ -2687,6 +3449,7 @@
           </w:tcPr>
           <w:p>
             <w:r>
+              <w:lastRenderedPageBreak/>
               <w:t xml:space="preserve"> </w:t>
             </w:r>
             <w:r>
@@ -2990,7 +3753,7 @@
           </w:p>
         </w:tc>
       </w:tr>
-      <w:bookmarkEnd w:id="32"/>
+      <w:bookmarkEnd w:id="33"/>
     </w:tbl>
     <w:p>
       <w:pPr>
@@ -3091,7 +3854,6 @@
               <w:rPr>
                 <w:noProof/>
               </w:rPr>
-              <w:lastRenderedPageBreak/>
               <w:drawing>
                 <wp:inline distT="0" distB="0" distL="0" distR="0" wp14:anchorId="22041127" wp14:editId="196C6FAF">
                   <wp:extent cx="2617212" cy="2095500"/>
@@ -3452,6 +4214,7 @@
               <w:rPr>
                 <w:noProof/>
               </w:rPr>
+              <w:lastRenderedPageBreak/>
               <w:drawing>
                 <wp:inline distT="0" distB="0" distL="0" distR="0" wp14:anchorId="096DC205" wp14:editId="6BF02B19">
                   <wp:extent cx="2616835" cy="2095199"/>
@@ -4162,7 +4925,7 @@
       <w:r>
         <w:t xml:space="preserve"> function, where the user can define a workflow, accessing data and functions already provided by the particular App or the muitoolbox. The sample code can be found in the </w:t>
       </w:r>
-      <w:bookmarkStart w:id="34" w:name="_Hlk183337190"/>
+      <w:bookmarkStart w:id="35" w:name="_Hlk183337190"/>
       <w:r>
         <w:t>muitoolbox/</w:t>
       </w:r>
@@ -4174,7 +4937,7 @@
       <w:r>
         <w:t xml:space="preserve"> </w:t>
       </w:r>
-      <w:bookmarkEnd w:id="34"/>
+      <w:bookmarkEnd w:id="35"/>
       <w:r>
         <w:t>folder and illustrates the workflow to</w:t>
       </w:r>
@@ -4187,14 +4950,13 @@
       <w:pPr>
         <w:pStyle w:val="Heading3"/>
       </w:pPr>
-      <w:bookmarkStart w:id="35" w:name="_Ref76228422"/>
-      <w:bookmarkStart w:id="36" w:name="_Hlk41129307"/>
-      <w:bookmarkStart w:id="37" w:name="_Hlk503203212"/>
-      <w:r>
-        <w:lastRenderedPageBreak/>
+      <w:bookmarkStart w:id="36" w:name="_Ref76228422"/>
+      <w:bookmarkStart w:id="37" w:name="_Hlk41129307"/>
+      <w:bookmarkStart w:id="38" w:name="_Hlk503203212"/>
+      <w:r>
         <w:t>Statistics</w:t>
       </w:r>
-      <w:bookmarkEnd w:id="35"/>
+      <w:bookmarkEnd w:id="36"/>
     </w:p>
     <w:p>
       <w:r>
@@ -4214,11 +4976,11 @@
       <w:r>
         <w:t xml:space="preserve">: </w:t>
       </w:r>
-      <w:bookmarkStart w:id="38" w:name="_Hlk15127543"/>
+      <w:bookmarkStart w:id="39" w:name="_Hlk15127543"/>
       <w:r>
         <w:t xml:space="preserve">several statistical analysis options have been included within the Statistical Analysis GUI. </w:t>
       </w:r>
-      <w:bookmarkEnd w:id="38"/>
+      <w:bookmarkEnd w:id="39"/>
       <w:r>
         <w:t xml:space="preserve">The tabs are for </w:t>
       </w:r>
@@ -4301,7 +5063,7 @@
           <w:szCs w:val="24"/>
         </w:rPr>
       </w:pPr>
-      <w:bookmarkStart w:id="39" w:name="_Hlk77155475"/>
+      <w:bookmarkStart w:id="40" w:name="_Hlk77155475"/>
       <w:r>
         <w:rPr>
           <w:rFonts w:asciiTheme="majorHAnsi" w:eastAsiaTheme="majorEastAsia" w:hAnsiTheme="majorHAnsi" w:cstheme="majorBidi"/>
@@ -4347,6 +5109,7 @@
         <w:rPr>
           <w:noProof/>
         </w:rPr>
+        <w:lastRenderedPageBreak/>
         <w:drawing>
           <wp:anchor distT="0" distB="0" distL="114300" distR="114300" simplePos="0" relativeHeight="251679744" behindDoc="0" locked="0" layoutInCell="1" allowOverlap="1" wp14:anchorId="7362DED3" wp14:editId="35703AA3">
             <wp:simplePos x="0" y="0"/>
@@ -4459,7 +5222,7 @@
         <w:ind w:left="360"/>
         <w:contextualSpacing/>
       </w:pPr>
-      <w:bookmarkStart w:id="40" w:name="_Hlk77155372"/>
+      <w:bookmarkStart w:id="41" w:name="_Hlk77155372"/>
       <w:r>
         <w:t xml:space="preserve">The results are tabulated </w:t>
       </w:r>
@@ -4482,7 +5245,7 @@
         <w:t xml:space="preserve"> and can be copied to the clipboard for use in other applications.</w:t>
       </w:r>
     </w:p>
-    <w:bookmarkEnd w:id="40"/>
+    <w:bookmarkEnd w:id="41"/>
     <w:p>
       <w:pPr>
         <w:ind w:left="360"/>
@@ -4502,7 +5265,7 @@
           <w:noProof/>
         </w:rPr>
         <w:drawing>
-          <wp:anchor distT="0" distB="0" distL="114300" distR="114300" simplePos="0" relativeHeight="251673600" behindDoc="0" locked="0" layoutInCell="1" allowOverlap="1" wp14:anchorId="76014E06" wp14:editId="4CEFC9E0">
+          <wp:anchor distT="0" distB="0" distL="114300" distR="114300" simplePos="0" relativeHeight="251673600" behindDoc="0" locked="0" layoutInCell="1" allowOverlap="1" wp14:anchorId="76014E06" wp14:editId="3D82001A">
             <wp:simplePos x="0" y="0"/>
             <wp:positionH relativeFrom="column">
               <wp:posOffset>31750</wp:posOffset>
@@ -4830,17 +5593,16 @@
         <w:rPr>
           <w:b/>
         </w:rPr>
-        <w:lastRenderedPageBreak/>
         <w:t>Descriptive</w:t>
       </w:r>
       <w:r>
         <w:t xml:space="preserve">: </w:t>
       </w:r>
-      <w:bookmarkStart w:id="41" w:name="_Hlk13570235"/>
+      <w:bookmarkStart w:id="42" w:name="_Hlk13570235"/>
       <w:r>
         <w:t>general statistics of a variable (mean, standard deviation, minimum, maximum, sum and linear regression fit parameters). The results are tabulated in a new window and can be copied to the clipboard for use in other applications.</w:t>
       </w:r>
-      <w:bookmarkEnd w:id="41"/>
+      <w:bookmarkEnd w:id="42"/>
     </w:p>
     <w:p>
       <w:pPr>
@@ -4861,6 +5623,7 @@
         <w:rPr>
           <w:noProof/>
         </w:rPr>
+        <w:lastRenderedPageBreak/>
         <w:drawing>
           <wp:anchor distT="0" distB="0" distL="114300" distR="114300" simplePos="0" relativeHeight="251668480" behindDoc="0" locked="0" layoutInCell="1" allowOverlap="1" wp14:anchorId="7539B143" wp14:editId="351FE87A">
             <wp:simplePos x="0" y="0"/>
@@ -5216,11 +5979,11 @@
         <w:t>Extremes</w:t>
       </w:r>
       <w:r>
-        <w:t xml:space="preserve">: The selection process is similar to peaks, where the user defines a threshold, selection method and time between peaks (for method 3). A figure is generated with two plots. The left-hand plot shows the peaks for the defined threshold and the right hand plots shows the mean excess above the threshold (circles), the 95% confidence interval (dotted red lines) </w:t>
+        <w:t xml:space="preserve">: The selection process is similar to peaks, where the user defines a threshold, selection method and time between peaks (for method 3). A figure is generated with two plots. The left-hand plot shows the peaks for the defined threshold and the right hand plots shows the mean excess above the threshold (circles), the 95% confidence interval (dotted red lines) and the number of peaks (vertical bars + right hand axis) as a function of threshold. This plot can be used to help identify a suitable threshold for the peak-over-threshold extremes analysis method. The user can either choose a different definition, or accept the definition. Once </w:t>
       </w:r>
       <w:r>
         <w:lastRenderedPageBreak/>
-        <w:t xml:space="preserve">and the number of peaks (vertical bars + right hand axis) as a function of threshold. This plot can be used to help identify a suitable threshold for the peak-over-threshold extremes analysis method. The user can either choose a different definition, or accept the definition. Once accepted, the user is prompted to select a plot type. Options are: None; Type 1 – a single return period plot; Type 2 – a composite plot showing the probability, quantile, return period and density plots. See Coles </w:t>
+        <w:t xml:space="preserve">accepted, the user is prompted to select a plot type. Options are: None; Type 1 – a single return period plot; Type 2 – a composite plot showing the probability, quantile, return period and density plots. See Coles </w:t>
       </w:r>
       <w:r>
         <w:fldChar w:fldCharType="begin"/>
@@ -5511,7 +6274,7 @@
         </w:rPr>
         <w:t xml:space="preserve">This is experimental code </w:t>
       </w:r>
-      <w:bookmarkStart w:id="42" w:name="_Hlk110430202"/>
+      <w:bookmarkStart w:id="43" w:name="_Hlk110430202"/>
       <w:r>
         <w:rPr>
           <w:bCs/>
@@ -5574,7 +6337,7 @@
         </w:rPr>
         <w:t xml:space="preserve">) </w:t>
       </w:r>
-      <w:bookmarkEnd w:id="42"/>
+      <w:bookmarkEnd w:id="43"/>
       <w:r>
         <w:rPr>
           <w:bCs/>
@@ -6116,7 +6879,7 @@
           <w:szCs w:val="24"/>
         </w:rPr>
       </w:pPr>
-      <w:bookmarkStart w:id="43" w:name="_Hlk76231208"/>
+      <w:bookmarkStart w:id="44" w:name="_Hlk76231208"/>
       <w:r>
         <w:rPr>
           <w:rFonts w:asciiTheme="majorHAnsi" w:eastAsiaTheme="majorEastAsia" w:hAnsiTheme="majorHAnsi" w:cstheme="majorBidi"/>
@@ -6143,7 +6906,7 @@
       <w:r>
         <w:t xml:space="preserve">The Taylor tab allows the user to </w:t>
       </w:r>
-      <w:bookmarkEnd w:id="43"/>
+      <w:bookmarkEnd w:id="44"/>
       <w:r>
         <w:t xml:space="preserve">create a Taylor Plot using </w:t>
       </w:r>
@@ -6192,39 +6955,36 @@
         <w:t xml:space="preserve">they </w:t>
       </w:r>
       <w:r>
-        <w:t xml:space="preserve">are clipped to a time-period that is common to both, or any </w:t>
-      </w:r>
+        <w:t xml:space="preserve">are clipped to a time-period that is common to both, or any user defined interval that lies within this clipped period. The statistics (mean, standard deviation, correlation coefficient and centred root mean square error) are computed, normalized using the reference standard deviation and plotted on a polar Taylor diagram </w:t>
+      </w:r>
+      <w:r>
+        <w:fldChar w:fldCharType="begin"/>
+      </w:r>
+      <w:r>
+        <w:instrText xml:space="preserve"> ADDIN EN.CITE &lt;EndNote&gt;&lt;Cite&gt;&lt;Author&gt;Taylor&lt;/Author&gt;&lt;Year&gt;2001&lt;/Year&gt;&lt;RecNum&gt;3601&lt;/RecNum&gt;&lt;DisplayText&gt;(Taylor, 2001)&lt;/DisplayText&gt;&lt;record&gt;&lt;rec-number&gt;3601&lt;/rec-number&gt;&lt;foreign-keys&gt;&lt;key app="EN" db-id="sv9fdvxxw0ss5geav2oxv0s15saz05p5zzwd" timestamp="1461033909" guid="30dafe1a-f16f-427c-91e8-0e50709faf83"&gt;3601&lt;/key&gt;&lt;/foreign-keys&gt;&lt;ref-type name="Journal Article"&gt;17&lt;/ref-type&gt;&lt;contributors&gt;&lt;authors&gt;&lt;author&gt;Taylor, K E&lt;/author&gt;&lt;/authors&gt;&lt;/contributors&gt;&lt;titles&gt;&lt;title&gt;Summarizing multiple aspects of model performance in a single diagram&lt;/title&gt;&lt;secondary-title&gt;Journal of Geophysical Research - Atmospheres&lt;/secondary-title&gt;&lt;/titles&gt;&lt;periodical&gt;&lt;full-title&gt;Journal of Geophysical Research - Atmospheres&lt;/full-title&gt;&lt;/periodical&gt;&lt;pages&gt;7183-7192&lt;/pages&gt;&lt;volume&gt;106&lt;/volume&gt;&lt;number&gt;D7&lt;/number&gt;&lt;dates&gt;&lt;year&gt;2001&lt;/year&gt;&lt;/dates&gt;&lt;urls&gt;&lt;related-urls&gt;&lt;url&gt;http://onlinelibrary.wiley.com/store/10.1029/2000JD900719/asset/jgrd8197.pdf?v=1&amp;amp;t=in6tydj0&amp;amp;s=b61ad52e38dfc8d402c2bf9ecf1a9696f049034b&lt;/url&gt;&lt;/related-urls&gt;&lt;/urls&gt;&lt;electronic-resource-num&gt;10.1029/2000JD900719&lt;/electronic-resource-num&gt;&lt;/record&gt;&lt;/Cite&gt;&lt;/EndNote&gt;</w:instrText>
+      </w:r>
+      <w:r>
+        <w:fldChar w:fldCharType="separate"/>
+      </w:r>
+      <w:r>
+        <w:rPr>
+          <w:noProof/>
+        </w:rPr>
+        <w:t>(Taylor, 2001)</w:t>
+      </w:r>
+      <w:r>
+        <w:fldChar w:fldCharType="end"/>
+      </w:r>
+      <w:r>
+        <w:t>.</w:t>
+      </w:r>
+      <w:r>
+        <w:t xml:space="preserve"> </w:t>
+      </w:r>
+    </w:p>
+    <w:p>
       <w:r>
         <w:lastRenderedPageBreak/>
-        <w:t xml:space="preserve">user defined interval that lies within this clipped period. The statistics (mean, standard deviation, correlation coefficient and centred root mean square error) are computed, normalized using the reference standard deviation and plotted on a polar Taylor diagram </w:t>
-      </w:r>
-      <w:r>
-        <w:fldChar w:fldCharType="begin"/>
-      </w:r>
-      <w:r>
-        <w:instrText xml:space="preserve"> ADDIN EN.CITE &lt;EndNote&gt;&lt;Cite&gt;&lt;Author&gt;Taylor&lt;/Author&gt;&lt;Year&gt;2001&lt;/Year&gt;&lt;RecNum&gt;3601&lt;/RecNum&gt;&lt;DisplayText&gt;(Taylor, 2001)&lt;/DisplayText&gt;&lt;record&gt;&lt;rec-number&gt;3601&lt;/rec-number&gt;&lt;foreign-keys&gt;&lt;key app="EN" db-id="sv9fdvxxw0ss5geav2oxv0s15saz05p5zzwd" timestamp="1461033909" guid="30dafe1a-f16f-427c-91e8-0e50709faf83"&gt;3601&lt;/key&gt;&lt;/foreign-keys&gt;&lt;ref-type name="Journal Article"&gt;17&lt;/ref-type&gt;&lt;contributors&gt;&lt;authors&gt;&lt;author&gt;Taylor, K E&lt;/author&gt;&lt;/authors&gt;&lt;/contributors&gt;&lt;titles&gt;&lt;title&gt;Summarizing multiple aspects of model performance in a single diagram&lt;/title&gt;&lt;secondary-title&gt;Journal of Geophysical Research - Atmospheres&lt;/secondary-title&gt;&lt;/titles&gt;&lt;periodical&gt;&lt;full-title&gt;Journal of Geophysical Research - Atmospheres&lt;/full-title&gt;&lt;/periodical&gt;&lt;pages&gt;7183-7192&lt;/pages&gt;&lt;volume&gt;106&lt;/volume&gt;&lt;number&gt;D7&lt;/number&gt;&lt;dates&gt;&lt;year&gt;2001&lt;/year&gt;&lt;/dates&gt;&lt;urls&gt;&lt;related-urls&gt;&lt;url&gt;http://onlinelibrary.wiley.com/store/10.1029/2000JD900719/asset/jgrd8197.pdf?v=1&amp;amp;t=in6tydj0&amp;amp;s=b61ad52e38dfc8d402c2bf9ecf1a9696f049034b&lt;/url&gt;&lt;/related-urls&gt;&lt;/urls&gt;&lt;electronic-resource-num&gt;10.1029/2000JD900719&lt;/electronic-resource-num&gt;&lt;/record&gt;&lt;/Cite&gt;&lt;/EndNote&gt;</w:instrText>
-      </w:r>
-      <w:r>
-        <w:fldChar w:fldCharType="separate"/>
-      </w:r>
-      <w:r>
-        <w:rPr>
-          <w:noProof/>
-        </w:rPr>
-        <w:t>(Taylor, 2001)</w:t>
-      </w:r>
-      <w:r>
-        <w:fldChar w:fldCharType="end"/>
-      </w:r>
-      <w:r>
-        <w:t>.</w:t>
-      </w:r>
-      <w:r>
-        <w:t xml:space="preserve"> </w:t>
-      </w:r>
-    </w:p>
-    <w:p>
-      <w:r>
         <w:t>[</w:t>
       </w:r>
       <w:r>
@@ -6398,15 +7158,7 @@
         <w:t>Once New or Add are selected, the user is asked whether they want to plot the skill score</w:t>
       </w:r>
       <w:r>
-        <w:t xml:space="preserve"> (Yes/No). If </w:t>
-      </w:r>
-      <w:proofErr w:type="gramStart"/>
-      <w:r>
-        <w:t>Yes</w:t>
-      </w:r>
-      <w:proofErr w:type="gramEnd"/>
-      <w:r>
-        <w:t>, then the user is prompted to set the skill score parameters.</w:t>
+        <w:t xml:space="preserve"> (Yes/No). If Yes, then the user is prompted to set the skill score parameters.</w:t>
       </w:r>
       <w:r>
         <w:t xml:space="preserve"> </w:t>
@@ -6415,15 +7167,7 @@
         <w:t xml:space="preserve"> </w:t>
       </w:r>
       <w:r>
-        <w:t xml:space="preserve">As further points are added to the plot, this selection remains unchanged (i.e. the skill score is or is not included). To reset the </w:t>
-      </w:r>
-      <w:proofErr w:type="gramStart"/>
-      <w:r>
-        <w:t>option</w:t>
-      </w:r>
-      <w:proofErr w:type="gramEnd"/>
-      <w:r>
-        <w:t xml:space="preserve"> it is necessary to close and reopen the Statistics UI.</w:t>
+        <w:t>As further points are added to the plot, this selection remains unchanged (i.e. the skill score is or is not included). To reset the option it is necessary to close and reopen the Statistics UI.</w:t>
       </w:r>
       <w:r>
         <w:t xml:space="preserve"> </w:t>
@@ -6451,7 +7195,7 @@
           <w:noProof/>
         </w:rPr>
         <w:drawing>
-          <wp:anchor distT="0" distB="0" distL="114300" distR="114300" simplePos="0" relativeHeight="251683840" behindDoc="0" locked="0" layoutInCell="1" allowOverlap="1" wp14:anchorId="31A940D7" wp14:editId="428A4116">
+          <wp:anchor distT="0" distB="0" distL="114300" distR="114300" simplePos="0" relativeHeight="251683840" behindDoc="0" locked="0" layoutInCell="1" allowOverlap="1" wp14:anchorId="31A940D7" wp14:editId="4D2C7499">
             <wp:simplePos x="0" y="0"/>
             <wp:positionH relativeFrom="margin">
               <wp:align>left</wp:align>
@@ -6631,7 +7375,6 @@
               <w:rPr>
                 <w:noProof/>
               </w:rPr>
-              <w:lastRenderedPageBreak/>
               <w:drawing>
                 <wp:inline distT="0" distB="0" distL="0" distR="0" wp14:anchorId="30ADB5D6" wp14:editId="25707715">
                   <wp:extent cx="2719388" cy="2406891"/>
@@ -6686,7 +7429,6 @@
           </w:tcPr>
           <w:p>
             <w:r>
-              <w:lastRenderedPageBreak/>
               <w:t>(b) grid skill score plot</w:t>
             </w:r>
           </w:p>
@@ -6695,7 +7437,6 @@
               <w:rPr>
                 <w:noProof/>
               </w:rPr>
-              <w:lastRenderedPageBreak/>
               <w:drawing>
                 <wp:inline distT="0" distB="0" distL="0" distR="0" wp14:anchorId="0589698A" wp14:editId="7665C55F">
                   <wp:extent cx="2743792" cy="2428875"/>
@@ -7019,15 +7760,7 @@
         <w:t>tab allows the user to</w:t>
       </w:r>
       <w:r>
-        <w:t xml:space="preserve"> compute selected simple statistics of a timeseries variable for the intervals between the times recorded in another timeseries. For </w:t>
-      </w:r>
-      <w:proofErr w:type="gramStart"/>
-      <w:r>
-        <w:t>example</w:t>
-      </w:r>
-      <w:proofErr w:type="gramEnd"/>
-      <w:r>
-        <w:t xml:space="preserve"> the mean wave energy between beach profile surveys.</w:t>
+        <w:t xml:space="preserve"> compute selected simple statistics of a timeseries variable for the intervals between the times recorded in another timeseries. For example the mean wave energy between beach profile surveys.</w:t>
       </w:r>
     </w:p>
     <w:p>
@@ -7165,7 +7898,6 @@
     <w:p/>
     <w:p>
       <w:r>
-        <w:lastRenderedPageBreak/>
         <w:t>Default properties are derived from the source variable and the selected statistic</w:t>
       </w:r>
       <w:r>
@@ -7216,7 +7948,7 @@
         <w:t>Help</w:t>
       </w:r>
     </w:p>
-    <w:bookmarkEnd w:id="36"/>
+    <w:bookmarkEnd w:id="37"/>
     <w:p>
       <w:r>
         <w:t>The help menu provides options to access the App documentation in the MatlabTM Supplemental Software documentation, or the App manual</w:t>
@@ -7229,12 +7961,12 @@
       <w:pPr>
         <w:pStyle w:val="Heading2"/>
       </w:pPr>
-      <w:bookmarkStart w:id="44" w:name="_Toc58851120"/>
-      <w:bookmarkEnd w:id="37"/>
+      <w:bookmarkStart w:id="45" w:name="_Toc58851120"/>
+      <w:bookmarkEnd w:id="38"/>
       <w:r>
         <w:t>Tabs</w:t>
       </w:r>
-      <w:bookmarkEnd w:id="44"/>
+      <w:bookmarkEnd w:id="45"/>
     </w:p>
     <w:p>
       <w:r>
@@ -7308,6 +8040,7 @@
           <w:i/>
           <w:color w:val="565321" w:themeColor="accent2" w:themeShade="80"/>
         </w:rPr>
+        <w:lastRenderedPageBreak/>
         <w:t>Inputs</w:t>
       </w:r>
       <w:r>
@@ -7361,11 +8094,11 @@
       <w:pPr>
         <w:pStyle w:val="Heading2"/>
       </w:pPr>
-      <w:bookmarkStart w:id="45" w:name="_Ref76228532"/>
+      <w:bookmarkStart w:id="46" w:name="_Ref76228532"/>
       <w:r>
         <w:t>UI Data Selection</w:t>
       </w:r>
-      <w:bookmarkEnd w:id="45"/>
+      <w:bookmarkEnd w:id="46"/>
     </w:p>
     <w:p>
       <w:r>
@@ -7468,7 +8201,7 @@
           <w:noProof/>
         </w:rPr>
         <w:drawing>
-          <wp:anchor distT="0" distB="0" distL="114300" distR="114300" simplePos="0" relativeHeight="251676672" behindDoc="0" locked="0" layoutInCell="1" allowOverlap="1" wp14:anchorId="2587ECEA" wp14:editId="779C4EDC">
+          <wp:anchor distT="0" distB="0" distL="114300" distR="114300" simplePos="0" relativeHeight="251676672" behindDoc="0" locked="0" layoutInCell="1" allowOverlap="1" wp14:anchorId="2587ECEA" wp14:editId="0D6DED12">
             <wp:simplePos x="0" y="0"/>
             <wp:positionH relativeFrom="column">
               <wp:posOffset>-52387</wp:posOffset>
@@ -7607,9 +8340,8 @@
           <w:bCs/>
           <w:noProof/>
         </w:rPr>
-        <w:lastRenderedPageBreak/>
         <w:drawing>
-          <wp:anchor distT="0" distB="0" distL="114300" distR="114300" simplePos="0" relativeHeight="251677696" behindDoc="0" locked="0" layoutInCell="1" allowOverlap="1" wp14:anchorId="583032D6" wp14:editId="4BF10010">
+          <wp:anchor distT="0" distB="0" distL="114300" distR="114300" simplePos="0" relativeHeight="251677696" behindDoc="0" locked="0" layoutInCell="1" allowOverlap="1" wp14:anchorId="583032D6" wp14:editId="59903C80">
             <wp:simplePos x="0" y="0"/>
             <wp:positionH relativeFrom="column">
               <wp:posOffset>-71755</wp:posOffset>
@@ -7699,18 +8431,19 @@
     </w:p>
     <w:p/>
     <w:p/>
-    <w:bookmarkEnd w:id="39"/>
+    <w:bookmarkEnd w:id="40"/>
     <w:p/>
     <w:p>
-      <w:bookmarkStart w:id="46" w:name="_Hlk77155695"/>
+      <w:bookmarkStart w:id="47" w:name="_Hlk77155695"/>
       <w:r>
         <w:rPr>
           <w:b/>
           <w:bCs/>
           <w:noProof/>
         </w:rPr>
+        <w:lastRenderedPageBreak/>
         <w:drawing>
-          <wp:anchor distT="0" distB="0" distL="114300" distR="114300" simplePos="0" relativeHeight="251678720" behindDoc="0" locked="0" layoutInCell="1" allowOverlap="1" wp14:anchorId="4BDD91EE" wp14:editId="2D8E6CCF">
+          <wp:anchor distT="0" distB="0" distL="114300" distR="114300" simplePos="0" relativeHeight="251678720" behindDoc="0" locked="0" layoutInCell="1" allowOverlap="1" wp14:anchorId="4BDD91EE" wp14:editId="6B34899D">
             <wp:simplePos x="0" y="0"/>
             <wp:positionH relativeFrom="margin">
               <wp:posOffset>-635</wp:posOffset>
@@ -7904,10 +8637,10 @@
         <w:t xml:space="preserve">Note where a variable is being selected as one property and a dimension as a second property, any sub-selection of range must be consistent in the two selections. This is done to allow variables and dimensions to be used as flexibly as possible. </w:t>
       </w:r>
       <w:bookmarkEnd w:id="1"/>
-      <w:bookmarkEnd w:id="46"/>
-    </w:p>
-    <w:p>
-      <w:bookmarkStart w:id="47" w:name="_Hlk158306680"/>
+      <w:bookmarkEnd w:id="47"/>
+    </w:p>
+    <w:p>
+      <w:bookmarkStart w:id="48" w:name="_Hlk158306680"/>
       <w:r>
         <w:t xml:space="preserve">The UI treats any form of text data (char, string, </w:t>
       </w:r>
@@ -8136,7 +8869,6 @@
     </w:p>
     <w:p>
       <w:r>
-        <w:lastRenderedPageBreak/>
         <w:t>displays the results shown in the left column below with an explanation of each data type in the right hand column.</w:t>
       </w:r>
     </w:p>
@@ -8381,6 +9113,7 @@
                 <w:sz w:val="18"/>
                 <w:szCs w:val="18"/>
               </w:rPr>
+              <w:lastRenderedPageBreak/>
               <w:t xml:space="preserve">        </w:t>
             </w:r>
             <w:r>
@@ -8573,7 +9306,7 @@
           <w:szCs w:val="20"/>
         </w:rPr>
       </w:pPr>
-      <w:bookmarkStart w:id="48" w:name="_Hlk158305656"/>
+      <w:bookmarkStart w:id="49" w:name="_Hlk158305656"/>
       <w:r>
         <w:rPr>
           <w:rFonts w:ascii="Arial" w:eastAsia="Microsoft YaHei" w:hAnsi="Arial" w:cs="Arial"/>
@@ -8591,7 +9324,7 @@
         </w:rPr>
         <w:t>myapp.Cases.</w:t>
       </w:r>
-      <w:bookmarkEnd w:id="48"/>
+      <w:bookmarkEnd w:id="49"/>
       <w:r>
         <w:rPr>
           <w:rFonts w:ascii="Arial" w:eastAsia="Microsoft YaHei" w:hAnsi="Arial" w:cs="Arial"/>
@@ -8753,7 +9486,7 @@
           <w:szCs w:val="20"/>
         </w:rPr>
       </w:pPr>
-      <w:bookmarkStart w:id="49" w:name="_Hlk158306562"/>
+      <w:bookmarkStart w:id="50" w:name="_Hlk158306562"/>
       <w:r>
         <w:rPr>
           <w:rFonts w:ascii="Arial" w:eastAsia="Microsoft YaHei" w:hAnsi="Arial" w:cs="Arial"/>
@@ -8827,7 +9560,7 @@
       </w:r>
       <w:proofErr w:type="spellEnd"/>
     </w:p>
-    <w:bookmarkEnd w:id="49"/>
+    <w:bookmarkEnd w:id="50"/>
     <w:p>
       <w:pPr>
         <w:rPr>
@@ -8846,7 +9579,7 @@
       </w:r>
     </w:p>
     <w:p>
-      <w:bookmarkStart w:id="50" w:name="_Hlk183338851"/>
+      <w:bookmarkStart w:id="51" w:name="_Hlk183338851"/>
       <w:r>
         <w:t xml:space="preserve">where </w:t>
       </w:r>
@@ -8856,15 +9589,7 @@
       </w:r>
       <w:proofErr w:type="spellEnd"/>
       <w:r>
-        <w:t xml:space="preserve"> is the index of the class instance (e.g. if there are multiple </w:t>
-      </w:r>
-      <w:proofErr w:type="gramStart"/>
-      <w:r>
-        <w:t>model</w:t>
-      </w:r>
-      <w:proofErr w:type="gramEnd"/>
-      <w:r>
-        <w:t xml:space="preserve"> runs need to select which one. The Catalogue defines the case record (</w:t>
+        <w:t xml:space="preserve"> is the index of the class instance (e.g. if there are multiple model runs need to select which one. The Catalogue defines the case record (</w:t>
       </w:r>
       <w:proofErr w:type="spellStart"/>
       <w:r>
@@ -9061,7 +9786,7 @@
         <w:t>].</w:t>
       </w:r>
     </w:p>
-    <w:bookmarkEnd w:id="50"/>
+    <w:bookmarkEnd w:id="51"/>
     <w:p>
       <w:pPr>
         <w:rPr>
@@ -9185,7 +9910,7 @@
         <w:t xml:space="preserve"> it may be necessary to explicitly use the copy command to avoid creating a handle to the existing instance and potentially corrupting the existing data.</w:t>
       </w:r>
     </w:p>
-    <w:bookmarkEnd w:id="47"/>
+    <w:bookmarkEnd w:id="48"/>
     <w:p/>
     <w:p/>
     <w:p/>
@@ -9230,6 +9955,7 @@
         <w:spacing w:after="240"/>
       </w:pPr>
       <w:r>
+        <w:lastRenderedPageBreak/>
         <w:t>Antoniades I P, Brandi G, Magafas L and Di Matteo T, 2021, The use of scaling properties to detect relevant changes in financial time series: A new visual warning tool. Physica A: Statistical Mechanics and its Applications, 565, 10.1016/j.physa.2020.125561.</w:t>
       </w:r>
     </w:p>
@@ -9744,95 +10470,9 @@
     </w:lvl>
   </w:abstractNum>
   <w:abstractNum w:abstractNumId="1" w15:restartNumberingAfterBreak="0">
-    <w:nsid w:val="443E52F3"/>
+    <w:nsid w:val="29251993"/>
     <w:multiLevelType w:val="hybridMultilevel"/>
-    <w:tmpl w:val="D5E2EE1E"/>
-    <w:lvl w:ilvl="0" w:tplc="0809000F">
-      <w:start w:val="1"/>
-      <w:numFmt w:val="decimal"/>
-      <w:lvlText w:val="%1."/>
-      <w:lvlJc w:val="left"/>
-      <w:pPr>
-        <w:ind w:left="720" w:hanging="360"/>
-      </w:pPr>
-    </w:lvl>
-    <w:lvl w:ilvl="1" w:tplc="08090019" w:tentative="1">
-      <w:start w:val="1"/>
-      <w:numFmt w:val="lowerLetter"/>
-      <w:lvlText w:val="%2."/>
-      <w:lvlJc w:val="left"/>
-      <w:pPr>
-        <w:ind w:left="1440" w:hanging="360"/>
-      </w:pPr>
-    </w:lvl>
-    <w:lvl w:ilvl="2" w:tplc="0809001B" w:tentative="1">
-      <w:start w:val="1"/>
-      <w:numFmt w:val="lowerRoman"/>
-      <w:lvlText w:val="%3."/>
-      <w:lvlJc w:val="right"/>
-      <w:pPr>
-        <w:ind w:left="2160" w:hanging="180"/>
-      </w:pPr>
-    </w:lvl>
-    <w:lvl w:ilvl="3" w:tplc="0809000F" w:tentative="1">
-      <w:start w:val="1"/>
-      <w:numFmt w:val="decimal"/>
-      <w:lvlText w:val="%4."/>
-      <w:lvlJc w:val="left"/>
-      <w:pPr>
-        <w:ind w:left="2880" w:hanging="360"/>
-      </w:pPr>
-    </w:lvl>
-    <w:lvl w:ilvl="4" w:tplc="08090019" w:tentative="1">
-      <w:start w:val="1"/>
-      <w:numFmt w:val="lowerLetter"/>
-      <w:lvlText w:val="%5."/>
-      <w:lvlJc w:val="left"/>
-      <w:pPr>
-        <w:ind w:left="3600" w:hanging="360"/>
-      </w:pPr>
-    </w:lvl>
-    <w:lvl w:ilvl="5" w:tplc="0809001B" w:tentative="1">
-      <w:start w:val="1"/>
-      <w:numFmt w:val="lowerRoman"/>
-      <w:lvlText w:val="%6."/>
-      <w:lvlJc w:val="right"/>
-      <w:pPr>
-        <w:ind w:left="4320" w:hanging="180"/>
-      </w:pPr>
-    </w:lvl>
-    <w:lvl w:ilvl="6" w:tplc="0809000F" w:tentative="1">
-      <w:start w:val="1"/>
-      <w:numFmt w:val="decimal"/>
-      <w:lvlText w:val="%7."/>
-      <w:lvlJc w:val="left"/>
-      <w:pPr>
-        <w:ind w:left="5040" w:hanging="360"/>
-      </w:pPr>
-    </w:lvl>
-    <w:lvl w:ilvl="7" w:tplc="08090019" w:tentative="1">
-      <w:start w:val="1"/>
-      <w:numFmt w:val="lowerLetter"/>
-      <w:lvlText w:val="%8."/>
-      <w:lvlJc w:val="left"/>
-      <w:pPr>
-        <w:ind w:left="5760" w:hanging="360"/>
-      </w:pPr>
-    </w:lvl>
-    <w:lvl w:ilvl="8" w:tplc="0809001B" w:tentative="1">
-      <w:start w:val="1"/>
-      <w:numFmt w:val="lowerRoman"/>
-      <w:lvlText w:val="%9."/>
-      <w:lvlJc w:val="right"/>
-      <w:pPr>
-        <w:ind w:left="6480" w:hanging="180"/>
-      </w:pPr>
-    </w:lvl>
-  </w:abstractNum>
-  <w:abstractNum w:abstractNumId="2" w15:restartNumberingAfterBreak="0">
-    <w:nsid w:val="495D4BC1"/>
-    <w:multiLevelType w:val="hybridMultilevel"/>
-    <w:tmpl w:val="C0483D10"/>
+    <w:tmpl w:val="FAAEA16E"/>
     <w:lvl w:ilvl="0" w:tplc="08090011">
       <w:start w:val="1"/>
       <w:numFmt w:val="decimal"/>
@@ -9918,10 +10558,96 @@
       </w:pPr>
     </w:lvl>
   </w:abstractNum>
+  <w:abstractNum w:abstractNumId="2" w15:restartNumberingAfterBreak="0">
+    <w:nsid w:val="443E52F3"/>
+    <w:multiLevelType w:val="hybridMultilevel"/>
+    <w:tmpl w:val="D5E2EE1E"/>
+    <w:lvl w:ilvl="0" w:tplc="0809000F">
+      <w:start w:val="1"/>
+      <w:numFmt w:val="decimal"/>
+      <w:lvlText w:val="%1."/>
+      <w:lvlJc w:val="left"/>
+      <w:pPr>
+        <w:ind w:left="720" w:hanging="360"/>
+      </w:pPr>
+    </w:lvl>
+    <w:lvl w:ilvl="1" w:tplc="08090019" w:tentative="1">
+      <w:start w:val="1"/>
+      <w:numFmt w:val="lowerLetter"/>
+      <w:lvlText w:val="%2."/>
+      <w:lvlJc w:val="left"/>
+      <w:pPr>
+        <w:ind w:left="1440" w:hanging="360"/>
+      </w:pPr>
+    </w:lvl>
+    <w:lvl w:ilvl="2" w:tplc="0809001B" w:tentative="1">
+      <w:start w:val="1"/>
+      <w:numFmt w:val="lowerRoman"/>
+      <w:lvlText w:val="%3."/>
+      <w:lvlJc w:val="right"/>
+      <w:pPr>
+        <w:ind w:left="2160" w:hanging="180"/>
+      </w:pPr>
+    </w:lvl>
+    <w:lvl w:ilvl="3" w:tplc="0809000F" w:tentative="1">
+      <w:start w:val="1"/>
+      <w:numFmt w:val="decimal"/>
+      <w:lvlText w:val="%4."/>
+      <w:lvlJc w:val="left"/>
+      <w:pPr>
+        <w:ind w:left="2880" w:hanging="360"/>
+      </w:pPr>
+    </w:lvl>
+    <w:lvl w:ilvl="4" w:tplc="08090019" w:tentative="1">
+      <w:start w:val="1"/>
+      <w:numFmt w:val="lowerLetter"/>
+      <w:lvlText w:val="%5."/>
+      <w:lvlJc w:val="left"/>
+      <w:pPr>
+        <w:ind w:left="3600" w:hanging="360"/>
+      </w:pPr>
+    </w:lvl>
+    <w:lvl w:ilvl="5" w:tplc="0809001B" w:tentative="1">
+      <w:start w:val="1"/>
+      <w:numFmt w:val="lowerRoman"/>
+      <w:lvlText w:val="%6."/>
+      <w:lvlJc w:val="right"/>
+      <w:pPr>
+        <w:ind w:left="4320" w:hanging="180"/>
+      </w:pPr>
+    </w:lvl>
+    <w:lvl w:ilvl="6" w:tplc="0809000F" w:tentative="1">
+      <w:start w:val="1"/>
+      <w:numFmt w:val="decimal"/>
+      <w:lvlText w:val="%7."/>
+      <w:lvlJc w:val="left"/>
+      <w:pPr>
+        <w:ind w:left="5040" w:hanging="360"/>
+      </w:pPr>
+    </w:lvl>
+    <w:lvl w:ilvl="7" w:tplc="08090019" w:tentative="1">
+      <w:start w:val="1"/>
+      <w:numFmt w:val="lowerLetter"/>
+      <w:lvlText w:val="%8."/>
+      <w:lvlJc w:val="left"/>
+      <w:pPr>
+        <w:ind w:left="5760" w:hanging="360"/>
+      </w:pPr>
+    </w:lvl>
+    <w:lvl w:ilvl="8" w:tplc="0809001B" w:tentative="1">
+      <w:start w:val="1"/>
+      <w:numFmt w:val="lowerRoman"/>
+      <w:lvlText w:val="%9."/>
+      <w:lvlJc w:val="right"/>
+      <w:pPr>
+        <w:ind w:left="6480" w:hanging="180"/>
+      </w:pPr>
+    </w:lvl>
+  </w:abstractNum>
   <w:abstractNum w:abstractNumId="3" w15:restartNumberingAfterBreak="0">
-    <w:nsid w:val="4A544735"/>
+    <w:nsid w:val="495D4BC1"/>
     <w:multiLevelType w:val="hybridMultilevel"/>
-    <w:tmpl w:val="ECEE3040"/>
+    <w:tmpl w:val="C0483D10"/>
     <w:lvl w:ilvl="0" w:tplc="08090011">
       <w:start w:val="1"/>
       <w:numFmt w:val="decimal"/>
@@ -10008,16 +10734,16 @@
     </w:lvl>
   </w:abstractNum>
   <w:abstractNum w:abstractNumId="4" w15:restartNumberingAfterBreak="0">
-    <w:nsid w:val="63B856E4"/>
+    <w:nsid w:val="4A544735"/>
     <w:multiLevelType w:val="hybridMultilevel"/>
-    <w:tmpl w:val="7AD0E432"/>
+    <w:tmpl w:val="ECEE3040"/>
     <w:lvl w:ilvl="0" w:tplc="08090011">
       <w:start w:val="1"/>
       <w:numFmt w:val="decimal"/>
       <w:lvlText w:val="%1)"/>
       <w:lvlJc w:val="left"/>
       <w:pPr>
-        <w:ind w:left="360" w:hanging="360"/>
+        <w:ind w:left="720" w:hanging="360"/>
       </w:pPr>
       <w:rPr>
         <w:rFonts w:hint="default"/>
@@ -10029,7 +10755,7 @@
       <w:lvlText w:val="%2."/>
       <w:lvlJc w:val="left"/>
       <w:pPr>
-        <w:ind w:left="1080" w:hanging="360"/>
+        <w:ind w:left="1440" w:hanging="360"/>
       </w:pPr>
     </w:lvl>
     <w:lvl w:ilvl="2" w:tplc="0809001B" w:tentative="1">
@@ -10038,7 +10764,7 @@
       <w:lvlText w:val="%3."/>
       <w:lvlJc w:val="right"/>
       <w:pPr>
-        <w:ind w:left="1800" w:hanging="180"/>
+        <w:ind w:left="2160" w:hanging="180"/>
       </w:pPr>
     </w:lvl>
     <w:lvl w:ilvl="3" w:tplc="0809000F" w:tentative="1">
@@ -10047,7 +10773,7 @@
       <w:lvlText w:val="%4."/>
       <w:lvlJc w:val="left"/>
       <w:pPr>
-        <w:ind w:left="2520" w:hanging="360"/>
+        <w:ind w:left="2880" w:hanging="360"/>
       </w:pPr>
     </w:lvl>
     <w:lvl w:ilvl="4" w:tplc="08090019" w:tentative="1">
@@ -10056,7 +10782,7 @@
       <w:lvlText w:val="%5."/>
       <w:lvlJc w:val="left"/>
       <w:pPr>
-        <w:ind w:left="3240" w:hanging="360"/>
+        <w:ind w:left="3600" w:hanging="360"/>
       </w:pPr>
     </w:lvl>
     <w:lvl w:ilvl="5" w:tplc="0809001B" w:tentative="1">
@@ -10065,7 +10791,7 @@
       <w:lvlText w:val="%6."/>
       <w:lvlJc w:val="right"/>
       <w:pPr>
-        <w:ind w:left="3960" w:hanging="180"/>
+        <w:ind w:left="4320" w:hanging="180"/>
       </w:pPr>
     </w:lvl>
     <w:lvl w:ilvl="6" w:tplc="0809000F" w:tentative="1">
@@ -10074,7 +10800,7 @@
       <w:lvlText w:val="%7."/>
       <w:lvlJc w:val="left"/>
       <w:pPr>
-        <w:ind w:left="4680" w:hanging="360"/>
+        <w:ind w:left="5040" w:hanging="360"/>
       </w:pPr>
     </w:lvl>
     <w:lvl w:ilvl="7" w:tplc="08090019" w:tentative="1">
@@ -10083,7 +10809,7 @@
       <w:lvlText w:val="%8."/>
       <w:lvlJc w:val="left"/>
       <w:pPr>
-        <w:ind w:left="5400" w:hanging="360"/>
+        <w:ind w:left="5760" w:hanging="360"/>
       </w:pPr>
     </w:lvl>
     <w:lvl w:ilvl="8" w:tplc="0809001B" w:tentative="1">
@@ -10092,24 +10818,116 @@
       <w:lvlText w:val="%9."/>
       <w:lvlJc w:val="right"/>
       <w:pPr>
+        <w:ind w:left="6480" w:hanging="180"/>
+      </w:pPr>
+    </w:lvl>
+  </w:abstractNum>
+  <w:abstractNum w:abstractNumId="5" w15:restartNumberingAfterBreak="0">
+    <w:nsid w:val="63B856E4"/>
+    <w:multiLevelType w:val="hybridMultilevel"/>
+    <w:tmpl w:val="7AD0E432"/>
+    <w:lvl w:ilvl="0" w:tplc="08090011">
+      <w:start w:val="1"/>
+      <w:numFmt w:val="decimal"/>
+      <w:lvlText w:val="%1)"/>
+      <w:lvlJc w:val="left"/>
+      <w:pPr>
+        <w:ind w:left="360" w:hanging="360"/>
+      </w:pPr>
+      <w:rPr>
+        <w:rFonts w:hint="default"/>
+      </w:rPr>
+    </w:lvl>
+    <w:lvl w:ilvl="1" w:tplc="08090019" w:tentative="1">
+      <w:start w:val="1"/>
+      <w:numFmt w:val="lowerLetter"/>
+      <w:lvlText w:val="%2."/>
+      <w:lvlJc w:val="left"/>
+      <w:pPr>
+        <w:ind w:left="1080" w:hanging="360"/>
+      </w:pPr>
+    </w:lvl>
+    <w:lvl w:ilvl="2" w:tplc="0809001B" w:tentative="1">
+      <w:start w:val="1"/>
+      <w:numFmt w:val="lowerRoman"/>
+      <w:lvlText w:val="%3."/>
+      <w:lvlJc w:val="right"/>
+      <w:pPr>
+        <w:ind w:left="1800" w:hanging="180"/>
+      </w:pPr>
+    </w:lvl>
+    <w:lvl w:ilvl="3" w:tplc="0809000F" w:tentative="1">
+      <w:start w:val="1"/>
+      <w:numFmt w:val="decimal"/>
+      <w:lvlText w:val="%4."/>
+      <w:lvlJc w:val="left"/>
+      <w:pPr>
+        <w:ind w:left="2520" w:hanging="360"/>
+      </w:pPr>
+    </w:lvl>
+    <w:lvl w:ilvl="4" w:tplc="08090019" w:tentative="1">
+      <w:start w:val="1"/>
+      <w:numFmt w:val="lowerLetter"/>
+      <w:lvlText w:val="%5."/>
+      <w:lvlJc w:val="left"/>
+      <w:pPr>
+        <w:ind w:left="3240" w:hanging="360"/>
+      </w:pPr>
+    </w:lvl>
+    <w:lvl w:ilvl="5" w:tplc="0809001B" w:tentative="1">
+      <w:start w:val="1"/>
+      <w:numFmt w:val="lowerRoman"/>
+      <w:lvlText w:val="%6."/>
+      <w:lvlJc w:val="right"/>
+      <w:pPr>
+        <w:ind w:left="3960" w:hanging="180"/>
+      </w:pPr>
+    </w:lvl>
+    <w:lvl w:ilvl="6" w:tplc="0809000F" w:tentative="1">
+      <w:start w:val="1"/>
+      <w:numFmt w:val="decimal"/>
+      <w:lvlText w:val="%7."/>
+      <w:lvlJc w:val="left"/>
+      <w:pPr>
+        <w:ind w:left="4680" w:hanging="360"/>
+      </w:pPr>
+    </w:lvl>
+    <w:lvl w:ilvl="7" w:tplc="08090019" w:tentative="1">
+      <w:start w:val="1"/>
+      <w:numFmt w:val="lowerLetter"/>
+      <w:lvlText w:val="%8."/>
+      <w:lvlJc w:val="left"/>
+      <w:pPr>
+        <w:ind w:left="5400" w:hanging="360"/>
+      </w:pPr>
+    </w:lvl>
+    <w:lvl w:ilvl="8" w:tplc="0809001B" w:tentative="1">
+      <w:start w:val="1"/>
+      <w:numFmt w:val="lowerRoman"/>
+      <w:lvlText w:val="%9."/>
+      <w:lvlJc w:val="right"/>
+      <w:pPr>
         <w:ind w:left="6120" w:hanging="180"/>
       </w:pPr>
     </w:lvl>
   </w:abstractNum>
   <w:num w:numId="1" w16cid:durableId="598876378">
+    <w:abstractNumId w:val="4"/>
+  </w:num>
+  <w:num w:numId="2" w16cid:durableId="1070348084">
     <w:abstractNumId w:val="3"/>
   </w:num>
-  <w:num w:numId="2" w16cid:durableId="1070348084">
-    <w:abstractNumId w:val="2"/>
-  </w:num>
   <w:num w:numId="3" w16cid:durableId="535318537">
-    <w:abstractNumId w:val="4"/>
+    <w:abstractNumId w:val="5"/>
   </w:num>
   <w:num w:numId="4" w16cid:durableId="1239436614">
-    <w:abstractNumId w:val="1"/>
+    <w:abstractNumId w:val="2"/>
   </w:num>
   <w:num w:numId="5" w16cid:durableId="485513698">
     <w:abstractNumId w:val="0"/>
+  </w:num>
+  <w:num w:numId="6" w16cid:durableId="521943546">
+    <w:abstractNumId w:val="1"/>
   </w:num>
 </w:numbering>
 </file>
@@ -10756,6 +11574,7 @@
   <w:style w:type="character" w:default="1" w:styleId="DefaultParagraphFont">
     <w:name w:val="Default Paragraph Font"/>
     <w:uiPriority w:val="1"/>
+    <w:semiHidden/>
     <w:unhideWhenUsed/>
   </w:style>
   <w:style w:type="table" w:default="1" w:styleId="TableNormal">
@@ -11210,6 +12029,17 @@
       <w:shd w:val="clear" w:color="auto" w:fill="E1DFDD"/>
     </w:rPr>
   </w:style>
+  <w:style w:type="paragraph" w:styleId="ListParagraph">
+    <w:name w:val="List Paragraph"/>
+    <w:basedOn w:val="Normal"/>
+    <w:uiPriority w:val="34"/>
+    <w:qFormat/>
+    <w:rsid w:val="00BE1886"/>
+    <w:pPr>
+      <w:ind w:left="720"/>
+      <w:contextualSpacing/>
+    </w:pPr>
+  </w:style>
 </w:styles>
 </file>
 

</xml_diff>